<commit_message>
Informe v18: acota la atribución al sistema de la reducción de TPP
§5.2, §6.1, §6.2 y §7.1 dejan de hablar de «mejora real» y describen una
reducción observada, estadísticamente significativa y de tamaño de efecto
grande, cuya parte atribuible al sistema no puede separarse de la práctica
del operador con este diseño (Tabla 6.1; secciones 6.2 y 7.1).

Co-Authored-By: Claude Opus 5.5 <noreply@anthropic.com>
</commit_message>
<xml_diff>
--- a/docs/Informe_Tesis_v18.docx
+++ b/docs/Informe_Tesis_v18.docx
@@ -10098,7 +10098,7 @@
         <w:ind w:left="-5" w:right="841"/>
       </w:pPr>
       <w:r>
-        <w:t xml:space="preserve">De las tres variables definidas en la sección 3.5, TPP mostró la mejora más marcada y estadísticamente más sólida. El tiempo promedio de procesamiento de pedidos cayó de 39,30 s (DE = 19,51; mediana = 32,00 s) en la condición pretest a 25,60 s (DE = 10,52; mediana = 21,50 s) en la postest: una reducción del 34,9% sobre las medias, por debajo del umbral del 50% fijado en H1. La mediana de las diferencias pareadas fue de 11,50 s, equivalente al 35,9% de la mediana del pretest; el intervalo de confianza bootstrap al 95% de esa reducción relativa, [25,8%; 44,4%], excluye el umbral del 50%, de modo que el rechazo del umbral de H1 no descansa solo en la cifra puntual. La reducción de las medianas de cada condición, de 32,00 s a 21,50 s, es del 32,8% (IC95% [24,1%; 40,8%]). Diecinueve de los veinte escenarios mostraron mejora en el postest; uno (el escenario 8, en el que un reintento de selección de categoría alargó el postest) favoreció al pretest (Figura 5.2). El escenario 14 del postest (58 s, el valor máximo de esa condición) se abortó por un error al cargar la cantidad y se volvió a simular: el intervalo registrado corresponde solo a la resimulación, lo que favorece al postest, y su efecto se acota en la sección 6.2. La prueba de Shapiro-Wilk sobre las diferencias pareadas rechazó el supuesto de normalidad (W = 0,892; p = 0,029), por lo que, conforme a lo previsto en la sección 3.4, el contraste se realizó con la prueba no paramétrica de Wilcoxon en lugar de la prueba t de Student. El resultado exacto (p = 9,54×10⁻⁶) confirma que la diferencia es estadísticamente significativa. El tamaño del efecto correspondiente (r = 0,60, con N = 40 observaciones totales, Rosenthal, 1991) se ubica igualmente en el rango convencionalmente considerado grande (Cohen, 1988). El intervalo de confianza bootstrap al 95% para la mediana de las diferencias pareadas ([8; 16] segundos), además, no incluye el cero, lo cual refuerza la robustez del hallazgo más allá del valor p, aun cuando la magnitud observada no alcance el umbral del 50% hipotetizado a priori. </w:t>
+        <w:t xml:space="preserve">De las tres variables definidas en la sección 3.5, TPP mostró la diferencia más marcada y estadísticamente más sólida. El tiempo promedio de procesamiento de pedidos cayó de 39,30 s (DE = 19,51; mediana = 32,00 s) en la condición pretest a 25,60 s (DE = 10,52; mediana = 21,50 s) en la postest: una reducción del 34,9% sobre las medias, por debajo del umbral del 50% fijado en H1. La mediana de las diferencias pareadas fue de 11,50 s, equivalente al 35,9% de la mediana del pretest; el intervalo de confianza bootstrap al 95% de esa reducción relativa, [25,8%; 44,4%], excluye el umbral del 50%, de modo que el rechazo del umbral de H1 no descansa solo en la cifra puntual. La reducción de las medianas de cada condición, de 32,00 s a 21,50 s, es del 32,8% (IC95% [24,1%; 40,8%]). Diecinueve de los veinte escenarios mostraron mejora en el postest; uno (el escenario 8, en el que un reintento de selección de categoría alargó el postest) favoreció al pretest (Figura 5.2). El escenario 14 del postest (58 s, el valor máximo de esa condición) se abortó por un error al cargar la cantidad y se volvió a simular: el intervalo registrado corresponde solo a la resimulación, lo que favorece al postest, y su efecto se acota en la sección 6.2. La prueba de Shapiro-Wilk sobre las diferencias pareadas rechazó el supuesto de normalidad (W = 0,892; p = 0,029), por lo que, conforme a lo previsto en la sección 3.4, el contraste se realizó con la prueba no paramétrica de Wilcoxon en lugar de la prueba t de Student. El resultado exacto (p = 9,54×10⁻⁶) confirma que la diferencia es estadísticamente significativa. El tamaño del efecto correspondiente (r = 0,60, con N = 40 observaciones totales, Rosenthal, 1991) se ubica igualmente en el rango convencionalmente considerado grande (Cohen, 1988). El intervalo de confianza bootstrap al 95% para la mediana de las diferencias pareadas ([8; 16] segundos), además, no incluye el cero, lo cual refuerza la robustez del hallazgo más allá del valor p, aun cuando la magnitud observada no alcance el umbral del 50% hipotetizado a priori. </w:t>
       </w:r>
     </w:p>
     <w:p>
@@ -10122,7 +10122,7 @@
         <w:ind w:left="-5" w:right="841"/>
       </w:pPr>
       <w:r>
-        <w:t xml:space="preserve">En síntesis: H1 no se confirma en su umbral literal del 50%, pero la reducción observada en TPP es estadísticamente significativa y de tamaño de efecto grande; TED y NAS no muestran diferencia entre condiciones. El hallazgo central de este trabajo es, entonces, una mejora real y sustantiva en el tiempo de procesamiento de pedidos, sin evidencia, en este diseño, de una mejora acompañante en la tasa de errores o en la exactitud del stock. </w:t>
+        <w:t xml:space="preserve">En síntesis: H1 no se confirma en su umbral literal del 50%, pero la reducción observada en TPP es estadísticamente significativa y de tamaño de efecto grande; TED y NAS no muestran diferencia entre condiciones. El hallazgo central de este trabajo es, entonces, una reducción observada, estadísticamente significativa y de tamaño de efecto grande, en el tiempo de procesamiento de pedidos. Con este diseño no puede estimarse qué parte de esa reducción se debe al sistema y qué parte a la práctica del operador (Tabla 6.1; secciones 6.2 y 7.1). Tampoco hay evidencia, en este diseño, de una mejora acompañante en la tasa de errores o en la exactitud del stock. </w:t>
       </w:r>
     </w:p>
     <w:p>
@@ -10170,7 +10170,7 @@
         <w:ind w:left="-5" w:right="841"/>
       </w:pPr>
       <w:r>
-        <w:t xml:space="preserve">La reducción observada en TPP (34,9% sobre las medias; 35,9% para la mediana de las diferencias pareadas respecto de la mediana del pretest, IC95% [25,8%; 44,4%]) es menor que el orden de magnitud que Davenport y Kirby (2016) atribuyen a la automatización de tareas administrativas estructuradas. Tampoco alcanza el umbral del 50% adoptado en la sección 3.1 para H1, y el intervalo de confianza de esa reducción excluye dicho umbral. No obstante, la mejora es consistente en dirección con el argumento de Moeuf et al. (2020) y de Sufi (2023) sobre el potencial de impacto de las soluciones de bajo costo y fácil integración —incluidas las plataformas low-code/no-code como n8n— en PyMEs. El sistema desarrollado no requirió infraestructura compleja y, aun así, produjo una reducción de tiempo estadísticamente significativa y de tamaño de efecto grande (r = 0,60; Cohen, 1988). Cabe señalar que el diseño adoptado carece de grupo de comparación no equivalente y se ubica, en sentido estricto, en la categoría de diseños preexperimentales (sección 3.4). Por eso, parte de esta reducción podría explicarse por fuentes de variación no controladas, en particular el efecto de práctica derivado de resolver los mismos veinte escenarios en ambas condiciones (secciones 3.9 y 6.2). La incorporación de escenarios de calentamiento (sección 3.4) mitigó parcialmente esta amenaza, sin eliminarla. Un caso concreto ilustra esta cautela: el escenario 8, el único que favoreció al pretest, correspondió a un contratiempo operativo puntual en el postest (un reintento de selección de categoría). Esto indica que el resultado agregado no está artificialmente libre de ruido en ninguna de las dos direcciones. Por ello, la reducción observada se interpreta como una estimación verificable y reproducible, obtenida bajo un instrumento de medición único y consistente entre condiciones (sección 3.5), y no como una cifra construida sobre datos no verificables. Debe leerse, sin embargo, como una estimación obtenida en condiciones controladas y con amenazas que en su mayoría favorecen a la condición automatizada (orden fijo de las corridas, mismos escenarios y práctica entre pasadas, sección 6.2), y por lo tanto como una cota superior probable del efecto en un comercio real. </w:t>
+        <w:t xml:space="preserve">La reducción observada en TPP (34,9% sobre las medias; 35,9% para la mediana de las diferencias pareadas respecto de la mediana del pretest, IC95% [25,8%; 44,4%]) es menor que el orden de magnitud que Davenport y Kirby (2016) atribuyen a la automatización de tareas administrativas estructuradas. Tampoco alcanza el umbral del 50% adoptado en la sección 3.1 para H1, y el intervalo de confianza de esa reducción excluye dicho umbral. No obstante, la reducción observada es consistente en dirección con el argumento de Moeuf et al. (2020) y de Sufi (2023) sobre el potencial de impacto de las soluciones de bajo costo y fácil integración —incluidas las plataformas low-code/no-code como n8n— en PyMEs. El sistema desarrollado no requirió infraestructura compleja y, aun así, con él se observó una reducción de tiempo estadísticamente significativa y de tamaño de efecto grande (r = 0,60; Cohen, 1988). Cabe señalar que el diseño adoptado carece de grupo de comparación no equivalente y se ubica, en sentido estricto, en la categoría de diseños preexperimentales (sección 3.4). Por eso, parte de esta reducción podría explicarse por fuentes de variación no controladas, en particular el efecto de práctica derivado de resolver los mismos veinte escenarios en ambas condiciones (secciones 3.9 y 6.2). La incorporación de escenarios de calentamiento (sección 3.4) mitigó parcialmente esta amenaza, sin eliminarla. Un caso concreto ilustra esta cautela: el escenario 8, el único que favoreció al pretest, correspondió a un contratiempo operativo puntual en el postest (un reintento de selección de categoría). Esto indica que el resultado agregado no está artificialmente libre de ruido en ninguna de las dos direcciones. Por ello, la reducción observada se interpreta como una estimación verificable y reproducible, obtenida bajo un instrumento de medición único y consistente entre condiciones (sección 3.5), y no como una cifra construida sobre datos no verificables. Debe leerse, sin embargo, como una estimación obtenida en condiciones controladas y con amenazas que en su mayoría favorecen a la condición automatizada (orden fijo de las corridas, mismos escenarios y práctica entre pasadas, sección 6.2), y por lo tanto como una cota superior probable del efecto en un comercio real. </w:t>
       </w:r>
     </w:p>
     <w:p>
@@ -10232,7 +10232,7 @@
       </w:r>
       <w:r>
         <w:lastRenderedPageBreak/>
-        <w:t xml:space="preserve">con más de un día de intervalo entre el cierre de una y el inicio de la otra. No hubo contrabalanceo, y el mismo operador (uno de los autores del sistema) intervino en ambas corridas. Para atenuar el efecto de práctica se incorporaron 5 escenarios de calentamiento no cronometrados antes de cada condición (sección 3.4). Esta incorporación reduce, pero no permite aislar cuantitativamente, la magnitud del efecto de práctica residual sobre los 20 escenarios de medición, que siguen siendo idénticos entre condiciones. A diferencia de versiones anteriores de este trabajo, TPP se midió en ambas condiciones con un instrumento único: grabación de pantalla con el reloj del sistema visible, leído al segundo (sección 3.5). Por eso, la asimetría instrumental ya no es una amenaza aplicable. La magnitud del efecto observado (r = 0,60) es compatible con una mejora real más allá del ruido de medición. Sin embargo, dado el diseño preexperimental, no puede descartarse por completo una contribución del efecto de práctica residual a la reducción del 34,9%-35,9% informada en la sección 5.2. </w:t>
+        <w:t xml:space="preserve">con más de un día de intervalo entre el cierre de una y el inicio de la otra. No hubo contrabalanceo, y el mismo operador (uno de los autores del sistema) intervino en ambas corridas. Para atenuar el efecto de práctica se incorporaron 5 escenarios de calentamiento no cronometrados antes de cada condición (sección 3.4). Esta incorporación reduce, pero no permite aislar cuantitativamente, la magnitud del efecto de práctica residual sobre los 20 escenarios de medición, que siguen siendo idénticos entre condiciones. A diferencia de versiones anteriores de este trabajo, TPP se midió en ambas condiciones con un instrumento único: grabación de pantalla con el reloj del sistema visible, leído al segundo (sección 3.5). Por eso, la asimetría instrumental ya no es una amenaza aplicable. La magnitud del efecto observado (r = 0,60) indica una diferencia entre condiciones que excede el ruido de medición, pero no permite, por sí sola, atribuirla al sistema. Sin embargo, dado el diseño preexperimental, no puede descartarse por completo una contribución del efecto de práctica residual a la reducción del 34,9%-35,9% informada en la sección 5.2. </w:t>
       </w:r>
     </w:p>
     <w:p>
@@ -11131,7 +11131,7 @@
         <w:ind w:left="-5" w:right="841"/>
       </w:pPr>
       <w:r>
-        <w:t xml:space="preserve">OE6 (evaluar el desempeño mediante TPP, TED y NAS) se alcanzó: se completó la medición de las tres variables (sección 5.1). TPP mostró una reducción real, estadísticamente significativa y de tamaño de efecto grande, aunque por debajo del umbral hipotetizado; TED y NAS no mostraron diferencia entre condiciones, por las razones discutidas en la sección 6.1. </w:t>
+        <w:t xml:space="preserve">OE6 (evaluar el desempeño mediante TPP, TED y NAS) se alcanzó: se completó la medición de las tres variables (sección 5.1). TPP mostró una reducción observada, estadísticamente significativa y de tamaño de efecto grande, aunque por debajo del umbral hipotetizado y sin que pueda separarse la parte atribuible al sistema de la atribuible a la práctica (sección 6.2); TED y NAS no mostraron diferencia entre condiciones, por las razones discutidas en la sección 6.1. </w:t>
       </w:r>
     </w:p>
     <w:p>

</xml_diff>

<commit_message>
Informe v18: casos de error de §4.5, remuestreos del bootstrap y diagrama de carriles
- §4.5 enumera los casos efectivamente cubiertos por los escenarios de
  extremo a extremo (éxito simple y múltiple, cantidad máxima, stock
  insuficiente) y aclara que los errores que dependen de la API (carrito
  vacío, cantidad fuera de rango, confirmación repetida) se verificaron con
  la suite automatizada, ya que el bot guiado por botones no puede
  producirlos.
- §5.2, la nota de la Tabla 5.1 y el Anexo B declaran que los intervalos de
  la reducción relativa usan bootstrap percentil pareado con 10.000
  remuestreos y semilla fija 42.
- Se elimina de la nota de la Tabla 5.1 una referencia a un diseño de
  muestreo que el informe ya no describe.
- diagrama_bpmn_pedido.{mmd,png} pasa a diagrama_carriles_pedido.{mmd,png},
  acorde al rótulo de la Figura 4.4c; se actualizan §4.4 y el Anexo D.

Co-Authored-By: Claude Opus 5.5 <noreply@anthropic.com>
</commit_message>
<xml_diff>
--- a/docs/Informe_Tesis_v18.docx
+++ b/docs/Informe_Tesis_v18.docx
@@ -8588,7 +8588,7 @@
         <w:jc w:val="center"/>
       </w:pPr>
       <w:r>
-        <w:t xml:space="preserve">Figura 4.4c. Diagrama de proceso por carriles (un carril por actor) del flujo de toma de pedidos por Telegram descripto en esta sección: Cliente, Bot de Telegram (n8n), Backend (API REST) y Operador. Complementa, a nivel de proceso de negocio, el diagrama de secuencia técnico de la Figura 4.4b, e incluye el descuento de stock, que ocurre cuando el operador confirma el pedido y no cuando el bot lo recibe. Fuente: docs/diagramas/diagrama_bpmn_pedido.mmd (repositorio de código, Anexo F). </w:t>
+        <w:t xml:space="preserve">Figura 4.4c. Diagrama de proceso por carriles (un carril por actor) del flujo de toma de pedidos por Telegram descripto en esta sección: Cliente, Bot de Telegram (n8n), Backend (API REST) y Operador. Complementa, a nivel de proceso de negocio, el diagrama de secuencia técnico de la Figura 4.4b, e incluye el descuento de stock, que ocurre cuando el operador confirma el pedido y no cuando el bot lo recibe. Fuente: docs/diagramas/diagrama_carriles_pedido.mmd (repositorio de código, Anexo F). </w:t>
       </w:r>
     </w:p>
     <w:p>
@@ -8643,7 +8643,7 @@
         <w:ind w:left="-5" w:right="841"/>
       </w:pPr>
       <w:r>
-        <w:t xml:space="preserve">Adicionalmente, se ejecutaron manualmente escenarios de extremo a extremo que simulan casos reales de uso: la recepción de un pedido a través de Telegram, su procesamiento automático por n8n, el registro correspondiente en la base de datos y la actualización del stock disponible. Estos escenarios cubrieron tanto casos de éxito como los casos de error más frecuentes identificados durante el relevamiento de requerimientos (producto inexistente, stock insuficiente, formato de mensaje inválido). Estos mismos escenarios constituyen la base para los escenarios de prueba estandarizados del experimento controlado descripto en la sección 3.4 y documentados en el Anexo A. </w:t>
+        <w:t xml:space="preserve">Adicionalmente, se ejecutaron manualmente escenarios de extremo a extremo que simulan casos reales de uso: la recepción de un pedido a través de Telegram, su procesamiento automático por n8n, el registro correspondiente en la base de datos y la actualización del stock disponible. Estos escenarios cubrieron casos de éxito con uno y con varios productos, el límite de cantidad máxima por interacción (10 unidades) y el caso de error alcanzable desde el bot: el stock insuficiente, que deja el pedido registrado como CANCELADO. Como el cliente interactúa solo mediante botones y no escribe texto libre en ningún paso (secciones 2.5 y 4.4), el bot no puede producir pedidos con un producto inexistente ni con una cantidad fuera de rango. Los casos de error que dependen de la API —carrito vacío, cantidad fuera de rango (1 a 10 unidades) y confirmación repetida del mismo pedido— se verificaron invocando directamente los endpoints, mediante la suite de pruebas automatizadas descripta en el párrafo anterior. Estos mismos escenarios constituyen la base para los escenarios de prueba estandarizados del experimento controlado descripto en la sección 3.4 y documentados en el Anexo A. </w:t>
       </w:r>
     </w:p>
     <w:p>
@@ -8651,7 +8651,7 @@
         <w:ind w:left="-5" w:right="841"/>
       </w:pPr>
       <w:r>
-        <w:t xml:space="preserve">Los resultados de las pruebas permitieron identificar y corregir inconsistencias en la validación de datos, optimizar la estructura de algunos endpoints y ajustar los flujos de n8n para mejorar su robustez frente a mensajes malformados. Esta etapa de pruebas iterativas es coherente con el enfoque DSR, que concibe el desarrollo y la evaluación del artefacto como un proceso cíclico orientado a la mejora continua. </w:t>
+        <w:t xml:space="preserve">Los resultados de las pruebas permitieron identificar y corregir inconsistencias en la validación de datos, optimizar la estructura de algunos endpoints y ajustar los flujos de n8n para que la interacción del cliente quede guiada íntegramente por botones, de modo que cualquier mensaje de texto libre redirige al menú de categorías (sección 4.4). Esta etapa de pruebas iterativas es coherente con el enfoque DSR, que concibe el desarrollo y la evaluación del artefacto como un proceso cíclico orientado a la mejora continua. </w:t>
       </w:r>
     </w:p>
     <w:p>
@@ -9940,7 +9940,7 @@
       </w:r>
       <w:r>
         <w:lastRenderedPageBreak/>
-        <w:t xml:space="preserve">a partir de los mismos datos pareados del Anexo A, mediante el estadístico r = |z|/√N asociado a la prueba de Wilcoxon (Rosenthal, 1991) e interpretado según los umbrales convencionales de Cohen (1988). Se informa en valor absoluto porque el signo de z depende de la convención de la diferencia y no cambia la magnitud. El denominador N corresponde a las 40 observaciones totales (pretest + postest), no a los 20 pares evaluados. El valor p informado es el valor exacto de la prueba de Wilcoxon (principal); la aproximación normal (z = −3,79) da un valor p = 0,000149, del mismo orden de magnitud. El intervalo de confianza bootstrap percentil corresponde a la mediana de las diferencias pareadas, no a la diferencia de las medianas de cada condición por separado, que es una cifra distinta (32,00 s vs. 21,50 s = 10,50 s). Se calculó con 10.000 remuestreos y semilla fija (random_state = 42) para garantizar la reproducibilidad. La mediana observada de las diferencias pareadas fue de 11,50 s. Su cociente sobre la mediana del pretest (35,9%) y la reducción de las medianas de cada condición (32,8%) se informan con su intervalo de confianza en la sección 5.2. Para TED se aplicó la prueba exacta de McNemar (p = 1,000), dado que los errores se registraron en escenarios distintos entre condiciones (2 pares discordantes en cada sentido). No corresponde, por eso, un tamaño de efecto convencional para una tabla 2×2 de baja frecuencia. Para NAS no se calculó un contraste formal. La auditoría del postest se obtuvo en una pasada suplementaria del 12/09/2026, sin volcados exportados y sin registro del estado del código respecto de la corrección de concurrencia (sección 6.2). Las auditorías cubrieron la totalidad de los 17 productos del catálogo por condición (no una muestra de 5) y el stock registrado coincidió con el esperado en el 100% de los casos en ambas condiciones, sin variación que contrastar. No se aplicó corrección por comparaciones múltiples entre las tres variables: cada una responde a una pregunta distinta y solo TPP fue objeto de un contraste de hipótesis formal, por lo que dicha corrección no resulta aplicable en este caso. </w:t>
+        <w:t xml:space="preserve">a partir de los mismos datos pareados del Anexo A, mediante el estadístico r = |z|/√N asociado a la prueba de Wilcoxon (Rosenthal, 1991) e interpretado según los umbrales convencionales de Cohen (1988). Se informa en valor absoluto porque el signo de z depende de la convención de la diferencia y no cambia la magnitud. El denominador N corresponde a las 40 observaciones totales (pretest + postest), no a los 20 pares evaluados. El valor p informado es el valor exacto de la prueba de Wilcoxon (principal); la aproximación normal (z = −3,79) da un valor p = 0,000149, del mismo orden de magnitud. El intervalo de confianza bootstrap percentil corresponde a la mediana de las diferencias pareadas, no a la diferencia de las medianas de cada condición por separado, que es una cifra distinta (32,00 s vs. 21,50 s = 10,50 s). Se calculó con 10.000 remuestreos y semilla fija (random_state = 42) para garantizar la reproducibilidad; los intervalos de la reducción relativa informados en la sección 5.2 usan el mismo número de remuestreos y la misma semilla. La mediana observada de las diferencias pareadas fue de 11,50 s. Su cociente sobre la mediana del pretest (35,9%) y la reducción de las medianas de cada condición (32,8%) se informan con su intervalo de confianza en la sección 5.2. Para TED se aplicó la prueba exacta de McNemar (p = 1,000), dado que los errores se registraron en escenarios distintos entre condiciones (2 pares discordantes en cada sentido). No corresponde, por eso, un tamaño de efecto convencional para una tabla 2×2 de baja frecuencia. Para NAS no se calculó un contraste formal. La auditoría del postest se obtuvo en una pasada suplementaria del 12/09/2026, sin volcados exportados y sin registro del estado del código respecto de la corrección de concurrencia (sección 6.2). Las auditorías cubrieron la totalidad de los 17 productos del catálogo por condición y el stock registrado coincidió con el esperado en el 100% de los casos en ambas condiciones, sin variación que contrastar. No se aplicó corrección por comparaciones múltiples entre las tres variables: cada una responde a una pregunta distinta y solo TPP fue objeto de un contraste de hipótesis formal, por lo que dicha corrección no resulta aplicable en este caso. </w:t>
       </w:r>
     </w:p>
     <w:p>
@@ -10098,7 +10098,7 @@
         <w:ind w:left="-5" w:right="841"/>
       </w:pPr>
       <w:r>
-        <w:t xml:space="preserve">De las tres variables definidas en la sección 3.5, TPP mostró la diferencia más marcada y estadísticamente más sólida. El tiempo promedio de procesamiento de pedidos cayó de 39,30 s (DE = 19,51; mediana = 32,00 s) en la condición pretest a 25,60 s (DE = 10,52; mediana = 21,50 s) en la postest: una reducción del 34,9% sobre las medias, por debajo del umbral del 50% fijado en H1. La mediana de las diferencias pareadas fue de 11,50 s, equivalente al 35,9% de la mediana del pretest; el intervalo de confianza bootstrap al 95% de esa reducción relativa, [25,8%; 44,4%], excluye el umbral del 50%, de modo que el rechazo del umbral de H1 no descansa solo en la cifra puntual. La reducción de las medianas de cada condición, de 32,00 s a 21,50 s, es del 32,8% (IC95% [24,1%; 40,8%]). Diecinueve de los veinte escenarios mostraron mejora en el postest; uno (el escenario 8, en el que un reintento de selección de categoría alargó el postest) favoreció al pretest (Figura 5.2). El escenario 14 del postest (58 s, el valor máximo de esa condición) se abortó por un error al cargar la cantidad y se volvió a simular: el intervalo registrado corresponde solo a la resimulación, lo que favorece al postest, y su efecto se acota en la sección 6.2. La prueba de Shapiro-Wilk sobre las diferencias pareadas rechazó el supuesto de normalidad (W = 0,892; p = 0,029), por lo que, conforme a lo previsto en la sección 3.4, el contraste se realizó con la prueba no paramétrica de Wilcoxon en lugar de la prueba t de Student. El resultado exacto (p = 9,54×10⁻⁶) confirma que la diferencia es estadísticamente significativa. El tamaño del efecto correspondiente (r = 0,60, con N = 40 observaciones totales, Rosenthal, 1991) se ubica igualmente en el rango convencionalmente considerado grande (Cohen, 1988). El intervalo de confianza bootstrap al 95% para la mediana de las diferencias pareadas ([8; 16] segundos), además, no incluye el cero, lo cual refuerza la robustez del hallazgo más allá del valor p, aun cuando la magnitud observada no alcance el umbral del 50% hipotetizado a priori. </w:t>
+        <w:t xml:space="preserve">De las tres variables definidas en la sección 3.5, TPP mostró la diferencia más marcada y estadísticamente más sólida. El tiempo promedio de procesamiento de pedidos cayó de 39,30 s (DE = 19,51; mediana = 32,00 s) en la condición pretest a 25,60 s (DE = 10,52; mediana = 21,50 s) en la postest: una reducción del 34,9% sobre las medias, por debajo del umbral del 50% fijado en H1. La mediana de las diferencias pareadas fue de 11,50 s, equivalente al 35,9% de la mediana del pretest; el intervalo de confianza bootstrap percentil pareado al 95% de esa reducción relativa (10.000 remuestreos, semilla fija 42), [25,8%; 44,4%], excluye el umbral del 50%, de modo que el rechazo del umbral de H1 no descansa solo en la cifra puntual. La reducción de las medianas de cada condición, de 32,00 s a 21,50 s, es del 32,8% (IC95% [24,1%; 40,8%], con los mismos remuestreos y la misma semilla). Diecinueve de los veinte escenarios mostraron mejora en el postest; uno (el escenario 8, en el que un reintento de selección de categoría alargó el postest) favoreció al pretest (Figura 5.2). El escenario 14 del postest (58 s, el valor máximo de esa condición) se abortó por un error al cargar la cantidad y se volvió a simular: el intervalo registrado corresponde solo a la resimulación, lo que favorece al postest, y su efecto se acota en la sección 6.2. La prueba de Shapiro-Wilk sobre las diferencias pareadas rechazó el supuesto de normalidad (W = 0,892; p = 0,029), por lo que, conforme a lo previsto en la sección 3.4, el contraste se realizó con la prueba no paramétrica de Wilcoxon en lugar de la prueba t de Student. El resultado exacto (p = 9,54×10⁻⁶) confirma que la diferencia es estadísticamente significativa. El tamaño del efecto correspondiente (r = 0,60, con N = 40 observaciones totales, Rosenthal, 1991) se ubica igualmente en el rango convencionalmente considerado grande (Cohen, 1988). El intervalo de confianza bootstrap al 95% para la mediana de las diferencias pareadas ([8; 16] segundos), además, no incluye el cero, lo cual refuerza la robustez del hallazgo más allá del valor p, aun cuando la magnitud observada no alcance el umbral del 50% hipotetizado a priori. </w:t>
       </w:r>
     </w:p>
     <w:p>
@@ -18028,7 +18028,7 @@
       </w:r>
       <w:r>
         <w:lastRenderedPageBreak/>
-        <w:t>horarios crudos de las hojas Pretest y Postest del Anexo A, con el script docs/analisis/compute_practica_residual.py —que incluye una variante de sensibilidad sin el escenario 8— y su salida real docs/analisis/salida_compute_practica_residual.txt, incluidos también en el repositorio de código (Anexo F). El script compute_stats.py incluye además la estimación por intervalo de la reducción relativa (sección 5.2) y el análisis de sensibilidad del escenario 14 (sección 6.2), y el cruce del registro de n8n contra las ventanas del postest se realizó con docs/analisis/cruzar_log_n8n.py (Anexo A).  La comparación con la pasada descartada del 11/09 (Tabla 6.1) se calculó con docs/analisis/compute_intento_descartado.py, a partir de la planilla archivada en docs/analisis/rerun/intento1_postest_bug_confirmacion_doble/, y su salida real, docs/analisis/salida_compute_intento_descartado.txt, se incluye en el mismo repositorio.</w:t>
+        <w:t>horarios crudos de las hojas Pretest y Postest del Anexo A, con el script docs/analisis/compute_practica_residual.py —que incluye una variante de sensibilidad sin el escenario 8— y su salida real docs/analisis/salida_compute_practica_residual.txt, incluidos también en el repositorio de código (Anexo F). El script compute_stats.py incluye además la estimación por intervalo de la reducción relativa (sección 5.2; bootstrap percentil pareado con 10.000 remuestreos y semilla fija 42, los mismos del intervalo de la mediana de las diferencias) y el análisis de sensibilidad del escenario 14 (sección 6.2), y el cruce del registro de n8n contra las ventanas del postest se realizó con docs/analisis/cruzar_log_n8n.py (Anexo A).  La comparación con la pasada descartada del 11/09 (Tabla 6.1) se calculó con docs/analisis/compute_intento_descartado.py, a partir de la planilla archivada en docs/analisis/rerun/intento1_postest_bug_confirmacion_doble/, y su salida real, docs/analisis/salida_compute_intento_descartado.txt, se incluye en el mismo repositorio.</w:t>
       </w:r>
     </w:p>
     <w:p>
@@ -18139,7 +18139,7 @@
         <w:ind w:left="-5" w:right="841"/>
       </w:pPr>
       <w:r>
-        <w:t xml:space="preserve">Archivos: diagrama_arquitectura.png, diagrama_der.png, diagrama_clases.png, diagrama_secuencia.png, diagrama_bpmn_pedido.png (repositorio de código, Anexo F, carpeta docs/diagramas/) </w:t>
+        <w:t xml:space="preserve">Archivos: diagrama_arquitectura.png, diagrama_der.png, diagrama_clases.png, diagrama_secuencia.png, diagrama_carriles_pedido.png (repositorio de código, Anexo F, carpeta docs/diagramas/) </w:t>
       </w:r>
     </w:p>
     <w:p>

</xml_diff>

<commit_message>
Informe v18: aligera §1.2, declara el contenido de docs/ y retira la v17
- §1.2 deja de repetir la justificación de TED y NAS y remite a §3.1, que
  pasa a contener el argumento completo; §6.1 actualiza la remisión.
- El Anexo F enumera el contenido de la carpeta docs/ y declara que las
  versiones anteriores del informe solo se conservan en el historial de git.
- Se retira la v17 (.docx y .pdf): la v18 queda como única versión vigente.

Co-Authored-By: Claude Opus 5.5 <noreply@anthropic.com>
</commit_message>
<xml_diff>
--- a/docs/Informe_Tesis_v18.docx
+++ b/docs/Informe_Tesis_v18.docx
@@ -2657,7 +2657,7 @@
       </w:r>
       <w:r>
         <w:lastRenderedPageBreak/>
-        <w:t xml:space="preserve">automatización de procesos administrativos estructurados (Davenport y Kirby, 2016) y en los beneficios de eficiencia identificados para la adopción de tecnología en PyMEs (Moeuf et al., 2020). Esto no implica una derivación estadística directa de dichos antecedentes: se trata de un umbral de referencia que los autores adoptaron para volver la hipótesis falsable, no de una cifra reportada literalmente por esas fuentes. La tasa de errores en la carga de datos (TED) y el nivel de actualización del stock (NAS) se miden también (sección 3.5) como indicadores descriptivos secundarios del desempeño del sistema, sin un umbral de mejora fijado a priori. Como se explica en la sección 3.4, el diseño experimental —ejecutado por uno de los autores del sistema en ambas condiciones— no permite generar una línea de base de errores representativa de un operador real, por lo que una hipótesis formal sobre TED no sería falsable con este diseño. Esta limitación se discute en la sección 6.1 y su contrastación con operadores reales queda planteada como trabajo futuro (sección 7.2). </w:t>
+        <w:t xml:space="preserve">automatización de procesos administrativos estructurados (Davenport y Kirby, 2016) y en los beneficios de eficiencia identificados para la adopción de tecnología en PyMEs (Moeuf et al., 2020). Esto no implica una derivación estadística directa de dichos antecedentes: se trata de un umbral de referencia que los autores adoptaron para volver la hipótesis falsable, no de una cifra reportada literalmente por esas fuentes. La tasa de errores en la carga de datos (TED) y el nivel de actualización del stock (NAS) se miden también (sección 3.5), como indicadores descriptivos secundarios y sin hipótesis asociada, por las razones que se exponen en la sección 3.1. </w:t>
       </w:r>
     </w:p>
     <w:p>
@@ -2666,7 +2666,7 @@
         <w:ind w:left="-5" w:right="841"/>
       </w:pPr>
       <w:r>
-        <w:t xml:space="preserve">H1 es operacionalizable mediante la variable TPP definida en la sección 3.5; el diseño pretest-postest descripto en la sección 3.4 permitió evaluarla. TED y NAS se miden con el mismo diseño, pero se reportan de forma descriptiva, por las razones ya señaladas. </w:t>
+        <w:t xml:space="preserve">H1 es operacionalizable mediante la variable TPP definida en la sección 3.5; el diseño pretest-postest descripto en la sección 3.4 permitió evaluarla. </w:t>
       </w:r>
     </w:p>
     <w:p>
@@ -3836,7 +3836,7 @@
         <w:ind w:left="-5" w:right="841"/>
       </w:pPr>
       <w:r>
-        <w:t xml:space="preserve">H1 es falsable y operacionalizable mediante la variable definida en la sección 3.5; el diseño adoptado permitió contrastarla, y sus resultados se presentan en el Capítulo 5. TED y NAS se miden con el mismo diseño y se reportan sin hipótesis asociada, conforme a lo advertido en la sección 1.2, dado que un único operador, coautor del sistema, actuó en las dos condiciones. </w:t>
+        <w:t xml:space="preserve">H1 es falsable y operacionalizable mediante la variable definida en la sección 3.5; el diseño adoptado permitió contrastarla, y sus resultados se presentan en el Capítulo 5. TED y NAS se miden con el mismo diseño y se reportan sin hipótesis asociada. Como un único operador, coautor del sistema, actuó en las dos condiciones, el diseño no permite generar una línea de base de errores representativa de un operador real (sección 3.4), por lo que una hipótesis formal sobre TED no sería falsable. Esta limitación se discute en la sección 6.1 y su contrastación con operadores reales queda planteada como trabajo futuro (sección 7.2). </w:t>
       </w:r>
     </w:p>
     <w:p>
@@ -10178,7 +10178,7 @@
         <w:ind w:left="-5" w:right="841"/>
       </w:pPr>
       <w:r>
-        <w:t xml:space="preserve">El resultado de TED —sin diferencia entre condiciones (11,8% en ambas; McNemar exacto, p = 1,000)— contrasta con lo esperado a partir de la misma literatura. Esa literatura atribuye a la automatización una reducción en la tasa de errores humanos (Davenport y Kirby, 2016). La explicación más plausible no es que la automatización sea inefectiva para reducir errores, sino que el diseño experimental, tal como se advirtió en las secciones 1.2 y 3.1, no genera una tasa de error de base representativa de un operador real. Uno de los autores del sistema operó ambas condiciones, con pleno conocimiento del catálogo y del procedimiento; por eso, los errores registrados (dos por condición, detallados en el Anexo A) reflejan más bien la variabilidad esperable de una tarea manual repetitiva que una falla estructural de alguna de las dos modalidades. Un operador real, sin ese conocimiento ni ese entrenamiento previo, probablemente presentaría una tasa de error de base distinta —y potencialmente más alta en la modalidad manual— que este diseño no puede estimar. Además, la naturaleza de los errores difiere entre condiciones (de registro en la planilla en el pretest, de selección del operador en </w:t>
+        <w:t xml:space="preserve">El resultado de TED —sin diferencia entre condiciones (11,8% en ambas; McNemar exacto, p = 1,000)— contrasta con lo esperado a partir de la misma literatura. Esa literatura atribuye a la automatización una reducción en la tasa de errores humanos (Davenport y Kirby, 2016). La explicación más plausible no es que la automatización sea inefectiva para reducir errores, sino que el diseño experimental, tal como se advirtió en la sección 3.1, no genera una tasa de error de base representativa de un operador real. Uno de los autores del sistema operó ambas condiciones, con pleno conocimiento del catálogo y del procedimiento; por eso, los errores registrados (dos por condición, detallados en el Anexo A) reflejan más bien la variabilidad esperable de una tarea manual repetitiva que una falla estructural de alguna de las dos modalidades. Un operador real, sin ese conocimiento ni ese entrenamiento previo, probablemente presentaría una tasa de error de base distinta —y potencialmente más alta en la modalidad manual— que este diseño no puede estimar. Además, la naturaleza de los errores difiere entre condiciones (de registro en la planilla en el pretest, de selección del operador en </w:t>
       </w:r>
       <w:r>
         <w:lastRenderedPageBreak/>
@@ -18272,6 +18272,14 @@
       </w:pPr>
       <w:r>
         <w:t xml:space="preserve">Limitaciones de seguridad conocidas. La protección contra CSRF está deshabilitada (csrf.disable()) y el sistema no emite un token anti-CSRF; el riesgo se mitiga con el atributo SameSite=Strict de la cookie de sesión JWT. Se acepta como limitación para el alcance de este trabajo, que evalúa el artefacto en un entorno controlado, y debería resolverse antes de una implementación real (sección 7.2). </w:t>
+      </w:r>
+    </w:p>
+    <w:p>
+      <w:pPr>
+        <w:ind w:left="-5" w:right="841"/>
+      </w:pPr>
+      <w:r>
+        <w:t xml:space="preserve">Contenido de la carpeta docs/. Contiene únicamente la versión vigente de este informe, la planilla de datos crudos del Anexo A (Plantilla_Experimento_Pretest_Postest.xlsx), los scripts de análisis y sus salidas (docs/analisis/, Anexo B), la evidencia de la re-ejecución del experimento (docs/analisis/rerun/), los diagramas (docs/diagramas/, Anexo D) y las capturas de pantalla (docs/capturas/, Anexo E). Las versiones anteriores del informe se retiraron del árbol del repositorio (commit dad7685) y solo se conservan en el historial de git. </w:t>
       </w:r>
     </w:p>
     <w:p>

</xml_diff>

<commit_message>
Informe v18: unifica la descripción del caso de carrito vacío
§4.5 describe en un solo lugar cómo se alcanza el carrito vacío desde el bot
(pulsando una confirmación de un mensaje anterior), la respuesta HTTP 400 que
devuelve la API, la excepción que expuso la verificación exploratoria
(corregida en 1d95abf) y la cobertura de la suite automatizada. §5.1, §6.2 y
el Anexo E remiten a esa descripción.

Co-Authored-By: Claude Opus 5.5 <noreply@anthropic.com>
</commit_message>
<xml_diff>
--- a/docs/Informe_Tesis_v18.docx
+++ b/docs/Informe_Tesis_v18.docx
@@ -7621,7 +7621,7 @@
         <w:ind w:left="-5" w:right="841"/>
       </w:pPr>
       <w:r>
-        <w:t xml:space="preserve">Adicionalmente, se ejecutaron manualmente escenarios de extremo a extremo que simulan casos reales de uso: la recepción de un pedido a través de Telegram, su procesamiento automático por n8n, el registro correspondiente en la base de datos y la actualización del stock disponible. Estos escenarios cubrieron casos de éxito con uno y con varios productos, el límite de cantidad máxima por interacción (10 unidades) y el caso de error alcanzable desde el bot: el stock insuficiente, que deja el pedido registrado como CANCELADO. Como el cliente interactúa solo mediante botones y no escribe texto libre en ningún paso (secciones 2.5 y 4.4), el bot no puede producir pedidos con un producto inexistente ni con una cantidad fuera de rango. Los casos de error que dependen de la API —carrito vacío, cantidad fuera de rango (1 a 10 unidades) y confirmación repetida del mismo pedido— se verificaron invocando directamente los endpoints, mediante la suite de pruebas automatizadas descripta en el párrafo anterior. Estos mismos escenarios constituyen la base para los escenarios de prueba estandarizados del experimento controlado descripto en la sección 3.4 y documentados en el Anexo A. </w:t>
+        <w:t xml:space="preserve">Adicionalmente, se ejecutaron manualmente escenarios de extremo a extremo que simulan casos reales de uso: la recepción de un pedido a través de Telegram, su procesamiento automático por n8n, el registro correspondiente en la base de datos y la actualización del stock disponible. Estos escenarios cubrieron casos de éxito con uno y con varios productos, el límite de cantidad máxima por interacción (10 unidades) y el caso de error alcanzable desde el bot: el stock insuficiente, que deja el pedido registrado como CANCELADO. Como el cliente interactúa solo mediante botones y no escribe texto libre en ningún paso (secciones 2.5 y 4.4), el bot no puede producir pedidos con un producto inexistente ni con una cantidad fuera de rango. El carrito vacío, en cambio, puede alcanzarse desde el bot, aunque no por el flujo normal: el botón de confirmación solo se ofrece después de agregar un producto y finalizar vacía el carrito sin confirmar un pedido (Anexo E), pero los botones de mensajes anteriores siguen activos en Telegram, de modo que el cliente puede pulsar una confirmación previa con el carrito ya vacío. En ese caso la API responde con un error HTTP 400 y el bot informa que el pedido no puede confirmarse porque el carrito está vacío, comportamiento que se comprobó desde el bot. La verificación exploratoria de este caso, previa al experimento, había expuesto una excepción no controlada en el backend, corregida el 11/08/2026 (sección 4.6), y la suite automatizada descripta en el párrafo anterior cubre hoy su regresión. Los casos que dependen directamente de la API —cantidad fuera de rango (1 a 10 unidades) y confirmación repetida del mismo pedido— se verificaron invocando directamente los endpoints, mediante esa misma suite. Estos mismos escenarios constituyen la base para los escenarios de prueba estandarizados del experimento controlado descripto en la sección 3.4 y documentados en el Anexo A. </w:t>
       </w:r>
     </w:p>
     <w:p>
@@ -8750,7 +8750,7 @@
         <w:ind w:left="-5" w:right="841"/>
       </w:pPr>
       <w:r>
-        <w:t xml:space="preserve">De los 20 escenarios diseñados (sección 3.4), la Tabla 5.1 presenta indicadores calculados sobre denominadores distintos según la variable; esto se explicita a continuación para evitar ambigüedades. TPP se calculó sobre los 20 escenarios completos, ya que en todos los casos —incluidos los tres de stock insuficiente— existe un tiempo de procesamiento medible entre el inicio y el fin definidos en la sección 3.5. TED se calculó sobre 17 de los 20 escenarios, excluyendo los tres escenarios de stock insuficiente (IDs 17 a 19 del Anexo A). En ambas condiciones el sistema los resuelve mediante un rechazo correcto por falta de stock, por lo que no constituyen un error de carga de datos ni aportarían variabilidad relevante a esta variable. NAS, por su parte, no se midió sobre los escenarios de pedido sino de forma independiente, mediante una auditoría de stock sobre la totalidad de los 17 productos del catálogo por condición (sección 3.5). El escenario de carrito vacío (sección 6.2) no forma parte de los 20 escenarios cuantitativos: se excluyó por no tener equivalente en la modalidad manual y se verificó de forma cualitativa, por fuera del análisis estadístico. </w:t>
+        <w:t xml:space="preserve">De los 20 escenarios diseñados (sección 3.4), la Tabla 5.1 presenta indicadores calculados sobre denominadores distintos según la variable; esto se explicita a continuación para evitar ambigüedades. TPP se calculó sobre los 20 escenarios completos, ya que en todos los casos —incluidos los tres de stock insuficiente— existe un tiempo de procesamiento medible entre el inicio y el fin definidos en la sección 3.5. TED se calculó sobre 17 de los 20 escenarios, excluyendo los tres escenarios de stock insuficiente (IDs 17 a 19 del Anexo A). En ambas condiciones el sistema los resuelve mediante un rechazo correcto por falta de stock, por lo que no constituyen un error de carga de datos ni aportarían variabilidad relevante a esta variable. NAS, por su parte, no se midió sobre los escenarios de pedido sino de forma independiente, mediante una auditoría de stock sobre la totalidad de los 17 productos del catálogo por condición (sección 3.5). El caso de carrito vacío no forma parte de los 20 escenarios cuantitativos, por no tener equivalente en la modalidad manual; su verificación se describe en la sección 4.5. </w:t>
       </w:r>
     </w:p>
     <w:p>
@@ -9619,9 +9619,7 @@
         <w:ind w:left="-5" w:right="841"/>
       </w:pPr>
       <w:r>
-        <w:t xml:space="preserve">Por último, el escenario de carrito vacío (Anexo A) se excluyó del análisis cuantitativo por no tener un equivalente válido en la modalidad manual. Su verificación exploratoria confirmó que </w:t>
-        <w:lastRenderedPageBreak/>
-        <w:t xml:space="preserve">exponía una excepción no controlada en el backend, corregida en el commit 1d95abf del 11/08/2026 (sección 4.6). </w:t>
+        <w:t xml:space="preserve">Por último, el caso de carrito vacío se excluyó del análisis cuantitativo por no tener un equivalente válido en la modalidad manual. Cómo se alcanza desde el bot y cómo se verificó se describe en la sección 4.5. </w:t>
       </w:r>
     </w:p>
     <w:p>
@@ -16703,7 +16701,7 @@
         <w:ind w:left="-5" w:right="841"/>
       </w:pPr>
       <w:r>
-        <w:t xml:space="preserve">Nueve capturas de pantalla (numeradas del 1 al 9) documentan lo siguiente: la pantalla de login del panel de administración; el panel de control con acceso a Control de Stock y Pedidos Telegram; la gestión de categorías y productos (alta, edición y eliminación); la interacción completa con el bot de Telegram (selección de categoría, producto y cantidad mediante botones, confirmación y envío del pedido); la recepción del pedido en el panel de Pedidos Telegram y su confirmación desde la interfaz web; el caso de cancelación de un pedido por carrito vaciado desde el bot; y el historial de pedidos con sus filtros de búsqueda. </w:t>
+        <w:t xml:space="preserve">Nueve capturas de pantalla (numeradas del 1 al 9) documentan lo siguiente: la pantalla de login del panel de administración; el panel de control con acceso a Control de Stock y Pedidos Telegram; la gestión de categorías y productos (alta, edición y eliminación); la interacción completa con el bot de Telegram (selección de categoría, producto y cantidad mediante botones, confirmación y envío del pedido); la recepción del pedido en el panel de Pedidos Telegram y su confirmación desde la interfaz web; el vaciado del carrito desde el bot al finalizar sin confirmar un pedido (el intento de confirmar con el carrito vacío se describe en la sección 4.5); y el historial de pedidos con sus filtros de búsqueda. </w:t>
       </w:r>
     </w:p>
     <w:p>

</xml_diff>

<commit_message>
Informe v18: une la Etapa 7 de §3.8, actualiza el índice y regenera el PDF
- En §3.8, la Etapa 7 vuelve a ser un único ítem de la lista: la referencia
  a la sección 3.5 había quedado partida en un párrafo aparte.
- Se actualizan los números de página del índice.
- Se regenera Informe_Tesis_v18.pdf con todas las correcciones de la v18.

Co-Authored-By: Claude Opus 5.5 <noreply@anthropic.com>
</commit_message>
<xml_diff>
--- a/docs/Informe_Tesis_v18.docx
+++ b/docs/Informe_Tesis_v18.docx
@@ -1,6 +1,6 @@
 
 <file path=word/document.xml><?xml version="1.0" encoding="utf-8"?>
-<w:document xmlns:wpc="http://schemas.microsoft.com/office/word/2010/wordprocessingCanvas" xmlns:cx="http://schemas.microsoft.com/office/drawing/2014/chartex" xmlns:cx1="http://schemas.microsoft.com/office/drawing/2015/9/8/chartex" xmlns:cx2="http://schemas.microsoft.com/office/drawing/2015/10/21/chartex" xmlns:cx3="http://schemas.microsoft.com/office/drawing/2016/5/9/chartex" xmlns:cx4="http://schemas.microsoft.com/office/drawing/2016/5/10/chartex" xmlns:cx5="http://schemas.microsoft.com/office/drawing/2016/5/11/chartex" xmlns:cx6="http://schemas.microsoft.com/office/drawing/2016/5/12/chartex" xmlns:cx7="http://schemas.microsoft.com/office/drawing/2016/5/13/chartex" xmlns:cx8="http://schemas.microsoft.com/office/drawing/2016/5/14/chartex" xmlns:mc="http://schemas.openxmlformats.org/markup-compatibility/2006" xmlns:aink="http://schemas.microsoft.com/office/drawing/2016/ink" xmlns:am3d="http://schemas.microsoft.com/office/drawing/2017/model3d" xmlns:o="urn:schemas-microsoft-com:office:office" xmlns:oel="http://schemas.microsoft.com/office/2019/extlst" xmlns:r="http://schemas.openxmlformats.org/officeDocument/2006/relationships" xmlns:m="http://schemas.openxmlformats.org/officeDocument/2006/math" xmlns:v="urn:schemas-microsoft-com:vml" xmlns:wp14="http://schemas.microsoft.com/office/word/2010/wordprocessingDrawing" xmlns:wp="http://schemas.openxmlformats.org/drawingml/2006/wordprocessingDrawing" xmlns:w10="urn:schemas-microsoft-com:office:word" xmlns:w="http://schemas.openxmlformats.org/wordprocessingml/2006/main" xmlns:w14="http://schemas.microsoft.com/office/word/2010/wordml" xmlns:w15="http://schemas.microsoft.com/office/word/2012/wordml" xmlns:w16cex="http://schemas.microsoft.com/office/word/2018/wordml/cex" xmlns:w16cid="http://schemas.microsoft.com/office/word/2016/wordml/cid" xmlns:w16="http://schemas.microsoft.com/office/word/2018/wordml" xmlns:w16du="http://schemas.microsoft.com/office/word/2023/wordml/word16du" xmlns:w16sdtdh="http://schemas.microsoft.com/office/word/2020/wordml/sdtdatahash" xmlns:w16sdtfl="http://schemas.microsoft.com/office/word/2024/wordml/sdtformatlock" xmlns:w16se="http://schemas.microsoft.com/office/word/2015/wordml/symex" xmlns:wpg="http://schemas.microsoft.com/office/word/2010/wordprocessingGroup" xmlns:wpi="http://schemas.microsoft.com/office/word/2010/wordprocessingInk" xmlns:wne="http://schemas.microsoft.com/office/word/2006/wordml" xmlns:wps="http://schemas.microsoft.com/office/word/2010/wordprocessingShape" mc:Ignorable="w14 w15 w16se w16cid w16 w16cex w16sdtdh w16sdtfl w16du wp14">
+<w:document xmlns:wpc="http://schemas.microsoft.com/office/word/2010/wordprocessingCanvas" xmlns:cx="http://schemas.microsoft.com/office/drawing/2014/chartex" xmlns:cx1="http://schemas.microsoft.com/office/drawing/2015/9/8/chartex" xmlns:cx2="http://schemas.microsoft.com/office/drawing/2015/10/21/chartex" xmlns:cx3="http://schemas.microsoft.com/office/drawing/2016/5/9/chartex" xmlns:cx4="http://schemas.microsoft.com/office/drawing/2016/5/10/chartex" xmlns:cx5="http://schemas.microsoft.com/office/drawing/2016/5/11/chartex" xmlns:cx6="http://schemas.microsoft.com/office/drawing/2016/5/12/chartex" xmlns:cx7="http://schemas.microsoft.com/office/drawing/2016/5/13/chartex" xmlns:cx8="http://schemas.microsoft.com/office/drawing/2016/5/14/chartex" xmlns:mc="http://schemas.openxmlformats.org/markup-compatibility/2006" xmlns:m="http://schemas.openxmlformats.org/officeDocument/2006/math" xmlns:aink="http://schemas.microsoft.com/office/drawing/2016/ink" xmlns:am3d="http://schemas.microsoft.com/office/drawing/2017/model3d" xmlns:oel="http://schemas.microsoft.com/office/2019/extlst" xmlns:r="http://schemas.openxmlformats.org/officeDocument/2006/relationships" xmlns:wp14="http://schemas.microsoft.com/office/word/2010/wordprocessingDrawing" xmlns:wp="http://schemas.openxmlformats.org/drawingml/2006/wordprocessingDrawing" xmlns:wpg="http://schemas.microsoft.com/office/word/2010/wordprocessingGroup" xmlns:wpi="http://schemas.microsoft.com/office/word/2010/wordprocessingInk" xmlns:wps="http://schemas.microsoft.com/office/word/2010/wordprocessingShape" xmlns:o="urn:schemas-microsoft-com:office:office" xmlns:v="urn:schemas-microsoft-com:vml" xmlns:w10="urn:schemas-microsoft-com:office:word" xmlns:w="http://schemas.openxmlformats.org/wordprocessingml/2006/main" xmlns:w14="http://schemas.microsoft.com/office/word/2010/wordml" xmlns:w15="http://schemas.microsoft.com/office/word/2012/wordml" xmlns:w16cex="http://schemas.microsoft.com/office/word/2018/wordml/cex" xmlns:w16cid="http://schemas.microsoft.com/office/word/2016/wordml/cid" xmlns:w16="http://schemas.microsoft.com/office/word/2018/wordml" xmlns:w16sdtdh="http://schemas.microsoft.com/office/word/2020/wordml/sdtdatahash" xmlns:w16sdtfl="http://schemas.microsoft.com/office/word/2024/wordml/sdtformatlock" xmlns:w16se="http://schemas.microsoft.com/office/word/2015/wordml/symex" xmlns:w16du="http://schemas.microsoft.com/office/word/2023/wordml/word16du" xmlns:wne="http://schemas.microsoft.com/office/word/2006/wordml" mc:Ignorable="w14 w15 w16se w16cid w16 w16cex w16sdtdh w16sdtfl w16du wp14">
   <w:body>
     <w:p>
       <w:pPr>
@@ -237,6 +237,11 @@
           <w:b/>
         </w:rPr>
         <w:tab/>
+      </w:r>
+      <w:r>
+        <w:rPr>
+          <w:b/>
+        </w:rPr>
         <w:fldChar w:fldCharType="begin"/>
       </w:r>
       <w:r>
@@ -279,8 +284,14 @@
       </w:hyperlink>
       <w:r>
         <w:tab/>
+      </w:r>
+      <w:r>
         <w:fldChar w:fldCharType="begin"/>
+      </w:r>
+      <w:r>
         <w:instrText xml:space="preserve"> PAGEREF sec1_1 \h </w:instrText>
+      </w:r>
+      <w:r>
         <w:fldChar w:fldCharType="separate"/>
       </w:r>
       <w:r>
@@ -312,8 +323,14 @@
       </w:hyperlink>
       <w:r>
         <w:tab/>
+      </w:r>
+      <w:r>
         <w:fldChar w:fldCharType="begin"/>
+      </w:r>
+      <w:r>
         <w:instrText xml:space="preserve"> PAGEREF sec1_2 \h </w:instrText>
+      </w:r>
+      <w:r>
         <w:fldChar w:fldCharType="separate"/>
       </w:r>
       <w:r>
@@ -345,8 +362,14 @@
       </w:hyperlink>
       <w:r>
         <w:tab/>
+      </w:r>
+      <w:r>
         <w:fldChar w:fldCharType="begin"/>
+      </w:r>
+      <w:r>
         <w:instrText xml:space="preserve"> PAGEREF sec1_3 \h </w:instrText>
+      </w:r>
+      <w:r>
         <w:fldChar w:fldCharType="separate"/>
       </w:r>
       <w:r>
@@ -378,8 +401,14 @@
       </w:hyperlink>
       <w:r>
         <w:tab/>
+      </w:r>
+      <w:r>
         <w:fldChar w:fldCharType="begin"/>
+      </w:r>
+      <w:r>
         <w:instrText xml:space="preserve"> PAGEREF sec1_4 \h </w:instrText>
+      </w:r>
+      <w:r>
         <w:fldChar w:fldCharType="separate"/>
       </w:r>
       <w:r>
@@ -411,8 +440,14 @@
       </w:hyperlink>
       <w:r>
         <w:tab/>
+      </w:r>
+      <w:r>
         <w:fldChar w:fldCharType="begin"/>
+      </w:r>
+      <w:r>
         <w:instrText xml:space="preserve"> PAGEREF sec1_5 \h </w:instrText>
+      </w:r>
+      <w:r>
         <w:fldChar w:fldCharType="separate"/>
       </w:r>
       <w:r>
@@ -444,8 +479,14 @@
       </w:hyperlink>
       <w:r>
         <w:tab/>
+      </w:r>
+      <w:r>
         <w:fldChar w:fldCharType="begin"/>
+      </w:r>
+      <w:r>
         <w:instrText xml:space="preserve"> PAGEREF sec1_6 \h </w:instrText>
+      </w:r>
+      <w:r>
         <w:fldChar w:fldCharType="separate"/>
       </w:r>
       <w:r>
@@ -481,6 +522,11 @@
           <w:b/>
         </w:rPr>
         <w:tab/>
+      </w:r>
+      <w:r>
+        <w:rPr>
+          <w:b/>
+        </w:rPr>
         <w:fldChar w:fldCharType="begin"/>
       </w:r>
       <w:r>
@@ -523,8 +569,14 @@
       </w:hyperlink>
       <w:r>
         <w:tab/>
+      </w:r>
+      <w:r>
         <w:fldChar w:fldCharType="begin"/>
+      </w:r>
+      <w:r>
         <w:instrText xml:space="preserve"> PAGEREF sec2_1 \h </w:instrText>
+      </w:r>
+      <w:r>
         <w:fldChar w:fldCharType="separate"/>
       </w:r>
       <w:r>
@@ -556,8 +608,14 @@
       </w:hyperlink>
       <w:r>
         <w:tab/>
+      </w:r>
+      <w:r>
         <w:fldChar w:fldCharType="begin"/>
+      </w:r>
+      <w:r>
         <w:instrText xml:space="preserve"> PAGEREF sec2_2 \h </w:instrText>
+      </w:r>
+      <w:r>
         <w:fldChar w:fldCharType="separate"/>
       </w:r>
       <w:r>
@@ -589,8 +647,14 @@
       </w:hyperlink>
       <w:r>
         <w:tab/>
+      </w:r>
+      <w:r>
         <w:fldChar w:fldCharType="begin"/>
+      </w:r>
+      <w:r>
         <w:instrText xml:space="preserve"> PAGEREF sec2_3 \h </w:instrText>
+      </w:r>
+      <w:r>
         <w:fldChar w:fldCharType="separate"/>
       </w:r>
       <w:r>
@@ -622,8 +686,14 @@
       </w:hyperlink>
       <w:r>
         <w:tab/>
+      </w:r>
+      <w:r>
         <w:fldChar w:fldCharType="begin"/>
+      </w:r>
+      <w:r>
         <w:instrText xml:space="preserve"> PAGEREF sec2_4 \h </w:instrText>
+      </w:r>
+      <w:r>
         <w:fldChar w:fldCharType="separate"/>
       </w:r>
       <w:r>
@@ -655,8 +725,14 @@
       </w:hyperlink>
       <w:r>
         <w:tab/>
+      </w:r>
+      <w:r>
         <w:fldChar w:fldCharType="begin"/>
+      </w:r>
+      <w:r>
         <w:instrText xml:space="preserve"> PAGEREF sec2_5 \h </w:instrText>
+      </w:r>
+      <w:r>
         <w:fldChar w:fldCharType="separate"/>
       </w:r>
       <w:r>
@@ -688,8 +764,14 @@
       </w:hyperlink>
       <w:r>
         <w:tab/>
+      </w:r>
+      <w:r>
         <w:fldChar w:fldCharType="begin"/>
+      </w:r>
+      <w:r>
         <w:instrText xml:space="preserve"> PAGEREF sec2_6 \h </w:instrText>
+      </w:r>
+      <w:r>
         <w:fldChar w:fldCharType="separate"/>
       </w:r>
       <w:r>
@@ -721,8 +803,14 @@
       </w:hyperlink>
       <w:r>
         <w:tab/>
+      </w:r>
+      <w:r>
         <w:fldChar w:fldCharType="begin"/>
+      </w:r>
+      <w:r>
         <w:instrText xml:space="preserve"> PAGEREF sec2_7 \h </w:instrText>
+      </w:r>
+      <w:r>
         <w:fldChar w:fldCharType="separate"/>
       </w:r>
       <w:r>
@@ -754,8 +842,14 @@
       </w:hyperlink>
       <w:r>
         <w:tab/>
+      </w:r>
+      <w:r>
         <w:fldChar w:fldCharType="begin"/>
+      </w:r>
+      <w:r>
         <w:instrText xml:space="preserve"> PAGEREF sec2_7_1 \h </w:instrText>
+      </w:r>
+      <w:r>
         <w:fldChar w:fldCharType="separate"/>
       </w:r>
       <w:r>
@@ -787,8 +881,14 @@
       </w:hyperlink>
       <w:r>
         <w:tab/>
+      </w:r>
+      <w:r>
         <w:fldChar w:fldCharType="begin"/>
+      </w:r>
+      <w:r>
         <w:instrText xml:space="preserve"> PAGEREF sec2_7_2 \h </w:instrText>
+      </w:r>
+      <w:r>
         <w:fldChar w:fldCharType="separate"/>
       </w:r>
       <w:r>
@@ -820,8 +920,14 @@
       </w:hyperlink>
       <w:r>
         <w:tab/>
+      </w:r>
+      <w:r>
         <w:fldChar w:fldCharType="begin"/>
+      </w:r>
+      <w:r>
         <w:instrText xml:space="preserve"> PAGEREF sec2_7_3 \h </w:instrText>
+      </w:r>
+      <w:r>
         <w:fldChar w:fldCharType="separate"/>
       </w:r>
       <w:r>
@@ -857,6 +963,11 @@
           <w:b/>
         </w:rPr>
         <w:tab/>
+      </w:r>
+      <w:r>
+        <w:rPr>
+          <w:b/>
+        </w:rPr>
         <w:fldChar w:fldCharType="begin"/>
       </w:r>
       <w:r>
@@ -899,8 +1010,14 @@
       </w:hyperlink>
       <w:r>
         <w:tab/>
+      </w:r>
+      <w:r>
         <w:fldChar w:fldCharType="begin"/>
+      </w:r>
+      <w:r>
         <w:instrText xml:space="preserve"> PAGEREF sec3_1 \h </w:instrText>
+      </w:r>
+      <w:r>
         <w:fldChar w:fldCharType="separate"/>
       </w:r>
       <w:r>
@@ -932,8 +1049,14 @@
       </w:hyperlink>
       <w:r>
         <w:tab/>
+      </w:r>
+      <w:r>
         <w:fldChar w:fldCharType="begin"/>
+      </w:r>
+      <w:r>
         <w:instrText xml:space="preserve"> PAGEREF sec3_2 \h </w:instrText>
+      </w:r>
+      <w:r>
         <w:fldChar w:fldCharType="separate"/>
       </w:r>
       <w:r>
@@ -965,8 +1088,14 @@
       </w:hyperlink>
       <w:r>
         <w:tab/>
+      </w:r>
+      <w:r>
         <w:fldChar w:fldCharType="begin"/>
+      </w:r>
+      <w:r>
         <w:instrText xml:space="preserve"> PAGEREF sec3_3 \h </w:instrText>
+      </w:r>
+      <w:r>
         <w:fldChar w:fldCharType="separate"/>
       </w:r>
       <w:r>
@@ -998,8 +1127,14 @@
       </w:hyperlink>
       <w:r>
         <w:tab/>
+      </w:r>
+      <w:r>
         <w:fldChar w:fldCharType="begin"/>
+      </w:r>
+      <w:r>
         <w:instrText xml:space="preserve"> PAGEREF sec3_4 \h </w:instrText>
+      </w:r>
+      <w:r>
         <w:fldChar w:fldCharType="separate"/>
       </w:r>
       <w:r>
@@ -1031,8 +1166,14 @@
       </w:hyperlink>
       <w:r>
         <w:tab/>
+      </w:r>
+      <w:r>
         <w:fldChar w:fldCharType="begin"/>
+      </w:r>
+      <w:r>
         <w:instrText xml:space="preserve"> PAGEREF sec3_5 \h </w:instrText>
+      </w:r>
+      <w:r>
         <w:fldChar w:fldCharType="separate"/>
       </w:r>
       <w:r>
@@ -1064,8 +1205,14 @@
       </w:hyperlink>
       <w:r>
         <w:tab/>
+      </w:r>
+      <w:r>
         <w:fldChar w:fldCharType="begin"/>
+      </w:r>
+      <w:r>
         <w:instrText xml:space="preserve"> PAGEREF sec3_6 \h </w:instrText>
+      </w:r>
+      <w:r>
         <w:fldChar w:fldCharType="separate"/>
       </w:r>
       <w:r>
@@ -1097,8 +1244,14 @@
       </w:hyperlink>
       <w:r>
         <w:tab/>
+      </w:r>
+      <w:r>
         <w:fldChar w:fldCharType="begin"/>
+      </w:r>
+      <w:r>
         <w:instrText xml:space="preserve"> PAGEREF sec3_7 \h </w:instrText>
+      </w:r>
+      <w:r>
         <w:fldChar w:fldCharType="separate"/>
       </w:r>
       <w:r>
@@ -1130,15 +1283,21 @@
       </w:hyperlink>
       <w:r>
         <w:tab/>
+      </w:r>
+      <w:r>
         <w:fldChar w:fldCharType="begin"/>
+      </w:r>
+      <w:r>
         <w:instrText xml:space="preserve"> PAGEREF sec3_8 \h </w:instrText>
+      </w:r>
+      <w:r>
         <w:fldChar w:fldCharType="separate"/>
       </w:r>
       <w:r>
         <w:rPr>
           <w:noProof/>
         </w:rPr>
-        <w:t>22</w:t>
+        <w:t>23</w:t>
       </w:r>
       <w:r>
         <w:fldChar w:fldCharType="end"/>
@@ -1163,8 +1322,14 @@
       </w:hyperlink>
       <w:r>
         <w:tab/>
+      </w:r>
+      <w:r>
         <w:fldChar w:fldCharType="begin"/>
+      </w:r>
+      <w:r>
         <w:instrText xml:space="preserve"> PAGEREF sec3_9 \h </w:instrText>
+      </w:r>
+      <w:r>
         <w:fldChar w:fldCharType="separate"/>
       </w:r>
       <w:r>
@@ -1200,6 +1365,11 @@
           <w:b/>
         </w:rPr>
         <w:tab/>
+      </w:r>
+      <w:r>
+        <w:rPr>
+          <w:b/>
+        </w:rPr>
         <w:fldChar w:fldCharType="begin"/>
       </w:r>
       <w:r>
@@ -1242,8 +1412,14 @@
       </w:hyperlink>
       <w:r>
         <w:tab/>
+      </w:r>
+      <w:r>
         <w:fldChar w:fldCharType="begin"/>
+      </w:r>
+      <w:r>
         <w:instrText xml:space="preserve"> PAGEREF sec4_1 \h </w:instrText>
+      </w:r>
+      <w:r>
         <w:fldChar w:fldCharType="separate"/>
       </w:r>
       <w:r>
@@ -1275,8 +1451,14 @@
       </w:hyperlink>
       <w:r>
         <w:tab/>
+      </w:r>
+      <w:r>
         <w:fldChar w:fldCharType="begin"/>
+      </w:r>
+      <w:r>
         <w:instrText xml:space="preserve"> PAGEREF sec4_1_1 \h </w:instrText>
+      </w:r>
+      <w:r>
         <w:fldChar w:fldCharType="separate"/>
       </w:r>
       <w:r>
@@ -1308,8 +1490,14 @@
       </w:hyperlink>
       <w:r>
         <w:tab/>
+      </w:r>
+      <w:r>
         <w:fldChar w:fldCharType="begin"/>
+      </w:r>
+      <w:r>
         <w:instrText xml:space="preserve"> PAGEREF sec4_2 \h </w:instrText>
+      </w:r>
+      <w:r>
         <w:fldChar w:fldCharType="separate"/>
       </w:r>
       <w:r>
@@ -1341,8 +1529,14 @@
       </w:hyperlink>
       <w:r>
         <w:tab/>
+      </w:r>
+      <w:r>
         <w:fldChar w:fldCharType="begin"/>
+      </w:r>
+      <w:r>
         <w:instrText xml:space="preserve"> PAGEREF sec4_3 \h </w:instrText>
+      </w:r>
+      <w:r>
         <w:fldChar w:fldCharType="separate"/>
       </w:r>
       <w:r>
@@ -1374,8 +1568,14 @@
       </w:hyperlink>
       <w:r>
         <w:tab/>
+      </w:r>
+      <w:r>
         <w:fldChar w:fldCharType="begin"/>
+      </w:r>
+      <w:r>
         <w:instrText xml:space="preserve"> PAGEREF sec4_4 \h </w:instrText>
+      </w:r>
+      <w:r>
         <w:fldChar w:fldCharType="separate"/>
       </w:r>
       <w:r>
@@ -1407,8 +1607,14 @@
       </w:hyperlink>
       <w:r>
         <w:tab/>
+      </w:r>
+      <w:r>
         <w:fldChar w:fldCharType="begin"/>
+      </w:r>
+      <w:r>
         <w:instrText xml:space="preserve"> PAGEREF sec4_5 \h </w:instrText>
+      </w:r>
+      <w:r>
         <w:fldChar w:fldCharType="separate"/>
       </w:r>
       <w:r>
@@ -1440,8 +1646,14 @@
       </w:hyperlink>
       <w:r>
         <w:tab/>
+      </w:r>
+      <w:r>
         <w:fldChar w:fldCharType="begin"/>
+      </w:r>
+      <w:r>
         <w:instrText xml:space="preserve"> PAGEREF sec4_6 \h </w:instrText>
+      </w:r>
+      <w:r>
         <w:fldChar w:fldCharType="separate"/>
       </w:r>
       <w:r>
@@ -1477,6 +1689,11 @@
           <w:b/>
         </w:rPr>
         <w:tab/>
+      </w:r>
+      <w:r>
+        <w:rPr>
+          <w:b/>
+        </w:rPr>
         <w:fldChar w:fldCharType="begin"/>
       </w:r>
       <w:r>
@@ -1494,7 +1711,7 @@
         <w:rPr>
           <w:noProof/>
         </w:rPr>
-        <w:t>38</w:t>
+        <w:t>39</w:t>
       </w:r>
       <w:r>
         <w:fldChar w:fldCharType="end"/>
@@ -1519,15 +1736,21 @@
       </w:hyperlink>
       <w:r>
         <w:tab/>
+      </w:r>
+      <w:r>
         <w:fldChar w:fldCharType="begin"/>
+      </w:r>
+      <w:r>
         <w:instrText xml:space="preserve"> PAGEREF sec5_1 \h </w:instrText>
+      </w:r>
+      <w:r>
         <w:fldChar w:fldCharType="separate"/>
       </w:r>
       <w:r>
         <w:rPr>
           <w:noProof/>
         </w:rPr>
-        <w:t>38</w:t>
+        <w:t>39</w:t>
       </w:r>
       <w:r>
         <w:fldChar w:fldCharType="end"/>
@@ -1552,15 +1775,21 @@
       </w:hyperlink>
       <w:r>
         <w:tab/>
+      </w:r>
+      <w:r>
         <w:fldChar w:fldCharType="begin"/>
+      </w:r>
+      <w:r>
         <w:instrText xml:space="preserve"> PAGEREF sec5_2 \h </w:instrText>
+      </w:r>
+      <w:r>
         <w:fldChar w:fldCharType="separate"/>
       </w:r>
       <w:r>
         <w:rPr>
           <w:noProof/>
         </w:rPr>
-        <w:t>41</w:t>
+        <w:t>42</w:t>
       </w:r>
       <w:r>
         <w:fldChar w:fldCharType="end"/>
@@ -1589,6 +1818,11 @@
           <w:b/>
         </w:rPr>
         <w:tab/>
+      </w:r>
+      <w:r>
+        <w:rPr>
+          <w:b/>
+        </w:rPr>
         <w:fldChar w:fldCharType="begin"/>
       </w:r>
       <w:r>
@@ -1606,7 +1840,7 @@
         <w:rPr>
           <w:noProof/>
         </w:rPr>
-        <w:t>43</w:t>
+        <w:t>44</w:t>
       </w:r>
       <w:r>
         <w:fldChar w:fldCharType="end"/>
@@ -1631,15 +1865,21 @@
       </w:hyperlink>
       <w:r>
         <w:tab/>
+      </w:r>
+      <w:r>
         <w:fldChar w:fldCharType="begin"/>
+      </w:r>
+      <w:r>
         <w:instrText xml:space="preserve"> PAGEREF sec6_1 \h </w:instrText>
+      </w:r>
+      <w:r>
         <w:fldChar w:fldCharType="separate"/>
       </w:r>
       <w:r>
         <w:rPr>
           <w:noProof/>
         </w:rPr>
-        <w:t>43</w:t>
+        <w:t>44</w:t>
       </w:r>
       <w:r>
         <w:fldChar w:fldCharType="end"/>
@@ -1664,15 +1904,21 @@
       </w:hyperlink>
       <w:r>
         <w:tab/>
+      </w:r>
+      <w:r>
         <w:fldChar w:fldCharType="begin"/>
+      </w:r>
+      <w:r>
         <w:instrText xml:space="preserve"> PAGEREF sec6_2 \h </w:instrText>
+      </w:r>
+      <w:r>
         <w:fldChar w:fldCharType="separate"/>
       </w:r>
       <w:r>
         <w:rPr>
           <w:noProof/>
         </w:rPr>
-        <w:t>44</w:t>
+        <w:t>45</w:t>
       </w:r>
       <w:r>
         <w:fldChar w:fldCharType="end"/>
@@ -1701,6 +1947,11 @@
           <w:b/>
         </w:rPr>
         <w:tab/>
+      </w:r>
+      <w:r>
+        <w:rPr>
+          <w:b/>
+        </w:rPr>
         <w:fldChar w:fldCharType="begin"/>
       </w:r>
       <w:r>
@@ -1718,7 +1969,7 @@
         <w:rPr>
           <w:noProof/>
         </w:rPr>
-        <w:t>49</w:t>
+        <w:t>50</w:t>
       </w:r>
       <w:r>
         <w:fldChar w:fldCharType="end"/>
@@ -1743,15 +1994,21 @@
       </w:hyperlink>
       <w:r>
         <w:tab/>
+      </w:r>
+      <w:r>
         <w:fldChar w:fldCharType="begin"/>
+      </w:r>
+      <w:r>
         <w:instrText xml:space="preserve"> PAGEREF sec7_1 \h </w:instrText>
+      </w:r>
+      <w:r>
         <w:fldChar w:fldCharType="separate"/>
       </w:r>
       <w:r>
         <w:rPr>
           <w:noProof/>
         </w:rPr>
-        <w:t>49</w:t>
+        <w:t>50</w:t>
       </w:r>
       <w:r>
         <w:fldChar w:fldCharType="end"/>
@@ -1776,15 +2033,21 @@
       </w:hyperlink>
       <w:r>
         <w:tab/>
+      </w:r>
+      <w:r>
         <w:fldChar w:fldCharType="begin"/>
+      </w:r>
+      <w:r>
         <w:instrText xml:space="preserve"> PAGEREF sec7_2 \h </w:instrText>
+      </w:r>
+      <w:r>
         <w:fldChar w:fldCharType="separate"/>
       </w:r>
       <w:r>
         <w:rPr>
           <w:noProof/>
         </w:rPr>
-        <w:t>50</w:t>
+        <w:t>51</w:t>
       </w:r>
       <w:r>
         <w:fldChar w:fldCharType="end"/>
@@ -1813,6 +2076,11 @@
           <w:b/>
         </w:rPr>
         <w:tab/>
+      </w:r>
+      <w:r>
+        <w:rPr>
+          <w:b/>
+        </w:rPr>
         <w:fldChar w:fldCharType="begin"/>
       </w:r>
       <w:r>
@@ -1830,7 +2098,7 @@
         <w:rPr>
           <w:noProof/>
         </w:rPr>
-        <w:t>51</w:t>
+        <w:t>52</w:t>
       </w:r>
       <w:r>
         <w:fldChar w:fldCharType="end"/>
@@ -1859,6 +2127,11 @@
           <w:b/>
         </w:rPr>
         <w:tab/>
+      </w:r>
+      <w:r>
+        <w:rPr>
+          <w:b/>
+        </w:rPr>
         <w:fldChar w:fldCharType="begin"/>
       </w:r>
       <w:r>
@@ -1876,7 +2149,7 @@
         <w:rPr>
           <w:noProof/>
         </w:rPr>
-        <w:t>54</w:t>
+        <w:t>55</w:t>
       </w:r>
       <w:r>
         <w:fldChar w:fldCharType="end"/>
@@ -1901,15 +2174,21 @@
       </w:hyperlink>
       <w:r>
         <w:tab/>
+      </w:r>
+      <w:r>
         <w:fldChar w:fldCharType="begin"/>
+      </w:r>
+      <w:r>
         <w:instrText xml:space="preserve"> PAGEREF anxA \h </w:instrText>
+      </w:r>
+      <w:r>
         <w:fldChar w:fldCharType="separate"/>
       </w:r>
       <w:r>
         <w:rPr>
           <w:noProof/>
         </w:rPr>
-        <w:t>54</w:t>
+        <w:t>55</w:t>
       </w:r>
       <w:r>
         <w:fldChar w:fldCharType="end"/>
@@ -1934,15 +2213,21 @@
       </w:hyperlink>
       <w:r>
         <w:tab/>
+      </w:r>
+      <w:r>
         <w:fldChar w:fldCharType="begin"/>
+      </w:r>
+      <w:r>
         <w:instrText xml:space="preserve"> PAGEREF anxB \h </w:instrText>
+      </w:r>
+      <w:r>
         <w:fldChar w:fldCharType="separate"/>
       </w:r>
       <w:r>
         <w:rPr>
           <w:noProof/>
         </w:rPr>
-        <w:t>56</w:t>
+        <w:t>57</w:t>
       </w:r>
       <w:r>
         <w:fldChar w:fldCharType="end"/>
@@ -1967,15 +2252,21 @@
       </w:hyperlink>
       <w:r>
         <w:tab/>
+      </w:r>
+      <w:r>
         <w:fldChar w:fldCharType="begin"/>
+      </w:r>
+      <w:r>
         <w:instrText xml:space="preserve"> PAGEREF anxC \h </w:instrText>
+      </w:r>
+      <w:r>
         <w:fldChar w:fldCharType="separate"/>
       </w:r>
       <w:r>
         <w:rPr>
           <w:noProof/>
         </w:rPr>
-        <w:t>57</w:t>
+        <w:t>58</w:t>
       </w:r>
       <w:r>
         <w:fldChar w:fldCharType="end"/>
@@ -2000,15 +2291,21 @@
       </w:hyperlink>
       <w:r>
         <w:tab/>
+      </w:r>
+      <w:r>
         <w:fldChar w:fldCharType="begin"/>
+      </w:r>
+      <w:r>
         <w:instrText xml:space="preserve"> PAGEREF anxD \h </w:instrText>
+      </w:r>
+      <w:r>
         <w:fldChar w:fldCharType="separate"/>
       </w:r>
       <w:r>
         <w:rPr>
           <w:noProof/>
         </w:rPr>
-        <w:t>57</w:t>
+        <w:t>58</w:t>
       </w:r>
       <w:r>
         <w:fldChar w:fldCharType="end"/>
@@ -2033,15 +2330,21 @@
       </w:hyperlink>
       <w:r>
         <w:tab/>
+      </w:r>
+      <w:r>
         <w:fldChar w:fldCharType="begin"/>
+      </w:r>
+      <w:r>
         <w:instrText xml:space="preserve"> PAGEREF anxE \h </w:instrText>
+      </w:r>
+      <w:r>
         <w:fldChar w:fldCharType="separate"/>
       </w:r>
       <w:r>
         <w:rPr>
           <w:noProof/>
         </w:rPr>
-        <w:t>58</w:t>
+        <w:t>59</w:t>
       </w:r>
       <w:r>
         <w:fldChar w:fldCharType="end"/>
@@ -2077,15 +2380,21 @@
       </w:hyperlink>
       <w:r>
         <w:tab/>
+      </w:r>
+      <w:r>
         <w:fldChar w:fldCharType="begin"/>
+      </w:r>
+      <w:r>
         <w:instrText xml:space="preserve"> PAGEREF anxF \h </w:instrText>
+      </w:r>
+      <w:r>
         <w:fldChar w:fldCharType="separate"/>
       </w:r>
       <w:r>
         <w:rPr>
           <w:noProof/>
         </w:rPr>
-        <w:t>58</w:t>
+        <w:t>59</w:t>
       </w:r>
       <w:r>
         <w:fldChar w:fldCharType="end"/>
@@ -2110,15 +2419,21 @@
       </w:hyperlink>
       <w:r>
         <w:tab/>
+      </w:r>
+      <w:r>
         <w:fldChar w:fldCharType="begin"/>
+      </w:r>
+      <w:r>
         <w:instrText xml:space="preserve"> PAGEREF anxNota \h </w:instrText>
+      </w:r>
+      <w:r>
         <w:fldChar w:fldCharType="separate"/>
       </w:r>
       <w:r>
         <w:rPr>
           <w:noProof/>
         </w:rPr>
-        <w:t>58</w:t>
+        <w:t>59</w:t>
       </w:r>
       <w:r>
         <w:fldChar w:fldCharType="end"/>
@@ -2248,6 +2563,8 @@
       </w:pPr>
       <w:r>
         <w:t xml:space="preserve">Hipótesis de trabajo: H1: la implementación de un sistema integrado de gestión de stock basado en arquitectura API REST, con automatización de pedidos mediante n8n y Telegram, reducirá el tiempo promedio de procesamiento de pedidos en al menos un 50%, en comparación con la modalidad manual simulada. Esta reducción se mide en un entorno de prueba controlado que reproduce las condiciones operativas típicas de un comercio minorista de pequeña escala. El umbral adoptado se fundamenta en los órdenes de magnitud de mejora reportados para la </w:t>
+      </w:r>
+      <w:r>
         <w:lastRenderedPageBreak/>
         <w:t xml:space="preserve">automatización de procesos administrativos estructurados (Davenport y Kirby, 2016) y en las oportunidades de rediseño de procesos que la adopción de tecnología abre para las PyMEs (Moeuf et al., 2020). Esto no implica una derivación estadística directa de dichos antecedentes: se trata de un umbral de referencia que los autores adoptaron para volver la hipótesis falsable, no de una cifra reportada literalmente por esas fuentes. La tasa de errores en la carga de datos (TED) y el nivel de actualización del stock (NAS) se miden también (sección 3.5), como indicadores descriptivos secundarios y sin hipótesis asociada, por las razones que se exponen en la sección 3.1. </w:t>
       </w:r>
@@ -2486,6 +2803,8 @@
       </w:pPr>
       <w:r>
         <w:t xml:space="preserve">Se reconoce como limitación la dependencia del sistema respecto de la conectividad a internet y del correcto funcionamiento de los servicios externos utilizados (API de Telegram, servidor n8n). La limitación metodológica más relevante del presente trabajo es que la evaluación del sistema se realizó en un entorno de prueba controlado y no en un comercio real en operación. Esto se debe a que, a la fecha de este informe, el artefacto no se implementó comercialmente. En consecuencia, los resultados obtenidos poseen validez interna alta pero validez externa acotada. Su generalización a condiciones reales de uso (variabilidad de clientes, picos de </w:t>
+      </w:r>
+      <w:r>
         <w:lastRenderedPageBreak/>
         <w:t xml:space="preserve">demanda, errores de conectividad en campo) requiere una validación de campo posterior, que se plantea como trabajo futuro prioritario (sección 7.2). </w:t>
       </w:r>
@@ -2500,6 +2819,7 @@
       <w:bookmarkStart w:id="15" w:name="ch2"/>
       <w:bookmarkEnd w:id="14"/>
       <w:r>
+        <w:lastRenderedPageBreak/>
         <w:t>CAPÍTULO 2: Marco Teórico y Estado del Arte</w:t>
       </w:r>
       <w:bookmarkEnd w:id="15"/>
@@ -2587,16 +2907,15 @@
         <w:ind w:left="-5" w:right="841"/>
       </w:pPr>
       <w:r>
-        <w:t xml:space="preserve">El estilo arquitectónico REST (Representational State Transfer), introducido por Fielding (2000) en su tesis doctoral, se ha consolidado como uno de los enfoques más utilizados en el desarrollo de sistemas distribuidos. REST se fundamenta en un conjunto de restricciones que incluyen la </w:t>
+        <w:t xml:space="preserve">El estilo arquitectónico REST (Representational State Transfer), introducido por Fielding (2000) en su tesis doctoral, se ha consolidado como uno de los enfoques más utilizados en el desarrollo de sistemas distribuidos. REST se fundamenta en un conjunto de restricciones que incluyen la separación entre cliente y servidor, la ausencia de estado en las comunicaciones (stateless), la utilización de una interfaz uniforme y la identificación de recursos mediante URIs (Uniform Resource Identifiers). </w:t>
+      </w:r>
+    </w:p>
+    <w:p>
+      <w:pPr>
+        <w:ind w:left="-5" w:right="841"/>
+      </w:pPr>
+      <w:r>
         <w:lastRenderedPageBreak/>
-        <w:t xml:space="preserve">separación entre cliente y servidor, la ausencia de estado en las comunicaciones (stateless), la utilización de una interfaz uniforme y la identificación de recursos mediante URIs (Uniform Resource Identifiers). </w:t>
-      </w:r>
-    </w:p>
-    <w:p>
-      <w:pPr>
-        <w:ind w:left="-5" w:right="841"/>
-      </w:pPr>
-      <w:r>
         <w:t xml:space="preserve">La adopción de este estilo arquitectónico permite desarrollar aplicaciones altamente escalables y flexibles, facilitando la interoperabilidad entre sistemas heterogéneos. El uso del protocolo HTTP como mecanismo de comunicación y la representación de recursos en formatos estándar como JSON favorecen la integración con múltiples plataformas y dispositivos. </w:t>
       </w:r>
     </w:p>
@@ -2641,9 +2960,7 @@
         <w:ind w:left="-5" w:right="841"/>
       </w:pPr>
       <w:r>
-        <w:t xml:space="preserve">Fowler (2002) señala, para la separación de una aplicación en capas, que mejora la modularidad del sistema y facilita su escalabilidad y mantenimiento, ya que permite la evolución independiente de cada componente. Su obra es anterior a las aplicaciones de página única: aquí ese principio se aplica a la separación entre frontend y backend. En la actualidad, este patrón se implementa frecuentemente mediante frameworks de componentes del lado del cliente (React, Vue, Angular) que consumen APIs REST expuestas por el servidor. Para el presente trabajo, la elección de JavaScript como lenguaje del frontend responde a criterios de </w:t>
-        <w:lastRenderedPageBreak/>
-        <w:t xml:space="preserve">disponibilidad de herramientas, madurez del ecosistema y compatibilidad con los navegadores web actuales. </w:t>
+        <w:t xml:space="preserve">Fowler (2002) señala, para la separación de una aplicación en capas, que mejora la modularidad del sistema y facilita su escalabilidad y mantenimiento, ya que permite la evolución independiente de cada componente. Su obra es anterior a las aplicaciones de página única: aquí ese principio se aplica a la separación entre frontend y backend. En la actualidad, este patrón se implementa frecuentemente mediante frameworks de componentes del lado del cliente (React, Vue, Angular) que consumen APIs REST expuestas por el servidor. Para el presente trabajo, la elección de JavaScript como lenguaje del frontend responde a criterios de disponibilidad de herramientas, madurez del ecosistema y compatibilidad con los navegadores web actuales. </w:t>
       </w:r>
     </w:p>
     <w:p>
@@ -2652,6 +2969,7 @@
         <w:ind w:left="-5" w:right="841"/>
       </w:pPr>
       <w:r>
+        <w:lastRenderedPageBreak/>
         <w:t xml:space="preserve">La implementación del frontend como aplicación de página única (Single-Page Application, SPA) tiene implicaciones directas sobre el diseño de la API REST del sistema. A diferencia de las aplicaciones web tradicionales de renderizado en servidor, una SPA delega toda la lógica de presentación al cliente y se comunica con el backend exclusivamente mediante llamadas HTTP asíncronas. Esto implica tres exigencias para la API. Debe exponer respuestas en formato JSON autocontenidas. Debe configurar los encabezados CORS (Cross-Origin Resource Sharing) cuando el frontend se sirve desde un dominio distinto del de la API; en este trabajo lo sirve el propio backend, por lo que el origen es el mismo. Y debe diseñar sus endpoints de manera que cada respuesta incluya la información suficiente para que el cliente construya la vista sin requerir llamadas adicionales encadenadas. Este patrón de interacción se inscribe, en términos generales, en la arquitectura Modelo-Vista-Controlador (MVC), descripta junto con la separación en capas por Fowler (2002): el backend actúa como capa de Modelo y Controlador, gestionando la lógica de negocio y el acceso a datos, mientras que el frontend SPA asume el rol de Vista desacoplada. Esta lectura del frontend como Vista desacoplada es una interpretación de los autores, no una categoría de la obra citada. La comprensión de esta separación de responsabilidades es relevante para evaluar las decisiones de diseño de la API descritas en la sección 4.2. </w:t>
       </w:r>
     </w:p>
@@ -2695,9 +3013,11 @@
         <w:ind w:left="-5" w:right="841"/>
       </w:pPr>
       <w:r>
-        <w:t xml:space="preserve">n8n es una plataforma de automatización de flujos de trabajo que permite definir pipelines mediante una interfaz visual basada en nodos (n8n, 2024). Su código es de acceso público bajo la Sustainable Use License, un modelo que la propia n8n denomina fair-code: el software es gratuito para uso interno y su código puede inspeccionarse y modificarse, pero restringe la redistribución comercial. Por eso mismo, n8n aclara explícitamente que no se considera de código abierto en el sentido estricto del término (n8n, 2022). Cada nodo encapsula una </w:t>
+        <w:t xml:space="preserve">n8n es una plataforma de automatización de flujos de trabajo que permite definir pipelines mediante una interfaz visual basada en nodos (n8n, 2024). Su código es de acceso público bajo la Sustainable Use License, un modelo que la propia n8n denomina fair-code: el software es gratuito para uso interno y su código puede inspeccionarse y modificarse, pero restringe la redistribución comercial. Por eso mismo, n8n aclara explícitamente que no se considera de código abierto en el sentido estricto del término (n8n, 2022). Cada nodo encapsula una operación —llamadas HTTP, transformaciones de datos, integraciones con aplicaciones externas— y los flujos se activan mediante disparadores programados, webhooks o eventos manuales. Comparada con alternativas como Apache Airflow o Zapier, n8n ofrece una curva de </w:t>
+      </w:r>
+      <w:r>
         <w:lastRenderedPageBreak/>
-        <w:t xml:space="preserve">operación —llamadas HTTP, transformaciones de datos, integraciones con aplicaciones externas— y los flujos se activan mediante disparadores programados, webhooks o eventos manuales. Comparada con alternativas como Apache Airflow o Zapier, n8n ofrece una curva de aprendizaje más suave y una interfaz accesible para usuarios con distintos niveles de experiencia técnica. Esto resulta ventajoso en contextos donde operadores no especializados necesitan monitorear o modificar los flujos. </w:t>
+        <w:t xml:space="preserve">aprendizaje más suave y una interfaz accesible para usuarios con distintos niveles de experiencia técnica. Esto resulta ventajoso en contextos donde operadores no especializados necesitan monitorear o modificar los flujos. </w:t>
       </w:r>
     </w:p>
     <w:p>
@@ -2749,9 +3069,7 @@
         <w:ind w:left="-5" w:right="841"/>
       </w:pPr>
       <w:r>
-        <w:t xml:space="preserve">La integración de chatbots en procesos comerciales ha sido objeto de estudio creciente en la literatura académica reciente. Adamopoulou y Moussiades (2020) realizan una revisión comprehensiva del estado del arte en chatbots, identificando sus aplicaciones en comercio electrónico, atención al cliente y automatización de tareas administrativas. Los autores señalan </w:t>
-        <w:lastRenderedPageBreak/>
-        <w:t xml:space="preserve">que la efectividad de estos sistemas depende en gran medida de la calidad de la integración con los sistemas backend, un desafío que el presente trabajo aborda mediante la utilización de n8n como capa de orquestación. </w:t>
+        <w:t xml:space="preserve">La integración de chatbots en procesos comerciales ha sido objeto de estudio creciente en la literatura académica reciente. Adamopoulou y Moussiades (2020) realizan una revisión comprehensiva del estado del arte en chatbots, identificando sus aplicaciones en comercio electrónico, atención al cliente y automatización de tareas administrativas. Los autores señalan que la efectividad de estos sistemas depende en gran medida de la calidad de la integración con los sistemas backend, un desafío que el presente trabajo aborda mediante la utilización de n8n como capa de orquestación. </w:t>
       </w:r>
     </w:p>
     <w:p>
@@ -2760,6 +3078,7 @@
         <w:ind w:left="-5" w:right="841"/>
       </w:pPr>
       <w:r>
+        <w:lastRenderedPageBreak/>
         <w:t xml:space="preserve">Corresponde precisar, sin embargo, que gran parte de la literatura sobre chatbots citada en esta sección aborda sistemas con capacidad de interpretación de lenguaje natural (NLP). El bot desarrollado en el presente trabajo (sección 4.4), en cambio, no incorpora procesamiento de lenguaje natural en ningún punto de su funcionamiento: la interacción con el cliente está guiada enteramente por botones en línea (inline keyboard) de Telegram, sin que el usuario escriba texto libre en ningún paso del proceso de toma de pedidos. La referencia a Adamopoulou y Moussiades (2020) se retoma con mayor precisión en la sección 2.7.2, en relación específica con los chatbots basados en reglas —categoría en la que se inscribe el artefacto desarrollado—, y no con los sistemas basados en aprendizaje automático o NLP. </w:t>
       </w:r>
     </w:p>
@@ -2860,9 +3179,11 @@
         <w:ind w:left="-5" w:right="841"/>
       </w:pPr>
       <w:r>
-        <w:t xml:space="preserve">En el ámbito latinoamericano, estudios recientes han evidenciado que gran parte de las PyMEs del sector comercial continúa utilizando hojas de cálculo o registros manuales para la gestión </w:t>
+        <w:t xml:space="preserve">En el ámbito latinoamericano, estudios recientes han evidenciado que gran parte de las PyMEs del sector comercial continúa utilizando hojas de cálculo o registros manuales para la gestión de inventarios, incluso en contextos urbanos con acceso a tecnología (CEPAL, 2021). Esta realidad subraya la pertinencia de desarrollar soluciones tecnológicas adaptadas a las capacidades y restricciones de este segmento. Un análisis cienciométrico más reciente </w:t>
+      </w:r>
+      <w:r>
         <w:lastRenderedPageBreak/>
-        <w:t>de inventarios, incluso en contextos urbanos con acceso a tecnología (CEPAL, 2021). Esta realidad subraya la pertinencia de desarrollar soluciones tecnológicas adaptadas a las capacidades y restricciones de este segmento. Un análisis cienciométrico más reciente confirma esta tendencia: Parra-Sanchez y Talero-Sarmiento (2024), a partir de 448 documentos indexados en Scopus, documentan un crecimiento sostenido de la investigación sobre transformación digital en PyMEs. También documentan una intención creciente de estas organizaciones de adoptar tecnologías como la inteligencia artificial, el big data, la computación en la nube y el comercio electrónico, lo cual refuerza la pertinencia y oportunidad del artefacto desarrollado en este trabajo. Gao, Teh y Ho (2026) confirman esta tendencia mediante un análisis bibliométrico y de contenido de 115 estudios empíricos sobre transformación digital e innovación en PyMEs, publicados en 32 países y relevados en Scopus y Web of Science. Sus resultados muestran una correlación positiva pero dependiente del contexto entre transformación digital e innovación, y los propios autores señalan que esta relación permanece insuficientemente explorada para el segmento de pequeñas y medianas empresas, lo cual refuerza el vacío de conocimiento identificado en la sección 2.7.3.</w:t>
+        <w:t>confirma esta tendencia: Parra-Sanchez y Talero-Sarmiento (2024), a partir de 448 documentos indexados en Scopus, documentan un crecimiento sostenido de la investigación sobre transformación digital en PyMEs. También documentan una intención creciente de estas organizaciones de adoptar tecnologías como la inteligencia artificial, el big data, la computación en la nube y el comercio electrónico, lo cual refuerza la pertinencia y oportunidad del artefacto desarrollado en este trabajo. Gao, Teh y Ho (2026) confirman esta tendencia mediante un análisis bibliométrico y de contenido de 115 estudios empíricos sobre transformación digital e innovación en PyMEs, publicados en 32 países y relevados en Scopus y Web of Science. Sus resultados muestran una correlación positiva pero dependiente del contexto entre transformación digital e innovación, y los propios autores señalan que esta relación permanece insuficientemente explorada para el segmento de pequeñas y medianas empresas, lo cual refuerza el vacío de conocimiento identificado en la sección 2.7.3.</w:t>
       </w:r>
     </w:p>
     <w:p>
@@ -2907,9 +3228,7 @@
         <w:ind w:left="-5" w:right="841"/>
       </w:pPr>
       <w:r>
-        <w:t>Desde la perspectiva de la automatización de procesos, van der Aalst (2016) establece los fundamentos teóricos del análisis de procesos de negocio. Con ello, proporciona el marco conceptual necesario para justificar las decisiones de diseño de los flujos de automatización implementados con n8n en este trabajo. La utilización de modelos de proceso explícitos —</w:t>
-        <w:lastRenderedPageBreak/>
-        <w:t xml:space="preserve">aunque sean visuales y no formales— responde a la recomendación de documentar los flujos antes de automatizarlos. </w:t>
+        <w:t xml:space="preserve">Desde la perspectiva de la automatización de procesos, van der Aalst (2016) establece los fundamentos teóricos del análisis de procesos de negocio. Con ello, proporciona el marco conceptual necesario para justificar las decisiones de diseño de los flujos de automatización implementados con n8n en este trabajo. La utilización de modelos de proceso explícitos —aunque sean visuales y no formales— responde a la recomendación de documentar los flujos antes de automatizarlos. </w:t>
       </w:r>
     </w:p>
     <w:p>
@@ -2921,6 +3240,7 @@
       <w:bookmarkStart w:id="35" w:name="sec2_7_3"/>
       <w:bookmarkEnd w:id="34"/>
       <w:r>
+        <w:lastRenderedPageBreak/>
         <w:t>2.7.3 Vacío de conocimiento identificado</w:t>
       </w:r>
       <w:bookmarkEnd w:id="35"/>
@@ -2958,6 +3278,7 @@
       <w:bookmarkStart w:id="37" w:name="ch3"/>
       <w:bookmarkEnd w:id="36"/>
       <w:r>
+        <w:lastRenderedPageBreak/>
         <w:t>CAPÍTULO 3: Marco Metodológico</w:t>
       </w:r>
       <w:bookmarkEnd w:id="37"/>
@@ -3026,9 +3347,7 @@
         <w:ind w:left="-5" w:right="841"/>
       </w:pPr>
       <w:r>
-        <w:t xml:space="preserve">H1 es falsable y operacionalizable mediante la variable definida en la sección 3.5; el diseño adoptado permitió contrastarla, y sus resultados se presentan en el Capítulo 5. TED y NAS se miden con el mismo diseño y se reportan sin hipótesis asociada. Como un único operador, coautor del sistema, actuó en las dos condiciones, el diseño no permite generar una línea de base de errores representativa de un operador real (sección 3.4), por lo que una hipótesis </w:t>
-        <w:lastRenderedPageBreak/>
-        <w:t xml:space="preserve">formal sobre TED no sería falsable. Esta limitación se discute en la sección 6.1 y su contrastación con operadores reales queda planteada como trabajo futuro (sección 7.2). </w:t>
+        <w:t xml:space="preserve">H1 es falsable y operacionalizable mediante la variable definida en la sección 3.5; el diseño adoptado permitió contrastarla, y sus resultados se presentan en el Capítulo 5. TED y NAS se miden con el mismo diseño y se reportan sin hipótesis asociada. Como un único operador, coautor del sistema, actuó en las dos condiciones, el diseño no permite generar una línea de base de errores representativa de un operador real (sección 3.4), por lo que una hipótesis formal sobre TED no sería falsable. Esta limitación se discute en la sección 6.1 y su contrastación con operadores reales queda planteada como trabajo futuro (sección 7.2). </w:t>
       </w:r>
     </w:p>
     <w:p>
@@ -3055,7 +3374,11 @@
         <w:ind w:left="-5" w:right="841"/>
       </w:pPr>
       <w:r>
-        <w:t xml:space="preserve">El estudio se inscribe en el paradigma post-positivista, que sostiene que el conocimiento científico puede aproximarse a la realidad mediante la observación sistemática, la medición objetiva y la contrastación empírica de resultados. Este paradigma reconoce, al mismo tiempo, las limitaciones inherentes a todo proceso de medición. En este marco, la validez de los hallazgos se fundamenta en la definición precisa de variables, la utilización de instrumentos de medición consistentes y la posibilidad de replicar el estudio en contextos similares. </w:t>
+        <w:t xml:space="preserve">El estudio se inscribe en el paradigma post-positivista, que sostiene que el conocimiento científico puede aproximarse a la realidad mediante la observación sistemática, la medición objetiva y la contrastación empírica de resultados. Este paradigma reconoce, al mismo tiempo, las limitaciones inherentes a todo proceso de medición. En este marco, la validez de los </w:t>
+      </w:r>
+      <w:r>
+        <w:lastRenderedPageBreak/>
+        <w:t xml:space="preserve">hallazgos se fundamenta en la definición precisa de variables, la utilización de instrumentos de medición consistentes y la posibilidad de replicar el estudio en contextos similares. </w:t>
       </w:r>
     </w:p>
     <w:p>
@@ -3134,17 +3457,19 @@
         <w:ind w:left="-5" w:right="841"/>
       </w:pPr>
       <w:r>
-        <w:t xml:space="preserve">El diseño de investigación adoptado consistió en una medición pretest-postest sobre un único grupo, ejecutada mediante un experimento controlado que simuló las condiciones operativas de un comercio minorista de pequeña escala. En este esquema, se evaluaron los indicadores </w:t>
+        <w:t xml:space="preserve">El diseño de investigación adoptado consistió en una medición pretest-postest sobre un único grupo, ejecutada mediante un experimento controlado que simuló las condiciones operativas de un comercio minorista de pequeña escala. En este esquema, se evaluaron los indicadores operativos bajo la modalidad manual simulada (pretest) y se compararon con los resultados obtenidos tras la incorporación del sistema automatizado (postest), sobre el mismo conjunto de escenarios de pedido. De ese modo, el contraste permite estimar la diferencia entre condiciones; su atribución al sistema queda acotada por las amenazas discutidas en las secciones 3.9 y 6.2. </w:t>
+      </w:r>
+    </w:p>
+    <w:p>
+      <w:pPr>
+        <w:ind w:left="-5" w:right="841"/>
+      </w:pPr>
+      <w:r>
+        <w:t xml:space="preserve">Corresponde precisar con mayor rigor conceptual la denominación de este diseño de investigación. Siguiendo la taxonomía clásica de Campbell y Stanley (1963), un diseño pretest-postest de un único grupo, sin grupo de control independiente ni asignación aleatoria de </w:t>
+      </w:r>
+      <w:r>
         <w:lastRenderedPageBreak/>
-        <w:t xml:space="preserve">operativos bajo la modalidad manual simulada (pretest) y se compararon con los resultados obtenidos tras la incorporación del sistema automatizado (postest), sobre el mismo conjunto de escenarios de pedido. De ese modo, el contraste permite estimar la diferencia entre condiciones; su atribución al sistema queda acotada por las amenazas discutidas en las secciones 3.9 y 6.2. </w:t>
-      </w:r>
-    </w:p>
-    <w:p>
-      <w:pPr>
-        <w:ind w:left="-5" w:right="841"/>
-      </w:pPr>
-      <w:r>
-        <w:t xml:space="preserve">Corresponde precisar con mayor rigor conceptual la denominación de este diseño de investigación. Siguiendo la taxonomía clásica de Campbell y Stanley (1963), un diseño pretest-postest de un único grupo, sin grupo de control independiente ni asignación aleatoria de unidades a condiciones, se clasifica en sentido estricto como preexperimental, y no como cuasiexperimental. Esta última categoría requiere, como mínimo, un grupo de comparación no equivalente. En el presente trabajo no fue posible constituir dicho grupo de comparación, dado que un único operador, coautor del sistema, ejecutó el experimento sobre el mismo conjunto de escenarios en ambas condiciones. Esta precisión terminológica no invalida los resultados obtenidos, pero acota el alcance de las afirmaciones causales que pueden sostenerse a partir de ellos. El diseño intrasujeto reduce la variabilidad atribuible a diferencias entre sujetos u organizaciones, pero no descarta por sí solo otras fuentes de variación —como el efecto de aprendizaje discutido en la sección 3.9—, tal como sí lo haría un grupo de control independiente. </w:t>
+        <w:t xml:space="preserve">unidades a condiciones, se clasifica en sentido estricto como preexperimental, y no como cuasiexperimental. Esta última categoría requiere, como mínimo, un grupo de comparación no equivalente. En el presente trabajo no fue posible constituir dicho grupo de comparación, dado que un único operador, coautor del sistema, ejecutó el experimento sobre el mismo conjunto de escenarios en ambas condiciones. Esta precisión terminológica no invalida los resultados obtenidos, pero acota el alcance de las afirmaciones causales que pueden sostenerse a partir de ellos. El diseño intrasujeto reduce la variabilidad atribuible a diferencias entre sujetos u organizaciones, pero no descarta por sí solo otras fuentes de variación —como el efecto de aprendizaje discutido en la sección 3.9—, tal como sí lo haría un grupo de control independiente. </w:t>
       </w:r>
     </w:p>
     <w:p>
@@ -4101,7 +4426,6 @@
               <w:rPr>
                 <w:sz w:val="17"/>
               </w:rPr>
-              <w:lastRenderedPageBreak/>
               <w:t>6</w:t>
             </w:r>
           </w:p>
@@ -5270,6 +5594,7 @@
               <w:rPr>
                 <w:sz w:val="17"/>
               </w:rPr>
+              <w:lastRenderedPageBreak/>
               <w:t>14</w:t>
             </w:r>
           </w:p>
@@ -6297,9 +6622,11 @@
         <w:ind w:left="-5" w:right="841"/>
       </w:pPr>
       <w:r>
-        <w:t xml:space="preserve">Los 20 escenarios de pedido estandarizados por condición (Anexo A) no se seleccionaron mediante un procedimiento de muestreo aleatorio. Esto se debe a que no se dispuso de una población real de pedidos históricos del comercio de referencia a partir de la cual muestrear. Su construcción respondió, en cambio, a un criterio de diseño deliberado de los autores, orientado a maximizar la cobertura de la variabilidad operativa típica de un comercio minorista de pequeña escala. Se incluyeron así pedidos de uno y de múltiples productos, y casos límite (tres escenarios de stock insuficiente, IDs 17 a 19 del Anexo A, y un escenario de cantidad máxima permitida). La dimensión "cliente nuevo vs. recurrente", presente en una versión anterior del diseño de escenarios, se retiró de la versión final. El artefacto identifica al cliente </w:t>
+        <w:t xml:space="preserve">Los 20 escenarios de pedido estandarizados por condición (Anexo A) no se seleccionaron mediante un procedimiento de muestreo aleatorio. Esto se debe a que no se dispuso de una población real de pedidos históricos del comercio de referencia a partir de la cual muestrear. Su construcción respondió, en cambio, a un criterio de diseño deliberado de los autores, orientado a maximizar la cobertura de la variabilidad operativa típica de un comercio minorista de pequeña escala. Se incluyeron así pedidos de uno y de múltiples productos, y casos límite (tres escenarios de stock insuficiente, IDs 17 a 19 del Anexo A, y un escenario de cantidad máxima permitida). La dimensión "cliente nuevo vs. recurrente", presente en una versión anterior del diseño de escenarios, se retiró de la versión final. El artefacto identifica al cliente únicamente por chat_id y por un campo de texto libre (sección 4.3), sin relación con una entidad de clientes, por lo que esa distinción no es representable en el sistema evaluado. Se reconoce como limitación que este criterio de construcción deliberada —al no ser aleatorio ni estar validado por un evaluador ajeno al equipo de desarrollo— puede introducir un sesgo de selección no cuantificable. Ese sesgo favorecería casos que los propios autores anticipan que el sistema resuelve correctamente. Adicionalmente, antes de los 20 escenarios de medición de </w:t>
+      </w:r>
+      <w:r>
         <w:lastRenderedPageBreak/>
-        <w:t>únicamente por chat_id y por un campo de texto libre (sección 4.3), sin relación con una entidad de clientes, por lo que esa distinción no es representable en el sistema evaluado. Se reconoce como limitación que este criterio de construcción deliberada —al no ser aleatorio ni estar validado por un evaluador ajeno al equipo de desarrollo— puede introducir un sesgo de selección no cuantificable. Ese sesgo favorecería casos que los propios autores anticipan que el sistema resuelve correctamente. Adicionalmente, antes de los 20 escenarios de medición de cada condición se ejecutaron 5 escenarios de calentamiento, no cronometrados y excluidos de todo análisis. Con ellos se buscó que el operador superara la curva de aprendizaje básica del procedimiento (manual o automatizado) antes de iniciar el registro de datos; esta incorporación se retoma en la sección 3.9. Un único operador, coautor del sistema, ejecutó las dos condiciones. La grabación de pantalla la realizó el otro autor y los instantes de inicio y de fin de cada escenario (sección 3.5) los leyó el mismo operador, con conocimiento de la condición de cada video.</w:t>
+        <w:t>cada condición se ejecutaron 5 escenarios de calentamiento, no cronometrados y excluidos de todo análisis. Con ellos se buscó que el operador superara la curva de aprendizaje básica del procedimiento (manual o automatizado) antes de iniciar el registro de datos; esta incorporación se retoma en la sección 3.9. Un único operador, coautor del sistema, ejecutó las dos condiciones. La grabación de pantalla la realizó el otro autor y los instantes de inicio y de fin de cada escenario (sección 3.5) los leyó el mismo operador, con conocimiento de la condición de cada video.</w:t>
       </w:r>
     </w:p>
     <w:p>
@@ -6340,9 +6667,11 @@
         <w:jc w:val="left"/>
       </w:pPr>
       <w:r>
-        <w:t xml:space="preserve">Tiempo de procesamiento de pedidos (TPP): intervalo, expresado en segundos, entre el inicio de la gestión del pedido y su registro confirmado, delimitado en cada condición por los eventos que se detallan al final de este ítem. Se midió con un instrumento único en ambas condiciones: una grabación de pantalla con el reloj del sistema operativo visible (con segundos). Sobre esa grabación se identificó, para cada escenario, el instante de inicio y el de fin, leyendo el reloj al segundo en los dos casos. El pretest se ejecutó el 10/09/2026 y el postest el 12/09/2026, con un intervalo de aproximadamente un día y 23 horas entre el cierre de uno y el inicio del otro (sección 3.9). Los horarios del pretest se habían cargado originalmente en formato a. m. por un valor por defecto del editor de planillas; como la corrida fue nocturna, lo que confirma la hora de guardado del video, se sumaron 12 horas a los dos extremos de cada intervalo, lo que no altera las diferencias que definen TPP. Antes de cada condición se resolvieron 5 escenarios de calentamiento no cronometrados, excluidos del análisis (sección 3.4). Los eventos que delimitan TPP difieren entre condiciones. En el pretest, el inicio es el instante en que el operador empieza a escribir el pedido en la planilla y el fin, el instante en que termina de actualizar el stock y vuelve a la hoja de registro de pedidos (Ledger). En el postest, el inicio es el envío del primer mensaje del cliente al bot, visible en la grabación unos segundos antes de la primera ejecución de n8n de la ventana (2 s en el escenario 1), y el fin, la llegada al cliente del mensaje de Telegram que confirma el pedido, que el bot envía unos segundos después de que el operador lo confirma en el panel (también 2 s en ese escenario); esa confirmación es la que descuenta el stock (sección 4.4). En los tres escenarios de stock insuficiente, en los que no corresponde descontar stock, el fin es el registro del rechazo: en el pretest, cuando el operador marca el pedido como rechazado en la hoja Ledger; en el postest, cuando el bot informa la cancelación, ya que el pedido queda registrado como CANCELADO sin intervención del operador. En ambas condiciones, el mismo autor simuló al cliente y operó el registro. Las dos ventanas incluyen, por lo tanto, el registro del pedido y el descuento del stock, pero la del </w:t>
+        <w:t xml:space="preserve">Tiempo de procesamiento de pedidos (TPP): intervalo, expresado en segundos, entre el inicio de la gestión del pedido y su registro confirmado, delimitado en cada condición por los eventos que se detallan al final de este ítem. Se midió con un instrumento único en ambas condiciones: una grabación de pantalla con el reloj del sistema operativo visible (con segundos). Sobre esa grabación se identificó, para cada escenario, el instante de inicio y el de fin, leyendo el reloj al segundo en los dos casos. El pretest se ejecutó el 10/09/2026 y el postest el 12/09/2026, con un intervalo de aproximadamente un día y 23 horas entre el cierre de uno y el inicio del otro (sección 3.9). Los horarios del pretest se habían cargado originalmente en formato a. m. por un valor por defecto del editor de planillas; como la corrida fue nocturna, lo que confirma la hora de guardado del video, se sumaron 12 horas a los dos extremos de cada intervalo, lo que no altera las diferencias que definen TPP. Antes de cada condición se resolvieron 5 escenarios de calentamiento no cronometrados, excluidos del análisis (sección 3.4). Los eventos que delimitan TPP difieren entre condiciones. En el pretest, el inicio es el instante en que el operador empieza a escribir el pedido en la planilla y el fin, el instante en que termina de actualizar el stock y vuelve a la hoja de registro de pedidos (Ledger). En el postest, el inicio es el envío del primer mensaje del cliente al bot, visible en la grabación unos segundos antes de la primera ejecución de n8n de la ventana (2 s en el escenario 1), y el fin, la llegada al cliente del mensaje de Telegram que confirma el pedido, que el bot envía unos segundos después de que el operador lo confirma en el panel (también 2 s en ese escenario); esa confirmación es la que descuenta el stock (sección 4.4). En los tres escenarios de stock insuficiente, en los que no corresponde descontar stock, el fin es el registro del rechazo: en el pretest, cuando el operador marca el pedido como rechazado en la hoja Ledger; en el postest, cuando el bot informa la cancelación, ya que el pedido queda registrado como CANCELADO sin intervención del operador. En ambas condiciones, el mismo autor simuló al cliente y operó el registro. Las dos ventanas incluyen, por lo tanto, el registro del pedido y el descuento del stock, pero la del postest abarca además dos tramos que la del pretest no cronometra: el tiempo en que el cliente arma el pedido con los botones del bot, antes de que el operador intervenga, y el envío de la confirmación al cliente. La del pretest, en cambio, comienza cuando el operador ya empieza a transcribir el pedido, sin incluir su recepción ni su lectura. Estas diferencias juegan en contra de la condición </w:t>
+      </w:r>
+      <w:r>
         <w:lastRenderedPageBreak/>
-        <w:t xml:space="preserve">postest abarca además dos tramos que la del pretest no cronometra: el tiempo en que el cliente arma el pedido con los botones del bot, antes de que el operador intervenga, y el envío de la confirmación al cliente. La del pretest, en cambio, comienza cuando el operador ya empieza a transcribir el pedido, sin incluir su recepción ni su lectura. Estas diferencias juegan en contra de la condición automatizada, de modo que, en este aspecto, la reducción informada es conservadora; las amenazas que la favorecen se discuten en las secciones 3.9 y 6.2. </w:t>
+        <w:t xml:space="preserve">automatizada, de modo que, en este aspecto, la reducción informada es conservadora; las amenazas que la favorecen se discuten en las secciones 3.9 y 6.2. </w:t>
       </w:r>
     </w:p>
     <w:p>
@@ -6440,7 +6769,6 @@
         <w:ind w:left="676" w:right="841" w:hanging="338"/>
       </w:pPr>
       <w:r>
-        <w:lastRenderedPageBreak/>
         <w:t xml:space="preserve">Pruebas de integración entre los distintos componentes del sistema (API REST, base de datos MySQL, frontend, Telegram y n8n), para verificar que la comunicación entre capas fuera correcta y robusta. </w:t>
       </w:r>
     </w:p>
@@ -6454,6 +6782,7 @@
         <w:ind w:left="676" w:right="841" w:hanging="338"/>
       </w:pPr>
       <w:r>
+        <w:lastRenderedPageBreak/>
         <w:t xml:space="preserve">Grabación de pantalla con el reloj del sistema operativo visible, leído al segundo, como instrumento único de medición del tiempo de procesamiento de pedidos en ambas condiciones (sección 3.5). </w:t>
       </w:r>
     </w:p>
@@ -6589,7 +6918,6 @@
         <w:ind w:left="676" w:right="841" w:hanging="338"/>
       </w:pPr>
       <w:r>
-        <w:lastRenderedPageBreak/>
         <w:t xml:space="preserve">Mensajería: API de Telegram (BotFather), para la creación y gestión del bot de recepción de pedidos. </w:t>
       </w:r>
     </w:p>
@@ -6602,6 +6930,7 @@
       <w:bookmarkStart w:id="53" w:name="sec3_8"/>
       <w:bookmarkEnd w:id="52"/>
       <w:r>
+        <w:lastRenderedPageBreak/>
         <w:t>3.8 Procedimiento de investigación</w:t>
       </w:r>
       <w:bookmarkEnd w:id="53"/>
@@ -6710,21 +7039,12 @@
           <w:ilvl w:val="0"/>
           <w:numId w:val="5"/>
         </w:numPr>
-        <w:spacing w:after="0"/>
+        <w:spacing w:after="304"/>
         <w:ind w:right="846" w:hanging="207"/>
         <w:jc w:val="left"/>
       </w:pPr>
       <w:r>
-        <w:t xml:space="preserve">Etapa 7 – Evaluación del sistema: se midieron las variables operativas definidas en la sección </w:t>
-      </w:r>
-    </w:p>
-    <w:p>
-      <w:pPr>
-        <w:spacing w:after="304"/>
-        <w:ind w:left="-5" w:right="841"/>
-      </w:pPr>
-      <w:r>
-        <w:t xml:space="preserve">3.5, comparando los resultados obtenidos antes y después de la implementación del sistema. </w:t>
+        <w:t xml:space="preserve">Etapa 7 – Evaluación del sistema: se midieron las variables operativas definidas en la sección 3.5, comparando los resultados obtenidos antes y después de la implementación del sistema. </w:t>
       </w:r>
     </w:p>
     <w:p>
@@ -6759,9 +7079,11 @@
         <w:ind w:left="-5" w:right="841"/>
       </w:pPr>
       <w:r>
-        <w:t xml:space="preserve">La confiabilidad se sustenta en la replicabilidad de las pruebas realizadas: los procedimientos de medición están definidos de manera suficientemente precisa como para que otros </w:t>
+        <w:t xml:space="preserve">La confiabilidad se sustenta en la replicabilidad de las pruebas realizadas: los procedimientos de medición están definidos de manera suficientemente precisa como para que otros investigadores puedan reproducirlos en contextos similares. El conjunto de datos crudos que respalda esta afirmación se documenta en el Anexo A. La utilización de métricas objetivas —tiempos de procesamiento leídos de una grabación de pantalla con reloj visible, incidencias de </w:t>
+      </w:r>
+      <w:r>
         <w:lastRenderedPageBreak/>
-        <w:t xml:space="preserve">investigadores puedan reproducirlos en contextos similares. El conjunto de datos crudos que respalda esta afirmación se documenta en el Anexo A. La utilización de métricas objetivas —tiempos de procesamiento leídos de una grabación de pantalla con reloj visible, incidencias de operación registradas escenario por escenario y auditorías de cierre de stock— reduce la posibilidad de sesgos en la recolección de datos. </w:t>
+        <w:t xml:space="preserve">operación registradas escenario por escenario y auditorías de cierre de stock— reduce la posibilidad de sesgos en la recolección de datos. </w:t>
       </w:r>
     </w:p>
     <w:p>
@@ -6804,6 +7126,7 @@
       <w:bookmarkStart w:id="57" w:name="ch4"/>
       <w:bookmarkEnd w:id="56"/>
       <w:r>
+        <w:lastRenderedPageBreak/>
         <w:t>CAPÍTULO 4: Desarrollo del Sistema</w:t>
       </w:r>
       <w:bookmarkEnd w:id="57"/>
@@ -6856,9 +7179,7 @@
         <w:ind w:left="-5" w:right="841"/>
       </w:pPr>
       <w:r>
-        <w:t xml:space="preserve">La capa de automatización, compuesta por los flujos de n8n y el bot de Telegram, opera de manera paralela al frontend tradicional. n8n procesa los pedidos recibidos a través del bot y los </w:t>
-        <w:lastRenderedPageBreak/>
-        <w:t xml:space="preserve">envía a la misma API REST que utiliza el frontend. Esto garantiza la consistencia de los datos y elimina la necesidad de mantener una lógica de negocio duplicada. El diagrama de arquitectura del sistema se presenta a continuación (Figura 4.1) y también se incluye en el Anexo D. </w:t>
+        <w:t xml:space="preserve">La capa de automatización, compuesta por los flujos de n8n y el bot de Telegram, opera de manera paralela al frontend tradicional. n8n procesa los pedidos recibidos a través del bot y los envía a la misma API REST que utiliza el frontend. Esto garantiza la consistencia de los datos y elimina la necesidad de mantener una lógica de negocio duplicada. El diagrama de arquitectura del sistema se presenta a continuación (Figura 4.1) y también se incluye en el Anexo D. </w:t>
       </w:r>
     </w:p>
     <w:p>
@@ -6945,7 +7266,11 @@
         <w:ind w:left="-5" w:right="841"/>
       </w:pPr>
       <w:r>
-        <w:t xml:space="preserve">El frontend se implementó como una aplicación de página única (SPA) en JavaScript, HTML5 y CSS3, servida como contenido estático por el propio backend de Spring Boot. La interfaz se organiza en módulos funcionales independientes: autenticación (login), pantalla de inicio, gestión de productos, gestión de pedidos y control de stock. Cada módulo está compuesto por una vista HTML y un script JavaScript que consume la API REST mediante llamadas HTTP asíncronas (fetch) y renderiza dinámicamente la información recibida. El módulo de autenticación se implementó mediante JSON Web Tokens (JWT). Al iniciar sesión, el backend emite un token firmado que se almacena en una cookie con el atributo HttpOnly —inaccesible desde JavaScript, para mitigar ataques de tipo XSS— y que expira tras una hora de inactividad, renovándose automáticamente con cada solicitud autenticada (expiración deslizante). Un filtro de seguridad (Spring Security) exige una sesión válida para acceder a cualquier pantalla del panel de administración o a sus endpoints de gestión. Este filtro redirige al usuario no autenticado a la pantalla de inicio de sesión, tanto si intenta acceder directamente por URL como si su sesión expiró por inactividad. Los endpoints que consume la integración con Telegram y la consulta pública del catálogo usan mecanismos de autenticación distintos, detallados en la sección 4.2. Esta organización modular responde al objetivo específico OE3 (sección 1.5) y facilita que cada operador del comercio acceda únicamente a las funcionalidades relevantes para su tarea, manteniendo la separación de responsabilidades descripta en la sección 2.3. Las Figuras 4.1.1a a 4.1.1c muestran las pantallas de inicio de sesión, el panel de control y la gestión de productos; el resto de las capturas de la SPA y del bot se incluye en el Anexo E. </w:t>
+        <w:t xml:space="preserve">El frontend se implementó como una aplicación de página única (SPA) en JavaScript, HTML5 y CSS3, servida como contenido estático por el propio backend de Spring Boot. La interfaz se organiza en módulos funcionales independientes: autenticación (login), pantalla de inicio, gestión de productos, gestión de pedidos y control de stock. Cada módulo está compuesto por una vista HTML y un script JavaScript que consume la API REST mediante llamadas HTTP asíncronas (fetch) y renderiza dinámicamente la información recibida. El módulo de autenticación se implementó mediante JSON Web Tokens (JWT). Al iniciar sesión, el backend emite un token firmado que se almacena en una cookie con el atributo HttpOnly —inaccesible </w:t>
+      </w:r>
+      <w:r>
+        <w:lastRenderedPageBreak/>
+        <w:t xml:space="preserve">desde JavaScript, para mitigar ataques de tipo XSS— y que expira tras una hora de inactividad, renovándose automáticamente con cada solicitud autenticada (expiración deslizante). Un filtro de seguridad (Spring Security) exige una sesión válida para acceder a cualquier pantalla del panel de administración o a sus endpoints de gestión. Este filtro redirige al usuario no autenticado a la pantalla de inicio de sesión, tanto si intenta acceder directamente por URL como si su sesión expiró por inactividad. Los endpoints que consume la integración con Telegram y la consulta pública del catálogo usan mecanismos de autenticación distintos, detallados en la sección 4.2. Esta organización modular responde al objetivo específico OE3 (sección 1.5) y facilita que cada operador del comercio acceda únicamente a las funcionalidades relevantes para su tarea, manteniendo la separación de responsabilidades descripta en la sección 2.3. Las Figuras 4.1.1a a 4.1.1c muestran las pantallas de inicio de sesión, el panel de control y la gestión de productos; el resto de las capturas de la SPA y del bot se incluye en el Anexo E. </w:t>
       </w:r>
     </w:p>
     <w:p>
@@ -6957,7 +7282,6 @@
         <w:rPr>
           <w:noProof/>
         </w:rPr>
-        <w:lastRenderedPageBreak/>
         <w:drawing>
           <wp:inline distT="0" distB="0" distL="0" distR="0" wp14:anchorId="5DCCE636" wp14:editId="18A8854E">
             <wp:extent cx="5000000" cy="3515625"/>
@@ -7014,6 +7338,7 @@
         <w:rPr>
           <w:noProof/>
         </w:rPr>
+        <w:lastRenderedPageBreak/>
         <w:drawing>
           <wp:inline distT="0" distB="0" distL="0" distR="0" wp14:anchorId="140EB317" wp14:editId="12F94436">
             <wp:extent cx="5000000" cy="3515625"/>
@@ -7070,7 +7395,6 @@
         <w:rPr>
           <w:noProof/>
         </w:rPr>
-        <w:lastRenderedPageBreak/>
         <w:drawing>
           <wp:inline distT="0" distB="0" distL="0" distR="0" wp14:anchorId="7FBA90B3" wp14:editId="334E0F00">
             <wp:extent cx="5000000" cy="3515625"/>
@@ -7127,6 +7451,7 @@
       <w:bookmarkStart w:id="63" w:name="sec4_2"/>
       <w:bookmarkEnd w:id="62"/>
       <w:r>
+        <w:lastRenderedPageBreak/>
         <w:t>4.2 Diseño de la API</w:t>
       </w:r>
       <w:bookmarkEnd w:id="63"/>
@@ -7153,9 +7478,7 @@
         </w:rPr>
       </w:pPr>
       <w:r>
-        <w:t xml:space="preserve">Se definieron endpoints específicos para la gestión de las principales entidades del sistema: productos, categorías, pedidos (junto con sus ítems) y usuarios, que representan a los clientes del comercio. Para cada entidad, la API expone las operaciones de creación (POST), consulta individual y colectiva (GET), actualización (PUT) y eliminación física (DELETE), siguiendo las convenciones semánticas del protocolo HTTP. El flujo de toma de pedidos se expone además mediante endpoints específicos de carrito (POST /carrito/{chatId}/item, POST /carrito/{chatId}/confirmar) para su integración con el bot de Telegram (sección 4.4). Este conjunto de operaciones cubre los requerimientos funcionales identificados durante el relevamiento inicial. El esquema de autenticación no es uniforme para toda la API. Las pantallas y endpoints de gestión del panel de administración (creación, edición y eliminación de productos, categorías y pedidos, consulta de pedidos y el CRUD completo de usuarios) exigen el JWT de sesión descripto en la sección 4.1.1. Los endpoints que consume la integración con el bot de Telegram vía n8n (POST /carrito/{chatId}/item, POST /carrito/{chatId}/confirmar, POST /pedidos/webhook), en cambio, se autentican con una clave compartida enviada en el encabezado X-N8N-Api-Key, ya que esas llamadas no provienen de un administrador logueado. La clave solo se valida en esas rutas y no otorga acceso a ningún otro endpoint: fuera de ellas, </w:t>
-        <w:lastRenderedPageBreak/>
-        <w:t xml:space="preserve">el filtro no autentica la petición, que queda sujeta a la exigencia de JWT. Las consultas de solo lectura del catálogo (GET /productos y GET /categorias, con sus variantes), por último, son de acceso público y sin autenticación, para que el bot pueda armar los menús sin necesidad de credenciales. </w:t>
+        <w:t xml:space="preserve">Se definieron endpoints específicos para la gestión de las principales entidades del sistema: productos, categorías, pedidos (junto con sus ítems) y usuarios, que representan a los clientes del comercio. Para cada entidad, la API expone las operaciones de creación (POST), consulta individual y colectiva (GET), actualización (PUT) y eliminación física (DELETE), siguiendo las convenciones semánticas del protocolo HTTP. El flujo de toma de pedidos se expone además mediante endpoints específicos de carrito (POST /carrito/{chatId}/item, POST /carrito/{chatId}/confirmar) para su integración con el bot de Telegram (sección 4.4). Este conjunto de operaciones cubre los requerimientos funcionales identificados durante el relevamiento inicial. El esquema de autenticación no es uniforme para toda la API. Las pantallas y endpoints de gestión del panel de administración (creación, edición y eliminación de productos, categorías y pedidos, consulta de pedidos y el CRUD completo de usuarios) exigen el JWT de sesión descripto en la sección 4.1.1. Los endpoints que consume la integración con el bot de Telegram vía n8n (POST /carrito/{chatId}/item, POST /carrito/{chatId}/confirmar, POST /pedidos/webhook), en cambio, se autentican con una clave compartida enviada en el encabezado X-N8N-Api-Key, ya que esas llamadas no provienen de un administrador logueado. La clave solo se valida en esas rutas y no otorga acceso a ningún otro endpoint: fuera de ellas, el filtro no autentica la petición, que queda sujeta a la exigencia de JWT. Las consultas de solo lectura del catálogo (GET /productos y GET /categorias, con sus variantes), por último, son de acceso público y sin autenticación, para que el bot pueda armar los menús sin necesidad de credenciales. </w:t>
       </w:r>
     </w:p>
     <w:p>
@@ -7199,6 +7522,7 @@
         <w:ind w:left="-5" w:right="841"/>
       </w:pPr>
       <w:r>
+        <w:lastRenderedPageBreak/>
         <w:t xml:space="preserve">Cada ítem de pedido almacena, además de la referencia al producto (producto_id), una copia de su nombre y precio al momento de la compra (nombre, precio, subtotal). Esta duplicación es intencional: desacopla el historial de pedidos de cambios posteriores en el catálogo (por ejemplo, una actualización de precio no debe alterar pedidos ya registrados). Es un patrón habitual en sistemas de ventas, conocido como snapshot de línea de pedido, y constituye una excepción deliberada a la normalización estricta. La entidad usuarios está diseñada para representar a los clientes del comercio, con una relación de uno a muchos hacia pedidos (un cliente puede realizar múltiples pedidos, cada pedido pertenece a un único cliente). Esta relación corresponde al diseño planificado del modelo y se encuentra pendiente de implementación al momento de este informe. La entidad usuarios sí dispone de endpoints CRUD propios (sección 4.2): los clientes pueden darse de alta, consultarse, modificarse y eliminarse, pero esos registros todavía no se vinculan con los pedidos. Actualmente, pedidos identifica al cliente únicamente mediante chat_id y el campo de texto libre cliente_nombre, sin clave foránea hacia usuarios, tal como puede verificarse en el diagrama entidad-relación presentado a continuación (Figura 4.2) y en el Anexo D. </w:t>
       </w:r>
     </w:p>
@@ -7208,6 +7532,8 @@
       </w:pPr>
       <w:r>
         <w:t xml:space="preserve">La decisión de utilizar MySQL como sistema gestor responde a su compatibilidad con el estándar SQL y a su integración nativa con Spring Boot a través de JPA (Java Persistence API) e Hibernate. Esto simplifica las operaciones de mapeo objeto-relacional y reduce la cantidad de código repetitivo en la capa de persistencia. </w:t>
+      </w:r>
+      <w:r>
         <w:br w:type="page"/>
       </w:r>
     </w:p>
@@ -7363,6 +7689,8 @@
       </w:pPr>
       <w:r>
         <w:t xml:space="preserve">Uno de los aportes más significativos del sistema desarrollado radica en la integración con plataformas de mensajería instantánea y la utilización de herramientas de automatización para </w:t>
+      </w:r>
+      <w:r>
         <w:lastRenderedPageBreak/>
         <w:t xml:space="preserve">la gestión de flujos de trabajo. Esta integración permite que los usuarios —clientes del comercio— puedan enviar pedidos a través de Telegram sin necesidad de interactuar directamente con la interfaz web del sistema. </w:t>
       </w:r>
@@ -7438,14 +7766,7 @@
         <w:jc w:val="center"/>
       </w:pPr>
       <w:r>
-        <w:t xml:space="preserve">Figura 4.4a. Historial de pedidos recibidos </w:t>
-      </w:r>
-      <w:r>
-        <w:rPr/>
-        <w:t>por</w:t>
-      </w:r>
-      <w:r>
-        <w:t xml:space="preserve"> Telegram en el panel de administración, con filtros de búsqueda (cliente, producto, estado, rango de total y fecha). Datos reales de la re-ejecución del experimento de septiembre de 2026 (sección 3.9), pasada suplementaria del 12/09.</w:t>
+        <w:t>Figura 4.4a. Historial de pedidos recibidos por Telegram en el panel de administración, con filtros de búsqueda (cliente, producto, estado, rango de total y fecha). Datos reales de la re-ejecución del experimento de septiembre de 2026 (sección 3.9), pasada suplementaria del 12/09.</w:t>
       </w:r>
     </w:p>
     <w:p>
@@ -7604,6 +7925,8 @@
       </w:pPr>
       <w:r>
         <w:t xml:space="preserve">Durante el desarrollo se realizaron verificaciones funcionales manuales orientadas a comprobar el comportamiento de los componentes de la API —particularmente la lógica de validación de datos y el manejo de errores en cada endpoint. Estas verificaciones se llevaron a cabo consumiendo la propia API desde el frontend de la aplicación y, en el caso de los endpoints vinculados a la toma de pedidos, mediante interacción directa con el bot de Telegram. En cada caso se observaron las respuestas devueltas y el comportamiento resultante en la base de datos. No se utilizó una herramienta dedicada de prueba de peticiones HTTP (como Postman) ni una especificación OpenAPI. Las pruebas de los endpoints CRUD (productos, categorías, </w:t>
+      </w:r>
+      <w:r>
         <w:lastRenderedPageBreak/>
         <w:t xml:space="preserve">pedidos) se ejecutaron, en cambio, a través de las mismas pantallas de la SPA que los consume en producción: esto permitió verificar el comportamiento end-to-end del sistema tal como lo experimentaría un operador real, aunque no permitió aislar cada endpoint de forma independiente del resto de la interfaz. Las capturas incluidas en el Anexo E documentan estas pruebas sobre la SPA y sobre el bot. Los endpoints de usuarios, que no tienen pantalla en la SPA ni tests automatizados, no se verificaron formalmente; su prueba queda pendiente (sección 7.2). </w:t>
       </w:r>
@@ -7621,7 +7944,11 @@
         <w:ind w:left="-5" w:right="841"/>
       </w:pPr>
       <w:r>
-        <w:t xml:space="preserve">Adicionalmente, se ejecutaron manualmente escenarios de extremo a extremo que simulan casos reales de uso: la recepción de un pedido a través de Telegram, su procesamiento automático por n8n, el registro correspondiente en la base de datos y la actualización del stock disponible. Estos escenarios cubrieron casos de éxito con uno y con varios productos, el límite de cantidad máxima por interacción (10 unidades) y el caso de error alcanzable desde el bot: el stock insuficiente, que deja el pedido registrado como CANCELADO. Como el cliente interactúa solo mediante botones y no escribe texto libre en ningún paso (secciones 2.5 y 4.4), el bot no puede producir pedidos con un producto inexistente ni con una cantidad fuera de rango. El carrito vacío, en cambio, puede alcanzarse desde el bot, aunque no por el flujo normal: el botón de confirmación solo se ofrece después de agregar un producto y finalizar vacía el carrito sin confirmar un pedido (Anexo E), pero los botones de mensajes anteriores siguen activos en Telegram, de modo que el cliente puede pulsar una confirmación previa con el carrito ya vacío. En ese caso la API responde con un error HTTP 400 y el bot informa que el pedido no puede confirmarse porque el carrito está vacío, comportamiento que se comprobó desde el bot. La verificación exploratoria de este caso, previa al experimento, había expuesto una excepción no controlada en el backend, corregida el 11/08/2026 (sección 4.6), y la suite automatizada descripta en el párrafo anterior cubre hoy su regresión. Los casos que dependen directamente de la API —cantidad fuera de rango (1 a 10 unidades) y confirmación repetida del mismo pedido— se verificaron invocando directamente los endpoints, mediante esa misma suite. Estos mismos escenarios constituyen la base para los escenarios de prueba estandarizados del experimento controlado descripto en la sección 3.4 y documentados en el Anexo A. </w:t>
+        <w:t xml:space="preserve">Adicionalmente, se ejecutaron manualmente escenarios de extremo a extremo que simulan casos reales de uso: la recepción de un pedido a través de Telegram, su procesamiento automático por n8n, el registro correspondiente en la base de datos y la actualización del stock disponible. Estos escenarios cubrieron casos de éxito con uno y con varios productos, el límite de cantidad máxima por interacción (10 unidades) y el caso de error alcanzable desde el bot: el stock insuficiente, que deja el pedido registrado como CANCELADO. Como el cliente interactúa solo mediante botones y no escribe texto libre en ningún paso (secciones 2.5 y 4.4), el bot no puede producir pedidos con un producto inexistente ni con una cantidad fuera de rango. El carrito vacío, en cambio, puede alcanzarse desde el bot, aunque no por el flujo normal: el botón de confirmación solo se ofrece después de agregar un producto y finalizar vacía el carrito sin confirmar un pedido (Anexo E), pero los botones de mensajes anteriores siguen activos en Telegram, de modo que el cliente puede pulsar una confirmación previa con el carrito ya vacío. En ese caso la API responde con un error HTTP 400 y el bot informa que el pedido no puede confirmarse porque el carrito está vacío, comportamiento que se comprobó desde el bot. La verificación exploratoria de este caso, previa al experimento, había expuesto una excepción no controlada en el backend, corregida el 11/08/2026 (sección 4.6), y la suite automatizada descripta en el párrafo anterior cubre hoy su regresión. Los casos que dependen directamente de la API —cantidad fuera de rango (1 a 10 unidades) y confirmación repetida del mismo pedido— se verificaron invocando directamente los endpoints, mediante esa misma suite. </w:t>
+      </w:r>
+      <w:r>
+        <w:lastRenderedPageBreak/>
+        <w:t xml:space="preserve">Estos mismos escenarios constituyen la base para los escenarios de prueba estandarizados del experimento controlado descripto en la sección 3.4 y documentados en el Anexo A. </w:t>
       </w:r>
     </w:p>
     <w:p>
@@ -7641,15 +7968,42 @@
       <w:bookmarkStart w:id="71" w:name="sec4_6"/>
       <w:bookmarkEnd w:id="70"/>
       <w:r>
+        <w:t>4.6 Evolución del artefacto durante y después del experimento</w:t>
+      </w:r>
+      <w:bookmarkEnd w:id="71"/>
+      <w:r>
+        <w:rPr>
+          <w:color w:val="2E74B5"/>
+        </w:rPr>
+        <w:t xml:space="preserve"> </w:t>
+      </w:r>
+    </w:p>
+    <w:p>
+      <w:pPr>
+        <w:ind w:left="-5" w:right="841"/>
+      </w:pPr>
+      <w:r>
+        <w:t xml:space="preserve">Esta sección reúne las modificaciones que recibió el artefacto en torno al experimento descripto en el Capítulo 5, en orden cronológico y con el commit del repositorio que respalda cada una (Anexo F). Se trata de trabajo ya realizado; lo que queda pendiente se detalla en la sección 7.2. La suite de pruebas automatizadas que protege estos cambios se describe en la sección 4.5. Los resultados del Capítulo 5 se obtuvieron sobre un árbol de trabajo local que no estaba commiteado durante la corrida del 10 y el 12/09/2026. Ese árbol se consolidó después en el commit 97ce027 (13/09/2026), que incluye también la corrección de concurrencia en la confirmación de pedidos (PedidoService y PedidoRepository). Como no se conserva registro de si esa corrección ya estaba aplicada durante la corrida cronometrada (hoja Metadatos_corrida del Anexo A; sección 6.2), no puede afirmarse que el código de la corrida coincida exactamente con el de ese commit. Los commits posteriores (95af526, 4c57af8 y 15625b8) modifican los tipos numéricos y de fecha, el filtro del historial de pedidos, la configuración de despliegue y la seguridad, y no alteran la secuencia de carrito, confirmación y notificación que se midió; el cálculo de subtotal y total pasó a BigDecimal sin cambiar su resultado. </w:t>
+      </w:r>
+    </w:p>
+    <w:p>
+      <w:pPr>
+        <w:ind w:left="-5" w:right="841"/>
+      </w:pPr>
+      <w:r>
+        <w:t xml:space="preserve">El 11/08/2026, con anterioridad a la corrida del 10 y el 12/09/2026, se resolvieron dos tareas técnicas puntuales: la corrección de la excepción no controlada que exponía el escenario de carrito vacío, y la incorporación de una validación de cantidad máxima del lado del servidor. Esta última cantidad estaba antes impuesta únicamente por la construcción de los botones en n8n (sección 4.4). Para el primer caso, se agregó manejo explícito de la excepción (respuesta HTTP 400 con mensaje descriptivo; commit 1d95abf del repositorio, Anexo F). Para el segundo, una validación de rango (1 a 10 unidades) en el endpoint POST /carrito/{chatId}/item (commit 237ed83 del repositorio, Anexo F). </w:t>
+      </w:r>
+    </w:p>
+    <w:p>
+      <w:pPr>
+        <w:ind w:left="-5" w:right="841"/>
+      </w:pPr>
+      <w:r>
+        <w:t xml:space="preserve">Durante la re-ejecución del experimento y en la revisión de código posterior se identificaron dos observaciones sobre el flujo de carrito y confirmación de pedidos, que se investigaron y resolvieron. La primera era una condición de carrera en la confirmación de pedidos: la comprobación en memoria del estado antes de descontar stock permitía que dos confirmaciones casi simultáneas del mismo pedido (por ejemplo, un doble clic) leyeran ambas el estado no confirmado antes de que la primera terminara de escribir, descontando el stock dos veces. Se corrigió reemplazando esa comprobación por una transición atómica a nivel de base de datos: una sentencia UPDATE condicionada a que el estado no sea ya CONFIRMADO, el mismo patrón ya usado para el descuento de stock. La corrección se validó con diez </w:t>
+      </w:r>
+      <w:r>
         <w:lastRenderedPageBreak/>
-        <w:t>4.6 Evolución del artefacto durante y después del experimento</w:t>
-      </w:r>
-      <w:bookmarkEnd w:id="71"/>
-      <w:r>
-        <w:rPr>
-          <w:color w:val="2E74B5"/>
-        </w:rPr>
-        <w:t xml:space="preserve"> </w:t>
+        <w:t xml:space="preserve">confirmaciones simultáneas reales sobre el mismo pedido y con el test de regresión confirmarEstadoDosVecesNoDescuentaStockDosVeces (sección 4.5), y quedó consolidada en el commit 97ce027 del repositorio (Anexo F); si ya estaba aplicada durante la corrida cronometrada no puede establecerse (sección 6.2). La segunda cuestionaba si la cantidad acumulada de un mismo producto al agregarlo dos veces al carrito debía limitarse al máximo de 10 unidades por interacción impuesto por el menú de botones de Telegram (sección 4.4). Se determinó que ese límite es exclusivo de la interfaz de botones y no una regla de negocio, por lo que la cantidad acumulada puede superar las 10 unidades sin inconveniente, siempre que la disponibilidad se valide contra el stock real al confirmar el pedido. Este comportamiento ya lo implementaba correctamente el sistema, y quedó cubierto con dos tests de regresión adicionales (sección 4.5). </w:t>
       </w:r>
     </w:p>
     <w:p>
@@ -7657,7 +8011,7 @@
         <w:ind w:left="-5" w:right="841"/>
       </w:pPr>
       <w:r>
-        <w:t xml:space="preserve">Esta sección reúne las modificaciones que recibió el artefacto en torno al experimento descripto en el Capítulo 5, en orden cronológico y con el commit del repositorio que respalda cada una (Anexo F). Se trata de trabajo ya realizado; lo que queda pendiente se detalla en la sección 7.2. La suite de pruebas automatizadas que protege estos cambios se describe en la sección 4.5. Los resultados del Capítulo 5 se obtuvieron sobre un árbol de trabajo local que no estaba commiteado durante la corrida del 10 y el 12/09/2026. Ese árbol se consolidó después en el commit 97ce027 (13/09/2026), que incluye también la corrección de concurrencia en la confirmación de pedidos (PedidoService y PedidoRepository). Como no se conserva registro de si esa corrección ya estaba aplicada durante la corrida cronometrada (hoja Metadatos_corrida del Anexo A; sección 6.2), no puede afirmarse que el código de la corrida coincida exactamente con el de ese commit. Los commits posteriores (95af526, 4c57af8 y 15625b8) modifican los tipos numéricos y de fecha, el filtro del historial de pedidos, la configuración de despliegue y la seguridad, y no alteran la secuencia de carrito, confirmación y notificación que se midió; el cálculo de subtotal y total pasó a BigDecimal sin cambiar su resultado. </w:t>
+        <w:t xml:space="preserve">También se identificó, como riesgo de seguridad, que la configuración de desarrollo versionaba credenciales sensibles: un usuario de MySQL sin contraseña y valores por defecto para el secreto de firma JWT y la clave compartida de la integración con n8n. Estos valores permitían levantar el sistema sin definir ningún secreto real. Se separó la configuración en un perfil "dev" —activo por defecto, sin cambios en el flujo de trabajo local ni en la suite de pruebas— con esos valores de conveniencia. El archivo de configuración base, en cambio, no tiene valores por defecto para las credenciales de base de datos, el secreto JWT y la clave de n8n: cualquier otro perfil de despliegue debe definirlas por variable de entorno, o el arranque falla con un error explícito (commit 97ce027 del repositorio, Anexo F). Se agregó también la posibilidad de marcar la cookie de sesión JWT como Secure (solo HTTPS) mediante una variable de entorno, deshabilitada por defecto para no romper el desarrollo local sobre HTTP. Se agregó, por último, un perfil “prod” (application-prod.properties) que sobrescribe spring.jpa.hibernate.ddl-auto de “update” a “validate”. El valor “update” era conveniente mientras el modelo de datos todavía cambiaba en desarrollo. Con “validate”, en un despliegue real, Hibernate compara el esquema existente contra las entidades y falla el arranque si no coinciden, en lugar de crear o alterar tablas automáticamente (commit 4c57af8 del repositorio, Anexo F). En una revisión posterior se cerraron dos observaciones de seguridad que quedaban abiertas. Se quitó el origen abierto (@CrossOrigin con origen “*”) de los controladores de pedidos y de carrito, dado que el frontend se sirve desde el propio backend y n8n llama a la API de servidor a servidor. Además, server.error.include-message quedó en “never” en el archivo base, de modo que solo el perfil “dev” expone el mensaje de las excepciones no controladas (commit 15625b8 del repositorio, Anexo F). La protección contra CSRF sigue deshabilitada, como se declara en el Anexo F. </w:t>
       </w:r>
     </w:p>
     <w:p>
@@ -7665,33 +8019,11 @@
         <w:ind w:left="-5" w:right="841"/>
       </w:pPr>
       <w:r>
-        <w:t xml:space="preserve">El 11/08/2026, con anterioridad a la corrida del 10 y el 12/09/2026, se resolvieron dos tareas técnicas puntuales: la corrección de la excepción no controlada que exponía el escenario de carrito vacío, y la incorporación de una validación de cantidad máxima del lado del servidor. Esta última cantidad estaba antes impuesta únicamente por la construcción de los botones en n8n (sección 4.4). Para el primer caso, se agregó manejo explícito de la excepción (respuesta HTTP 400 con mensaje descriptivo; commit 1d95abf del repositorio, Anexo F). Para el segundo, una validación de rango (1 a 10 unidades) en el endpoint POST /carrito/{chatId}/item (commit 237ed83 del repositorio, Anexo F). </w:t>
-      </w:r>
-    </w:p>
-    <w:p>
-      <w:pPr>
-        <w:ind w:left="-5" w:right="841"/>
-      </w:pPr>
-      <w:r>
-        <w:t xml:space="preserve">Durante la re-ejecución del experimento y en la revisión de código posterior se identificaron dos observaciones sobre el flujo de carrito y confirmación de pedidos, que se investigaron y resolvieron. La primera era una condición de carrera en la confirmación de pedidos: la comprobación en memoria del estado antes de descontar stock permitía que dos confirmaciones casi simultáneas del mismo pedido (por ejemplo, un doble clic) leyeran ambas el estado no confirmado antes de que la primera terminara de escribir, descontando el stock dos veces. Se corrigió reemplazando esa comprobación por una transición atómica a nivel de base de datos: una sentencia UPDATE condicionada a que el estado no sea ya CONFIRMADO, el mismo patrón ya usado para el descuento de stock. La corrección se validó con diez confirmaciones simultáneas reales sobre el mismo pedido y con el test de regresión confirmarEstadoDosVecesNoDescuentaStockDosVeces (sección 4.5), y quedó consolidada en el commit 97ce027 del repositorio (Anexo F); si ya estaba aplicada durante la corrida cronometrada no puede establecerse (sección 6.2). La segunda cuestionaba si la cantidad acumulada de un mismo producto al agregarlo dos veces al carrito debía limitarse al máximo de 10 unidades por interacción impuesto por el menú de botones de Telegram (sección 4.4). Se determinó que ese límite es exclusivo de la interfaz de botones y no una regla de negocio, por lo que la cantidad acumulada puede superar las 10 unidades sin inconveniente, siempre que la disponibilidad se valide contra el stock real al confirmar el pedido. Este comportamiento ya lo </w:t>
+        <w:t xml:space="preserve">Además, se migraron los tipos de datos que el modelo declaraba como Double (precio, subtotal y total), String (fecha y hora del pedido) y long (teléfono). Precio, subtotal y total pasaron a BigDecimal (DECIMAL(10,2) en la base de datos), la fecha y hora del pedido a LocalDateTime (DATETIME) y el teléfono a String (VARCHAR), tanto en las entidades JPA como en el esquema documentado (docs/analisis/schema.sql). La consulta del historial de pedidos, que filtraba por fecha comparando cadenas, se reescribió como un rango de día [00:00, 24:00) y quedó cubierta por un test propio (sección 4.5; commit 95af526 del repositorio, Anexo F). Además, Usuario.telefono se anotó con longitud 20 y sin valores nulos, de modo que el esquema que </w:t>
+      </w:r>
+      <w:r>
         <w:lastRenderedPageBreak/>
-        <w:t xml:space="preserve">implementaba correctamente el sistema, y quedó cubierto con dos tests de regresión adicionales (sección 4.5). </w:t>
-      </w:r>
-    </w:p>
-    <w:p>
-      <w:pPr>
-        <w:ind w:left="-5" w:right="841"/>
-      </w:pPr>
-      <w:r>
-        <w:t xml:space="preserve">También se identificó, como riesgo de seguridad, que la configuración de desarrollo versionaba credenciales sensibles: un usuario de MySQL sin contraseña y valores por defecto para el secreto de firma JWT y la clave compartida de la integración con n8n. Estos valores permitían levantar el sistema sin definir ningún secreto real. Se separó la configuración en un perfil "dev" —activo por defecto, sin cambios en el flujo de trabajo local ni en la suite de pruebas— con esos valores de conveniencia. El archivo de configuración base, en cambio, no tiene valores por defecto para las credenciales de base de datos, el secreto JWT y la clave de n8n: cualquier otro perfil de despliegue debe definirlas por variable de entorno, o el arranque falla con un error explícito (commit 97ce027 del repositorio, Anexo F). Se agregó también la posibilidad de marcar la cookie de sesión JWT como Secure (solo HTTPS) mediante una variable de entorno, deshabilitada por defecto para no romper el desarrollo local sobre HTTP. Se agregó, por último, un perfil “prod” (application-prod.properties) que sobrescribe spring.jpa.hibernate.ddl-auto de “update” a “validate”. El valor “update” era conveniente mientras el modelo de datos todavía cambiaba en desarrollo. Con “validate”, en un despliegue real, Hibernate compara el esquema existente contra las entidades y falla el arranque si no coinciden, en lugar de crear o alterar tablas automáticamente (commit 4c57af8 del repositorio, Anexo F). En una revisión posterior se cerraron dos observaciones de seguridad que quedaban abiertas. Se quitó el origen abierto (@CrossOrigin con origen “*”) de los controladores de pedidos y de carrito, dado que el frontend se sirve desde el propio backend y n8n llama a la API de servidor a servidor. Además, server.error.include-message quedó en “never” en el archivo base, de modo que solo el perfil “dev” expone el mensaje de las excepciones no controladas (commit 15625b8 del repositorio, Anexo F). La protección contra CSRF sigue deshabilitada, como se declara en el Anexo F. </w:t>
-      </w:r>
-    </w:p>
-    <w:p>
-      <w:pPr>
-        <w:ind w:left="-5" w:right="841"/>
-      </w:pPr>
-      <w:r>
-        <w:t xml:space="preserve">Además, se migraron los tipos de datos que el modelo declaraba como Double (precio, subtotal y total), String (fecha y hora del pedido) y long (teléfono). Precio, subtotal y total pasaron a BigDecimal (DECIMAL(10,2) en la base de datos), la fecha y hora del pedido a LocalDateTime (DATETIME) y el teléfono a String (VARCHAR), tanto en las entidades JPA como en el esquema documentado (docs/analisis/schema.sql). La consulta del historial de pedidos, que filtraba por fecha comparando cadenas, se reescribió como un rango de día [00:00, 24:00) y quedó cubierta por un test propio (sección 4.5; commit 95af526 del repositorio, Anexo F). Además, Usuario.telefono se anotó con longitud 20 y sin valores nulos, de modo que el esquema que genera Hibernate coincide con el documentado (commit 15625b8 del repositorio, Anexo F). Las Figuras 4.2 y 4.3 reflejan estos tipos. </w:t>
+        <w:t xml:space="preserve">genera Hibernate coincide con el documentado (commit 15625b8 del repositorio, Anexo F). Las Figuras 4.2 y 4.3 reflejan estos tipos. </w:t>
       </w:r>
     </w:p>
     <w:p>
@@ -8739,9 +9071,11 @@
         <w:ind w:left="-5" w:right="835"/>
       </w:pPr>
       <w:r>
-        <w:t xml:space="preserve">Tabla 5.1. Comparación de resultados entre la condición pretest y postest del experimento controlado (n = 20 escenarios por condición, sección 3.4). El tamaño del efecto de TPP se calculó </w:t>
+        <w:t xml:space="preserve">Tabla 5.1. Comparación de resultados entre la condición pretest y postest del experimento controlado (n = 20 escenarios por condición, sección 3.4). El tamaño del efecto de TPP se calculó a partir de los mismos datos pareados del Anexo A, mediante el estadístico r = |z|/√N asociado a la prueba de Wilcoxon (Rosenthal, 1991) e interpretado según los umbrales convencionales de Cohen (1988). Se informa en valor absoluto porque el signo de z depende de la convención de la diferencia y no cambia la magnitud. El denominador N corresponde a las 40 observaciones totales (pretest + postest), no a los 20 pares evaluados. El valor p informado es el valor exacto de la prueba de Wilcoxon (principal); la aproximación normal (z = −3,79) da un valor p = 0,000149, del mismo orden de magnitud. El intervalo de confianza bootstrap percentil corresponde a la mediana de las diferencias pareadas, no a la diferencia de las medianas de cada condición por separado, que es una cifra distinta (32,00 s vs. 21,50 s = 10,50 s). Se calculó con 10.000 remuestreos y semilla fija (random_state = 42) para garantizar la reproducibilidad; los intervalos de la reducción relativa informados en la sección 5.2 usan el mismo número de </w:t>
+      </w:r>
+      <w:r>
         <w:lastRenderedPageBreak/>
-        <w:t xml:space="preserve">a partir de los mismos datos pareados del Anexo A, mediante el estadístico r = |z|/√N asociado a la prueba de Wilcoxon (Rosenthal, 1991) e interpretado según los umbrales convencionales de Cohen (1988). Se informa en valor absoluto porque el signo de z depende de la convención de la diferencia y no cambia la magnitud. El denominador N corresponde a las 40 observaciones totales (pretest + postest), no a los 20 pares evaluados. El valor p informado es el valor exacto de la prueba de Wilcoxon (principal); la aproximación normal (z = −3,79) da un valor p = 0,000149, del mismo orden de magnitud. El intervalo de confianza bootstrap percentil corresponde a la mediana de las diferencias pareadas, no a la diferencia de las medianas de cada condición por separado, que es una cifra distinta (32,00 s vs. 21,50 s = 10,50 s). Se calculó con 10.000 remuestreos y semilla fija (random_state = 42) para garantizar la reproducibilidad; los intervalos de la reducción relativa informados en la sección 5.2 usan el mismo número de remuestreos y la misma semilla. La mediana observada de las diferencias pareadas fue de 11,50 s. Su cociente sobre la mediana del pretest (35,9%) y la reducción de las medianas de cada condición (32,8%) se informan con su intervalo de confianza en la sección 5.2. Para TED se aplicó la prueba exacta de McNemar (p = 1,000), dado que los errores se registraron en escenarios distintos entre condiciones (2 pares discordantes en cada sentido). No corresponde, por eso, un tamaño de efecto convencional para una tabla 2×2 de baja frecuencia. Para NAS no se calculó un contraste formal. La auditoría del postest se obtuvo en una pasada suplementaria del 12/09/2026, sin volcados exportados y sin registro del estado del código respecto de la corrección de concurrencia (sección 6.2). Las auditorías cubrieron la totalidad de los 17 productos del catálogo por condición y el stock registrado coincidió con el esperado en el 100% de los casos en ambas condiciones, sin variación que contrastar. No se aplicó corrección por comparaciones múltiples entre las tres variables: cada una responde a una pregunta distinta y solo TPP fue objeto de un contraste de hipótesis formal, por lo que dicha corrección no resulta aplicable en este caso. </w:t>
+        <w:t xml:space="preserve">remuestreos y la misma semilla. La mediana observada de las diferencias pareadas fue de 11,50 s. Su cociente sobre la mediana del pretest (35,9%) y la reducción de las medianas de cada condición (32,8%) se informan con su intervalo de confianza en la sección 5.2. Para TED se aplicó la prueba exacta de McNemar (p = 1,000), dado que los errores se registraron en escenarios distintos entre condiciones (2 pares discordantes en cada sentido). No corresponde, por eso, un tamaño de efecto convencional para una tabla 2×2 de baja frecuencia. Para NAS no se calculó un contraste formal. La auditoría del postest se obtuvo en una pasada suplementaria del 12/09/2026, sin volcados exportados y sin registro del estado del código respecto de la corrección de concurrencia (sección 6.2). Las auditorías cubrieron la totalidad de los 17 productos del catálogo por condición y el stock registrado coincidió con el esperado en el 100% de los casos en ambas condiciones, sin variación que contrastar. No se aplicó corrección por comparaciones múltiples entre las tres variables: cada una responde a una pregunta distinta y solo TPP fue objeto de un contraste de hipótesis formal, por lo que dicha corrección no resulta aplicable en este caso. </w:t>
       </w:r>
     </w:p>
     <w:p>
@@ -8933,6 +9267,8 @@
       </w:pPr>
       <w:r>
         <w:t xml:space="preserve">En síntesis: H1 no se confirma en su umbral literal del 50%, pero la reducción observada en TPP es estadísticamente significativa y de tamaño de efecto grande; TED y NAS no muestran diferencia entre condiciones. El hallazgo central de este trabajo es, entonces, una reducción observada, estadísticamente significativa y de tamaño de efecto grande, en el tiempo de </w:t>
+      </w:r>
+      <w:r>
         <w:lastRenderedPageBreak/>
         <w:t xml:space="preserve">procesamiento de pedidos. Con este diseño no puede estimarse qué parte de esa reducción se debe al sistema y qué parte a la práctica del operador (Tabla 6.1; secciones 6.2 y 7.1). Tampoco hay evidencia, en este diseño, de una mejora acompañante en la tasa de errores o en la exactitud del stock. </w:t>
       </w:r>
@@ -8992,6 +9328,8 @@
       </w:pPr>
       <w:r>
         <w:t xml:space="preserve">El resultado de TED —sin diferencia entre condiciones (11,8% en ambas; McNemar exacto, p = 1,000)— contrasta con lo esperado a partir de la misma literatura. Esa literatura atribuye a la automatización una reducción en la tasa de errores humanos (Davenport y Kirby, 2016). La explicación más plausible no es que la automatización sea inefectiva para reducir errores, sino que el diseño experimental, tal como se advirtió en la sección 3.1, no genera una tasa de error de base representativa de un operador real. Uno de los autores del sistema operó ambas condiciones, con pleno conocimiento del catálogo y del procedimiento; por eso, los errores registrados (dos por condición, detallados en el Anexo A) reflejan más bien la variabilidad esperable de una tarea manual repetitiva que una falla estructural de alguna de las dos modalidades. Un operador real, sin ese conocimiento ni ese entrenamiento previo, probablemente presentaría una tasa de error de base distinta —y potencialmente más alta en </w:t>
+      </w:r>
+      <w:r>
         <w:lastRenderedPageBreak/>
         <w:t xml:space="preserve">la modalidad manual— que este diseño no puede estimar. Además, la naturaleza de los errores difiere entre condiciones (de registro en la planilla en el pretest, de selección del operador en el postest; sección 3.5), de modo que la igualdad del 11,8% no compara exactamente la misma magnitud. En consecuencia, TED se reporta sin hipótesis asociada; su contrastación con operadores reales queda como pregunta abierta para la validación de campo (sección 7.2). </w:t>
       </w:r>
@@ -9057,6 +9395,8 @@
       </w:pPr>
       <w:r>
         <w:t xml:space="preserve">Este hallazgo debe distinguirse de la amenaza identificada en la sección 3.9, que es el arrastre entre condiciones: que el postest se beneficie de haber resuelto los mismos veinte escenarios en pasadas anteriores. Una tendencia intra-corrida, plana o marcada, no mide ese arrastre. Los datos disponibles permiten una cota indicativa, no una estimación: el intento de postest descartado del 11/09 (sección 3.9) fue una primera pasada completa del circuito automatizado </w:t>
+      </w:r>
+      <w:r>
         <w:lastRenderedPageBreak/>
         <w:t xml:space="preserve">sobre los mismos escenarios, y sus tiempos fueron mayores que los del postest definitivo (media de 31,20 s frente a 25,60 s; diferencia de 5,60 s; Wilcoxon pareado exacto p = 5,3×10⁻⁴; Tabla 6.1). Esa diferencia, equivalente al 41 % de la reducción global de 13,70 s, es compatible con un efecto de práctica entre pasadas del mismo circuito. También podría deberse a otras causas: carga del servidor, latencia de la conexión u orden de los escenarios (en el intento descartado, los escenarios 15 y 16 se ejecutaron en orden inverso). Por lo tanto, no puede descartarse que una parte relevante de la reducción de 13,70 s entre el pretest y el postest definitivo se deba a la práctica y no al sistema. Contra el intento descartado, la reducción de las medias es del 20,6 % (Wilcoxon exacto p = 8,3×10⁻⁴). El arrastre entre condiciones se mantiene como limitación no estimada con precisión: su estimación completa, con escenarios de calentamiento cronometrados y contrabalanceo del orden, queda como tarea pendiente para una réplica futura del experimento (sección 7.2). </w:t>
       </w:r>
@@ -9594,6 +9934,8 @@
       </w:pPr>
       <w:r>
         <w:t xml:space="preserve">En cuarto lugar, las auditorías de stock (NAS) se realizaron en una única sesión al cierre de cada corrida completa, auditando la totalidad de los 17 productos del catálogo, en lugar de en puntos de control distribuidos a lo largo de la ejecución. Esto es consistente con la definición de NAS de la sección 3.5, pero no permite observar cómo evoluciona la desactualización del stock durante la corrida, solo su estado final. En el postest, además, la auditoría no se hizo al cierre </w:t>
+      </w:r>
+      <w:r>
         <w:lastRenderedPageBreak/>
         <w:t>de la corrida cronometrada: un reinicio accidental de la base de datos, antes de exportar el estado final, impidió conservar los datos de inventario de esa corrida. La auditoría se realizó entonces en una pasada suplementaria, el 12/09/2026, posterior a la corrida cronometrada, sobre los mismos 20 escenarios y sin video ni cronometraje. El defecto de doble descuento de stock ante confirmaciones duplicadas casi simultáneas se detectó en la pasada descartada del 11/09/2026 (sección 3.9) y su corrección se consolidó en el commit 97ce027 (13/09/2026). No se conserva un registro que permita establecer si esa corrección ya estaba aplicada durante la corrida cronometrada del 12/09 o se aplicó después: el árbol de trabajo de esa corrida no estaba commiteado (hoja Metadatos_corrida del Anexo A), por lo que tampoco puede afirmarse que coincida exactamente con el commit 97ce027 (sección 4.6). En consecuencia, no puede afirmarse que la corrida cronometrada y la pasada suplementaria se ejecutaron sobre el mismo código, y el 100% informado en la Tabla 5.1 debe leerse con esa salvedad. El defecto afectaba al descuento de stock ante confirmaciones duplicadas casi simultáneas, no a la recepción del pedido por el bot. Tampoco se exportaron volcados de stock de esa pasada, por lo que la fila NAS del postest no tiene respaldo exportable, a diferencia del pretest, cuyo registro completo se conserva (ledger y volcados de stock). Ambas circunstancias se declaran como limitaciones de esa fila.</w:t>
       </w:r>
@@ -9619,6 +9961,7 @@
         <w:ind w:left="-5" w:right="841"/>
       </w:pPr>
       <w:r>
+        <w:lastRenderedPageBreak/>
         <w:t xml:space="preserve">Por último, el caso de carrito vacío se excluyó del análisis cuantitativo por no tener un equivalente válido en la modalidad manual. Cómo se alcanza desde el bot y cómo se verificó se describe en la sección 4.5. </w:t>
       </w:r>
     </w:p>
@@ -9709,6 +10052,8 @@
       </w:pPr>
       <w:r>
         <w:t xml:space="preserve">Respecto de la hipótesis de trabajo, H1 no se confirma en su umbral literal de una reducción de al menos el 50% del TPP: el valor observado fue del 34,9% sobre las medias y del 35,9% para la mediana de las diferencias pareadas respecto de la mediana del pretest (IC95% [25,8%; 44,4%], que excluye el umbral). Con la variante que incluye el intento abortado del escenario 14, la reducción de las medias baja al 22,4–23,9% y el intervalo de la reducción relativa sigue excluyendo el umbral (sección 6.2). La reducción es, no obstante, estadísticamente significativa (p = 9,54×10⁻⁶) y de tamaño de efecto grande (r = 0,60; Cohen, 1988), y se sostiene bajo un instrumento de medición único y consistente entre condiciones (sección 3.5). TED y NAS, sin hipótesis asociada, no mostraron diferencia entre condiciones. Esto se debe a limitaciones del diseño: la condición pretest, operada por uno de los autores del sistema, no logró generar una tasa de error de base representativa de un operador real, y el experimento, al no contar con un inventario físico independiente del registro, no podía generar desactualización de stock. Estos resultados, por lo tanto, no deben interpretarse como evidencia de que la automatización no </w:t>
+      </w:r>
+      <w:r>
         <w:lastRenderedPageBreak/>
         <w:t xml:space="preserve">mejora esos aspectos, sino como una limitación de este diseño experimental. Su contrastación con operadores reales queda planteada como línea de trabajo futuro (sección 7.2). </w:t>
       </w:r>
@@ -9765,8 +10110,12 @@
       </w:pPr>
       <w:r>
         <w:t xml:space="preserve"> </w:t>
+      </w:r>
+      <w:r>
         <w:tab/>
         <w:t xml:space="preserve"> </w:t>
+      </w:r>
+      <w:r>
         <w:br w:type="page"/>
       </w:r>
     </w:p>
@@ -10169,6 +10518,12 @@
           <w:lang w:val="en-US"/>
         </w:rPr>
         <w:t xml:space="preserve">Cogent </w:t>
+      </w:r>
+      <w:r>
+        <w:rPr>
+          <w:i/>
+          <w:lang w:val="en-US"/>
+        </w:rPr>
         <w:lastRenderedPageBreak/>
         <w:t>Business &amp; Management, 13</w:t>
       </w:r>
@@ -10769,8 +11124,12 @@
       </w:pPr>
       <w:r>
         <w:t xml:space="preserve"> </w:t>
+      </w:r>
+      <w:r>
         <w:tab/>
         <w:t xml:space="preserve"> </w:t>
+      </w:r>
+      <w:r>
         <w:br w:type="page"/>
       </w:r>
     </w:p>
@@ -16498,7 +16857,11 @@
       </w:pPr>
       <w:r>
         <w:fldChar w:fldCharType="begin"/>
+      </w:r>
+      <w:r>
         <w:instrText>HYPERLINK "https://docs.google.com/spreadsheets/d/1YY23zZMBffX5gjKMN9Uy8w6rJ9jDVK1q/edit?usp=drive_link&amp;ouid=114634369866028785057&amp;rtpof=true&amp;sd=true"</w:instrText>
+      </w:r>
+      <w:r>
         <w:fldChar w:fldCharType="separate"/>
       </w:r>
       <w:r>
@@ -16544,6 +16907,8 @@
       </w:pPr>
       <w:r>
         <w:t xml:space="preserve">Los estadísticos reportados en la sección 5.1 —medias, desvíos estándar, prueba de Shapiro-Wilk, prueba de Wilcoxon, tamaño del efecto r y el intervalo de confianza bootstrap para la mediana de las diferencias pareadas de TPP, junto con el de la reducción relativa (sección 5.2)— se calcularon a partir de los datos crudos del Anexo A. Para ello se utilizó la biblioteca SciPy de Python. El script reproducible (docs/analisis/compute_stats.py) y la salida real de su ejecución (docs/analisis/salida_compute_stats.txt) se incluyen en el repositorio de código (Anexo F), de modo que los valores informados pueden recalcularse directamente sobre el Anexo A sin depender de una reconstrucción manual. El esquema de la base de datos (DDL), generado a partir de las seis entidades JPA descriptas en la sección 4.3, se documenta en docs/analisis/schema.sql dentro del mismo repositorio. El análisis exploratorio del efecto de práctica residual discutido en la sección 6.2 se calculó de la misma manera, a partir de los </w:t>
+      </w:r>
+      <w:r>
         <w:lastRenderedPageBreak/>
         <w:t>horarios crudos de las hojas Pretest y Postest del Anexo A, con el script docs/analisis/compute_practica_residual.py —que incluye una variante de sensibilidad sin el escenario 8— y su salida real docs/analisis/salida_compute_practica_residual.txt, incluidos también en el repositorio de código (Anexo F). El script compute_stats.py incluye además la estimación por intervalo de la reducción relativa (sección 5.2; bootstrap percentil pareado con 10.000 remuestreos y semilla fija 42, los mismos del intervalo de la mediana de las diferencias) y el análisis de sensibilidad del escenario 14 (sección 6.2), y el cruce del registro de n8n contra las ventanas del postest se realizó con docs/analisis/cruzar_log_n8n.py (Anexo A). La comparación con la pasada descartada del 11/09 (Tabla 6.1) se calculó con docs/analisis/compute_intento_descartado.py, a partir de la planilla archivada en docs/analisis/rerun/intento1_postest_bug_confirmacion_doble/, y su salida real, docs/analisis/salida_compute_intento_descartado.txt, se incluye en el mismo repositorio.</w:t>
       </w:r>
@@ -16665,6 +17030,8 @@
       </w:pPr>
       <w:r>
         <w:t xml:space="preserve">Diagrama de arquitectura del sistema, diagrama entidad-relación de la base de datos, diagrama de clases UML, diagrama de secuencia del flujo completo de pedidos y diagrama de proceso por carriles del flujo de toma de pedidos. Los cinco diagramas se presentan también en el cuerpo del informe (Figura 4.1, sección 4.1; Figuras 4.2 y 4.3, sección 4.3; Figuras 4.4b y 4.4c, sección 4.4). El diagrama entidad-relación y el diagrama de clases corresponden a las seis </w:t>
+      </w:r>
+      <w:r>
         <w:lastRenderedPageBreak/>
         <w:t xml:space="preserve">entidades descriptas en la sección 4.3 (productos, categorías, pedidos, items_pedido, usuarios, administradores) y declaran los tipos de datos vigentes en las entidades JPA: BigDecimal/DECIMAL(10,2) para precios y totales, LocalDateTime/DATETIME para la fecha y hora del pedido, y String/VARCHAR para el teléfono. Cada uno confirma, desde su notación, que la relación entre usuarios y pedidos, planificada en el diseño, no se encuentra implementada al momento de este informe. </w:t>
       </w:r>
@@ -16748,10 +17115,10 @@
         <w:pStyle w:val="Ttulo3"/>
         <w:ind w:left="-5"/>
       </w:pPr>
-      <w:bookmarkStart w:id="104" w:name="_Anexo_F._Repositorio"/>
-      <w:bookmarkStart w:id="900" w:name="anxF"/>
-      <w:bookmarkEnd w:id="900"/>
+      <w:bookmarkStart w:id="104" w:name="anxF"/>
+      <w:bookmarkStart w:id="105" w:name="_Anexo_F._Repositorio"/>
       <w:bookmarkEnd w:id="104"/>
+      <w:bookmarkEnd w:id="105"/>
       <w:r>
         <w:t>Anexo F. Repositorio de código fuente</w:t>
       </w:r>
@@ -16804,13 +17171,13 @@
         <w:pStyle w:val="Ttulo3"/>
         <w:ind w:left="-5"/>
       </w:pPr>
-      <w:bookmarkStart w:id="105" w:name="_Nota_sobre_herramientas"/>
-      <w:bookmarkStart w:id="106" w:name="anxNota"/>
-      <w:bookmarkEnd w:id="105"/>
+      <w:bookmarkStart w:id="106" w:name="_Nota_sobre_herramientas"/>
+      <w:bookmarkStart w:id="107" w:name="anxNota"/>
+      <w:bookmarkEnd w:id="106"/>
       <w:r>
         <w:t>Nota sobre herramientas de prueba de API</w:t>
       </w:r>
-      <w:bookmarkEnd w:id="106"/>
+      <w:bookmarkEnd w:id="107"/>
       <w:r>
         <w:rPr>
           <w:color w:val="2E74B5"/>
@@ -16823,9 +17190,11 @@
         <w:ind w:left="-5" w:right="841"/>
       </w:pPr>
       <w:r>
-        <w:t xml:space="preserve">Conforme a lo indicado en la sección 4.5, el equipo no utilizó una colección de Postman ni una especificación OpenAPI/Swagger para probar los endpoints de la API. Las pruebas se realizaron consumiendo la API desde el propio frontend de la aplicación y, para los endpoints de toma de </w:t>
+        <w:t xml:space="preserve">Conforme a lo indicado en la sección 4.5, el equipo no utilizó una colección de Postman ni una especificación OpenAPI/Swagger para probar los endpoints de la API. Las pruebas se realizaron </w:t>
+      </w:r>
+      <w:r>
         <w:lastRenderedPageBreak/>
-        <w:t xml:space="preserve">pedidos, mediante interacción directa con el bot de Telegram. Este punto se deja explícitamente señalado como no aplicable a la metodología de pruebas efectivamente empleada en este trabajo, en lugar de omitirse sin aclaración. Además de esas pruebas manuales, los endpoints de carrito, confirmación de pedido, historial, catálogo y autenticación se prueban con una suite de pruebas de integración automatizadas (JUnit 5, Spring Boot Test y MockMvc) que los invoca directamente, sin pasar por el frontend ni por el bot (sección 4.5). </w:t>
+        <w:t xml:space="preserve">consumiendo la API desde el propio frontend de la aplicación y, para los endpoints de toma de pedidos, mediante interacción directa con el bot de Telegram. Este punto se deja explícitamente señalado como no aplicable a la metodología de pruebas efectivamente empleada en este trabajo, en lugar de omitirse sin aclaración. Además de esas pruebas manuales, los endpoints de carrito, confirmación de pedido, historial, catálogo y autenticación se prueban con una suite de pruebas de integración automatizadas (JUnit 5, Spring Boot Test y MockMvc) que los invoca directamente, sin pasar por el frontend ni por el bot (sección 4.5). </w:t>
       </w:r>
     </w:p>
     <w:sectPr>
@@ -16839,7 +17208,7 @@
 </file>
 
 <file path=word/endnotes.xml><?xml version="1.0" encoding="utf-8"?>
-<w:endnotes xmlns:wpc="http://schemas.microsoft.com/office/word/2010/wordprocessingCanvas" xmlns:cx="http://schemas.microsoft.com/office/drawing/2014/chartex" xmlns:cx1="http://schemas.microsoft.com/office/drawing/2015/9/8/chartex" xmlns:cx2="http://schemas.microsoft.com/office/drawing/2015/10/21/chartex" xmlns:cx3="http://schemas.microsoft.com/office/drawing/2016/5/9/chartex" xmlns:cx4="http://schemas.microsoft.com/office/drawing/2016/5/10/chartex" xmlns:cx5="http://schemas.microsoft.com/office/drawing/2016/5/11/chartex" xmlns:cx6="http://schemas.microsoft.com/office/drawing/2016/5/12/chartex" xmlns:cx7="http://schemas.microsoft.com/office/drawing/2016/5/13/chartex" xmlns:cx8="http://schemas.microsoft.com/office/drawing/2016/5/14/chartex" xmlns:mc="http://schemas.openxmlformats.org/markup-compatibility/2006" xmlns:aink="http://schemas.microsoft.com/office/drawing/2016/ink" xmlns:am3d="http://schemas.microsoft.com/office/drawing/2017/model3d" xmlns:o="urn:schemas-microsoft-com:office:office" xmlns:oel="http://schemas.microsoft.com/office/2019/extlst" xmlns:r="http://schemas.openxmlformats.org/officeDocument/2006/relationships" xmlns:m="http://schemas.openxmlformats.org/officeDocument/2006/math" xmlns:v="urn:schemas-microsoft-com:vml" xmlns:wp14="http://schemas.microsoft.com/office/word/2010/wordprocessingDrawing" xmlns:wp="http://schemas.openxmlformats.org/drawingml/2006/wordprocessingDrawing" xmlns:w10="urn:schemas-microsoft-com:office:word" xmlns:w="http://schemas.openxmlformats.org/wordprocessingml/2006/main" xmlns:w14="http://schemas.microsoft.com/office/word/2010/wordml" xmlns:w15="http://schemas.microsoft.com/office/word/2012/wordml" xmlns:w16cex="http://schemas.microsoft.com/office/word/2018/wordml/cex" xmlns:w16cid="http://schemas.microsoft.com/office/word/2016/wordml/cid" xmlns:w16="http://schemas.microsoft.com/office/word/2018/wordml" xmlns:w16du="http://schemas.microsoft.com/office/word/2023/wordml/word16du" xmlns:w16sdtdh="http://schemas.microsoft.com/office/word/2020/wordml/sdtdatahash" xmlns:w16sdtfl="http://schemas.microsoft.com/office/word/2024/wordml/sdtformatlock" xmlns:w16se="http://schemas.microsoft.com/office/word/2015/wordml/symex" xmlns:wpg="http://schemas.microsoft.com/office/word/2010/wordprocessingGroup" xmlns:wpi="http://schemas.microsoft.com/office/word/2010/wordprocessingInk" xmlns:wne="http://schemas.microsoft.com/office/word/2006/wordml" xmlns:wps="http://schemas.microsoft.com/office/word/2010/wordprocessingShape" mc:Ignorable="w14 w15 w16se w16cid w16 w16cex w16sdtdh w16sdtfl w16du wp14">
+<w:endnotes xmlns:wpc="http://schemas.microsoft.com/office/word/2010/wordprocessingCanvas" xmlns:cx="http://schemas.microsoft.com/office/drawing/2014/chartex" xmlns:cx1="http://schemas.microsoft.com/office/drawing/2015/9/8/chartex" xmlns:cx2="http://schemas.microsoft.com/office/drawing/2015/10/21/chartex" xmlns:cx3="http://schemas.microsoft.com/office/drawing/2016/5/9/chartex" xmlns:cx4="http://schemas.microsoft.com/office/drawing/2016/5/10/chartex" xmlns:cx5="http://schemas.microsoft.com/office/drawing/2016/5/11/chartex" xmlns:cx6="http://schemas.microsoft.com/office/drawing/2016/5/12/chartex" xmlns:cx7="http://schemas.microsoft.com/office/drawing/2016/5/13/chartex" xmlns:cx8="http://schemas.microsoft.com/office/drawing/2016/5/14/chartex" xmlns:mc="http://schemas.openxmlformats.org/markup-compatibility/2006" xmlns:m="http://schemas.openxmlformats.org/officeDocument/2006/math" xmlns:aink="http://schemas.microsoft.com/office/drawing/2016/ink" xmlns:am3d="http://schemas.microsoft.com/office/drawing/2017/model3d" xmlns:oel="http://schemas.microsoft.com/office/2019/extlst" xmlns:r="http://schemas.openxmlformats.org/officeDocument/2006/relationships" xmlns:wp14="http://schemas.microsoft.com/office/word/2010/wordprocessingDrawing" xmlns:wp="http://schemas.openxmlformats.org/drawingml/2006/wordprocessingDrawing" xmlns:wpg="http://schemas.microsoft.com/office/word/2010/wordprocessingGroup" xmlns:wpi="http://schemas.microsoft.com/office/word/2010/wordprocessingInk" xmlns:wps="http://schemas.microsoft.com/office/word/2010/wordprocessingShape" xmlns:o="urn:schemas-microsoft-com:office:office" xmlns:v="urn:schemas-microsoft-com:vml" xmlns:w10="urn:schemas-microsoft-com:office:word" xmlns:w="http://schemas.openxmlformats.org/wordprocessingml/2006/main" xmlns:w14="http://schemas.microsoft.com/office/word/2010/wordml" xmlns:w15="http://schemas.microsoft.com/office/word/2012/wordml" xmlns:w16cex="http://schemas.microsoft.com/office/word/2018/wordml/cex" xmlns:w16cid="http://schemas.microsoft.com/office/word/2016/wordml/cid" xmlns:w16="http://schemas.microsoft.com/office/word/2018/wordml" xmlns:w16sdtdh="http://schemas.microsoft.com/office/word/2020/wordml/sdtdatahash" xmlns:w16sdtfl="http://schemas.microsoft.com/office/word/2024/wordml/sdtformatlock" xmlns:w16se="http://schemas.microsoft.com/office/word/2015/wordml/symex" xmlns:w16du="http://schemas.microsoft.com/office/word/2023/wordml/word16du" xmlns:wne="http://schemas.microsoft.com/office/word/2006/wordml" mc:Ignorable="w14 w15 w16se w16cid w16 w16cex w16sdtdh w16sdtfl w16du wp14">
   <w:endnote w:type="separator" w:id="-1">
     <w:p>
       <w:pPr>
@@ -16864,7 +17233,7 @@
 </file>
 
 <file path=word/footer1.xml><?xml version="1.0" encoding="utf-8"?>
-<w:ftr xmlns:wpc="http://schemas.microsoft.com/office/word/2010/wordprocessingCanvas" xmlns:cx="http://schemas.microsoft.com/office/drawing/2014/chartex" xmlns:cx1="http://schemas.microsoft.com/office/drawing/2015/9/8/chartex" xmlns:cx2="http://schemas.microsoft.com/office/drawing/2015/10/21/chartex" xmlns:cx3="http://schemas.microsoft.com/office/drawing/2016/5/9/chartex" xmlns:cx4="http://schemas.microsoft.com/office/drawing/2016/5/10/chartex" xmlns:cx5="http://schemas.microsoft.com/office/drawing/2016/5/11/chartex" xmlns:cx6="http://schemas.microsoft.com/office/drawing/2016/5/12/chartex" xmlns:cx7="http://schemas.microsoft.com/office/drawing/2016/5/13/chartex" xmlns:cx8="http://schemas.microsoft.com/office/drawing/2016/5/14/chartex" xmlns:mc="http://schemas.openxmlformats.org/markup-compatibility/2006" xmlns:aink="http://schemas.microsoft.com/office/drawing/2016/ink" xmlns:am3d="http://schemas.microsoft.com/office/drawing/2017/model3d" xmlns:o="urn:schemas-microsoft-com:office:office" xmlns:oel="http://schemas.microsoft.com/office/2019/extlst" xmlns:r="http://schemas.openxmlformats.org/officeDocument/2006/relationships" xmlns:m="http://schemas.openxmlformats.org/officeDocument/2006/math" xmlns:v="urn:schemas-microsoft-com:vml" xmlns:wp14="http://schemas.microsoft.com/office/word/2010/wordprocessingDrawing" xmlns:wp="http://schemas.openxmlformats.org/drawingml/2006/wordprocessingDrawing" xmlns:w10="urn:schemas-microsoft-com:office:word" xmlns:w="http://schemas.openxmlformats.org/wordprocessingml/2006/main" xmlns:w14="http://schemas.microsoft.com/office/word/2010/wordml" xmlns:w15="http://schemas.microsoft.com/office/word/2012/wordml" xmlns:w16cex="http://schemas.microsoft.com/office/word/2018/wordml/cex" xmlns:w16cid="http://schemas.microsoft.com/office/word/2016/wordml/cid" xmlns:w16="http://schemas.microsoft.com/office/word/2018/wordml" xmlns:w16du="http://schemas.microsoft.com/office/word/2023/wordml/word16du" xmlns:w16sdtdh="http://schemas.microsoft.com/office/word/2020/wordml/sdtdatahash" xmlns:w16sdtfl="http://schemas.microsoft.com/office/word/2024/wordml/sdtformatlock" xmlns:w16se="http://schemas.microsoft.com/office/word/2015/wordml/symex" xmlns:wpg="http://schemas.microsoft.com/office/word/2010/wordprocessingGroup" xmlns:wpi="http://schemas.microsoft.com/office/word/2010/wordprocessingInk" xmlns:wne="http://schemas.microsoft.com/office/word/2006/wordml" xmlns:wps="http://schemas.microsoft.com/office/word/2010/wordprocessingShape" mc:Ignorable="w14 w15 w16se w16cid w16 w16cex w16sdtdh w16sdtfl w16du wp14">
+<w:ftr xmlns:wpc="http://schemas.microsoft.com/office/word/2010/wordprocessingCanvas" xmlns:cx="http://schemas.microsoft.com/office/drawing/2014/chartex" xmlns:cx1="http://schemas.microsoft.com/office/drawing/2015/9/8/chartex" xmlns:cx2="http://schemas.microsoft.com/office/drawing/2015/10/21/chartex" xmlns:cx3="http://schemas.microsoft.com/office/drawing/2016/5/9/chartex" xmlns:cx4="http://schemas.microsoft.com/office/drawing/2016/5/10/chartex" xmlns:cx5="http://schemas.microsoft.com/office/drawing/2016/5/11/chartex" xmlns:cx6="http://schemas.microsoft.com/office/drawing/2016/5/12/chartex" xmlns:cx7="http://schemas.microsoft.com/office/drawing/2016/5/13/chartex" xmlns:cx8="http://schemas.microsoft.com/office/drawing/2016/5/14/chartex" xmlns:mc="http://schemas.openxmlformats.org/markup-compatibility/2006" xmlns:m="http://schemas.openxmlformats.org/officeDocument/2006/math" xmlns:aink="http://schemas.microsoft.com/office/drawing/2016/ink" xmlns:am3d="http://schemas.microsoft.com/office/drawing/2017/model3d" xmlns:oel="http://schemas.microsoft.com/office/2019/extlst" xmlns:r="http://schemas.openxmlformats.org/officeDocument/2006/relationships" xmlns:wp14="http://schemas.microsoft.com/office/word/2010/wordprocessingDrawing" xmlns:wp="http://schemas.openxmlformats.org/drawingml/2006/wordprocessingDrawing" xmlns:wpg="http://schemas.microsoft.com/office/word/2010/wordprocessingGroup" xmlns:wpi="http://schemas.microsoft.com/office/word/2010/wordprocessingInk" xmlns:wps="http://schemas.microsoft.com/office/word/2010/wordprocessingShape" xmlns:o="urn:schemas-microsoft-com:office:office" xmlns:v="urn:schemas-microsoft-com:vml" xmlns:w10="urn:schemas-microsoft-com:office:word" xmlns:w="http://schemas.openxmlformats.org/wordprocessingml/2006/main" xmlns:w14="http://schemas.microsoft.com/office/word/2010/wordml" xmlns:w15="http://schemas.microsoft.com/office/word/2012/wordml" xmlns:w16cex="http://schemas.microsoft.com/office/word/2018/wordml/cex" xmlns:w16cid="http://schemas.microsoft.com/office/word/2016/wordml/cid" xmlns:w16="http://schemas.microsoft.com/office/word/2018/wordml" xmlns:w16sdtdh="http://schemas.microsoft.com/office/word/2020/wordml/sdtdatahash" xmlns:w16sdtfl="http://schemas.microsoft.com/office/word/2024/wordml/sdtformatlock" xmlns:w16se="http://schemas.microsoft.com/office/word/2015/wordml/symex" xmlns:w16du="http://schemas.microsoft.com/office/word/2023/wordml/word16du" xmlns:wne="http://schemas.microsoft.com/office/word/2006/wordml" mc:Ignorable="w14 w15 w16se w16cid w16 w16cex w16sdtdh w16sdtfl w16du wp14">
   <w:p>
     <w:pPr>
       <w:jc w:val="center"/>
@@ -16889,7 +17258,7 @@
 </file>
 
 <file path=word/footnotes.xml><?xml version="1.0" encoding="utf-8"?>
-<w:footnotes xmlns:wpc="http://schemas.microsoft.com/office/word/2010/wordprocessingCanvas" xmlns:cx="http://schemas.microsoft.com/office/drawing/2014/chartex" xmlns:cx1="http://schemas.microsoft.com/office/drawing/2015/9/8/chartex" xmlns:cx2="http://schemas.microsoft.com/office/drawing/2015/10/21/chartex" xmlns:cx3="http://schemas.microsoft.com/office/drawing/2016/5/9/chartex" xmlns:cx4="http://schemas.microsoft.com/office/drawing/2016/5/10/chartex" xmlns:cx5="http://schemas.microsoft.com/office/drawing/2016/5/11/chartex" xmlns:cx6="http://schemas.microsoft.com/office/drawing/2016/5/12/chartex" xmlns:cx7="http://schemas.microsoft.com/office/drawing/2016/5/13/chartex" xmlns:cx8="http://schemas.microsoft.com/office/drawing/2016/5/14/chartex" xmlns:mc="http://schemas.openxmlformats.org/markup-compatibility/2006" xmlns:aink="http://schemas.microsoft.com/office/drawing/2016/ink" xmlns:am3d="http://schemas.microsoft.com/office/drawing/2017/model3d" xmlns:o="urn:schemas-microsoft-com:office:office" xmlns:oel="http://schemas.microsoft.com/office/2019/extlst" xmlns:r="http://schemas.openxmlformats.org/officeDocument/2006/relationships" xmlns:m="http://schemas.openxmlformats.org/officeDocument/2006/math" xmlns:v="urn:schemas-microsoft-com:vml" xmlns:wp14="http://schemas.microsoft.com/office/word/2010/wordprocessingDrawing" xmlns:wp="http://schemas.openxmlformats.org/drawingml/2006/wordprocessingDrawing" xmlns:w10="urn:schemas-microsoft-com:office:word" xmlns:w="http://schemas.openxmlformats.org/wordprocessingml/2006/main" xmlns:w14="http://schemas.microsoft.com/office/word/2010/wordml" xmlns:w15="http://schemas.microsoft.com/office/word/2012/wordml" xmlns:w16cex="http://schemas.microsoft.com/office/word/2018/wordml/cex" xmlns:w16cid="http://schemas.microsoft.com/office/word/2016/wordml/cid" xmlns:w16="http://schemas.microsoft.com/office/word/2018/wordml" xmlns:w16du="http://schemas.microsoft.com/office/word/2023/wordml/word16du" xmlns:w16sdtdh="http://schemas.microsoft.com/office/word/2020/wordml/sdtdatahash" xmlns:w16sdtfl="http://schemas.microsoft.com/office/word/2024/wordml/sdtformatlock" xmlns:w16se="http://schemas.microsoft.com/office/word/2015/wordml/symex" xmlns:wpg="http://schemas.microsoft.com/office/word/2010/wordprocessingGroup" xmlns:wpi="http://schemas.microsoft.com/office/word/2010/wordprocessingInk" xmlns:wne="http://schemas.microsoft.com/office/word/2006/wordml" xmlns:wps="http://schemas.microsoft.com/office/word/2010/wordprocessingShape" mc:Ignorable="w14 w15 w16se w16cid w16 w16cex w16sdtdh w16sdtfl w16du wp14">
+<w:footnotes xmlns:wpc="http://schemas.microsoft.com/office/word/2010/wordprocessingCanvas" xmlns:cx="http://schemas.microsoft.com/office/drawing/2014/chartex" xmlns:cx1="http://schemas.microsoft.com/office/drawing/2015/9/8/chartex" xmlns:cx2="http://schemas.microsoft.com/office/drawing/2015/10/21/chartex" xmlns:cx3="http://schemas.microsoft.com/office/drawing/2016/5/9/chartex" xmlns:cx4="http://schemas.microsoft.com/office/drawing/2016/5/10/chartex" xmlns:cx5="http://schemas.microsoft.com/office/drawing/2016/5/11/chartex" xmlns:cx6="http://schemas.microsoft.com/office/drawing/2016/5/12/chartex" xmlns:cx7="http://schemas.microsoft.com/office/drawing/2016/5/13/chartex" xmlns:cx8="http://schemas.microsoft.com/office/drawing/2016/5/14/chartex" xmlns:mc="http://schemas.openxmlformats.org/markup-compatibility/2006" xmlns:m="http://schemas.openxmlformats.org/officeDocument/2006/math" xmlns:aink="http://schemas.microsoft.com/office/drawing/2016/ink" xmlns:am3d="http://schemas.microsoft.com/office/drawing/2017/model3d" xmlns:oel="http://schemas.microsoft.com/office/2019/extlst" xmlns:r="http://schemas.openxmlformats.org/officeDocument/2006/relationships" xmlns:wp14="http://schemas.microsoft.com/office/word/2010/wordprocessingDrawing" xmlns:wp="http://schemas.openxmlformats.org/drawingml/2006/wordprocessingDrawing" xmlns:wpg="http://schemas.microsoft.com/office/word/2010/wordprocessingGroup" xmlns:wpi="http://schemas.microsoft.com/office/word/2010/wordprocessingInk" xmlns:wps="http://schemas.microsoft.com/office/word/2010/wordprocessingShape" xmlns:o="urn:schemas-microsoft-com:office:office" xmlns:v="urn:schemas-microsoft-com:vml" xmlns:w10="urn:schemas-microsoft-com:office:word" xmlns:w="http://schemas.openxmlformats.org/wordprocessingml/2006/main" xmlns:w14="http://schemas.microsoft.com/office/word/2010/wordml" xmlns:w15="http://schemas.microsoft.com/office/word/2012/wordml" xmlns:w16cex="http://schemas.microsoft.com/office/word/2018/wordml/cex" xmlns:w16cid="http://schemas.microsoft.com/office/word/2016/wordml/cid" xmlns:w16="http://schemas.microsoft.com/office/word/2018/wordml" xmlns:w16sdtdh="http://schemas.microsoft.com/office/word/2020/wordml/sdtdatahash" xmlns:w16sdtfl="http://schemas.microsoft.com/office/word/2024/wordml/sdtformatlock" xmlns:w16se="http://schemas.microsoft.com/office/word/2015/wordml/symex" xmlns:w16du="http://schemas.microsoft.com/office/word/2023/wordml/word16du" xmlns:wne="http://schemas.microsoft.com/office/word/2006/wordml" mc:Ignorable="w14 w15 w16se w16cid w16 w16cex w16sdtdh w16sdtfl w16du wp14">
   <w:footnote w:type="separator" w:id="-1">
     <w:p>
       <w:pPr>
@@ -16914,7 +17283,7 @@
 </file>
 
 <file path=word/numbering.xml><?xml version="1.0" encoding="utf-8"?>
-<w:numbering xmlns:wpc="http://schemas.microsoft.com/office/word/2010/wordprocessingCanvas" xmlns:cx="http://schemas.microsoft.com/office/drawing/2014/chartex" xmlns:cx1="http://schemas.microsoft.com/office/drawing/2015/9/8/chartex" xmlns:cx2="http://schemas.microsoft.com/office/drawing/2015/10/21/chartex" xmlns:cx3="http://schemas.microsoft.com/office/drawing/2016/5/9/chartex" xmlns:cx4="http://schemas.microsoft.com/office/drawing/2016/5/10/chartex" xmlns:cx5="http://schemas.microsoft.com/office/drawing/2016/5/11/chartex" xmlns:cx6="http://schemas.microsoft.com/office/drawing/2016/5/12/chartex" xmlns:cx7="http://schemas.microsoft.com/office/drawing/2016/5/13/chartex" xmlns:cx8="http://schemas.microsoft.com/office/drawing/2016/5/14/chartex" xmlns:mc="http://schemas.openxmlformats.org/markup-compatibility/2006" xmlns:aink="http://schemas.microsoft.com/office/drawing/2016/ink" xmlns:am3d="http://schemas.microsoft.com/office/drawing/2017/model3d" xmlns:o="urn:schemas-microsoft-com:office:office" xmlns:oel="http://schemas.microsoft.com/office/2019/extlst" xmlns:r="http://schemas.openxmlformats.org/officeDocument/2006/relationships" xmlns:m="http://schemas.openxmlformats.org/officeDocument/2006/math" xmlns:v="urn:schemas-microsoft-com:vml" xmlns:wp14="http://schemas.microsoft.com/office/word/2010/wordprocessingDrawing" xmlns:wp="http://schemas.openxmlformats.org/drawingml/2006/wordprocessingDrawing" xmlns:w10="urn:schemas-microsoft-com:office:word" xmlns:w="http://schemas.openxmlformats.org/wordprocessingml/2006/main" xmlns:w14="http://schemas.microsoft.com/office/word/2010/wordml" xmlns:w15="http://schemas.microsoft.com/office/word/2012/wordml" xmlns:w16cex="http://schemas.microsoft.com/office/word/2018/wordml/cex" xmlns:w16cid="http://schemas.microsoft.com/office/word/2016/wordml/cid" xmlns:w16="http://schemas.microsoft.com/office/word/2018/wordml" xmlns:w16du="http://schemas.microsoft.com/office/word/2023/wordml/word16du" xmlns:w16sdtdh="http://schemas.microsoft.com/office/word/2020/wordml/sdtdatahash" xmlns:w16sdtfl="http://schemas.microsoft.com/office/word/2024/wordml/sdtformatlock" xmlns:w16se="http://schemas.microsoft.com/office/word/2015/wordml/symex" xmlns:wpg="http://schemas.microsoft.com/office/word/2010/wordprocessingGroup" xmlns:wpi="http://schemas.microsoft.com/office/word/2010/wordprocessingInk" xmlns:wne="http://schemas.microsoft.com/office/word/2006/wordml" xmlns:wps="http://schemas.microsoft.com/office/word/2010/wordprocessingShape" mc:Ignorable="w14 w15 w16se w16cid w16 w16cex w16sdtdh w16sdtfl w16du wp14">
+<w:numbering xmlns:wpc="http://schemas.microsoft.com/office/word/2010/wordprocessingCanvas" xmlns:cx="http://schemas.microsoft.com/office/drawing/2014/chartex" xmlns:cx1="http://schemas.microsoft.com/office/drawing/2015/9/8/chartex" xmlns:cx2="http://schemas.microsoft.com/office/drawing/2015/10/21/chartex" xmlns:cx3="http://schemas.microsoft.com/office/drawing/2016/5/9/chartex" xmlns:cx4="http://schemas.microsoft.com/office/drawing/2016/5/10/chartex" xmlns:cx5="http://schemas.microsoft.com/office/drawing/2016/5/11/chartex" xmlns:cx6="http://schemas.microsoft.com/office/drawing/2016/5/12/chartex" xmlns:cx7="http://schemas.microsoft.com/office/drawing/2016/5/13/chartex" xmlns:cx8="http://schemas.microsoft.com/office/drawing/2016/5/14/chartex" xmlns:mc="http://schemas.openxmlformats.org/markup-compatibility/2006" xmlns:m="http://schemas.openxmlformats.org/officeDocument/2006/math" xmlns:aink="http://schemas.microsoft.com/office/drawing/2016/ink" xmlns:am3d="http://schemas.microsoft.com/office/drawing/2017/model3d" xmlns:oel="http://schemas.microsoft.com/office/2019/extlst" xmlns:r="http://schemas.openxmlformats.org/officeDocument/2006/relationships" xmlns:wp14="http://schemas.microsoft.com/office/word/2010/wordprocessingDrawing" xmlns:wp="http://schemas.openxmlformats.org/drawingml/2006/wordprocessingDrawing" xmlns:wpg="http://schemas.microsoft.com/office/word/2010/wordprocessingGroup" xmlns:wpi="http://schemas.microsoft.com/office/word/2010/wordprocessingInk" xmlns:wps="http://schemas.microsoft.com/office/word/2010/wordprocessingShape" xmlns:o="urn:schemas-microsoft-com:office:office" xmlns:v="urn:schemas-microsoft-com:vml" xmlns:w10="urn:schemas-microsoft-com:office:word" xmlns:w="http://schemas.openxmlformats.org/wordprocessingml/2006/main" xmlns:w14="http://schemas.microsoft.com/office/word/2010/wordml" xmlns:w15="http://schemas.microsoft.com/office/word/2012/wordml" xmlns:w16cex="http://schemas.microsoft.com/office/word/2018/wordml/cex" xmlns:w16cid="http://schemas.microsoft.com/office/word/2016/wordml/cid" xmlns:w16="http://schemas.microsoft.com/office/word/2018/wordml" xmlns:w16sdtdh="http://schemas.microsoft.com/office/word/2020/wordml/sdtdatahash" xmlns:w16sdtfl="http://schemas.microsoft.com/office/word/2024/wordml/sdtformatlock" xmlns:w16se="http://schemas.microsoft.com/office/word/2015/wordml/symex" xmlns:w16du="http://schemas.microsoft.com/office/word/2023/wordml/word16du" xmlns:wne="http://schemas.microsoft.com/office/word/2006/wordml" mc:Ignorable="w14 w15 w16se w16cid w16 w16cex w16sdtdh w16sdtfl w16du wp14">
   <w:abstractNum w:abstractNumId="0" w15:restartNumberingAfterBreak="0">
     <w:nsid w:val="3E0B66E4"/>
     <w:multiLevelType w:val="hybridMultilevel"/>
@@ -17996,7 +18365,7 @@
 </file>
 
 <file path=word/styles.xml><?xml version="1.0" encoding="utf-8"?>
-<w:styles xmlns:mc="http://schemas.openxmlformats.org/markup-compatibility/2006" xmlns:r="http://schemas.openxmlformats.org/officeDocument/2006/relationships" xmlns:w="http://schemas.openxmlformats.org/wordprocessingml/2006/main" xmlns:w14="http://schemas.microsoft.com/office/word/2010/wordml" xmlns:w15="http://schemas.microsoft.com/office/word/2012/wordml" xmlns:w16cex="http://schemas.microsoft.com/office/word/2018/wordml/cex" xmlns:w16cid="http://schemas.microsoft.com/office/word/2016/wordml/cid" xmlns:w16="http://schemas.microsoft.com/office/word/2018/wordml" xmlns:w16du="http://schemas.microsoft.com/office/word/2023/wordml/word16du" xmlns:w16sdtdh="http://schemas.microsoft.com/office/word/2020/wordml/sdtdatahash" xmlns:w16sdtfl="http://schemas.microsoft.com/office/word/2024/wordml/sdtformatlock" xmlns:w16se="http://schemas.microsoft.com/office/word/2015/wordml/symex" mc:Ignorable="w14 w15 w16se w16cid w16 w16cex w16sdtdh w16sdtfl w16du">
+<w:styles xmlns:mc="http://schemas.openxmlformats.org/markup-compatibility/2006" xmlns:r="http://schemas.openxmlformats.org/officeDocument/2006/relationships" xmlns:w="http://schemas.openxmlformats.org/wordprocessingml/2006/main" xmlns:w14="http://schemas.microsoft.com/office/word/2010/wordml" xmlns:w15="http://schemas.microsoft.com/office/word/2012/wordml" xmlns:w16cex="http://schemas.microsoft.com/office/word/2018/wordml/cex" xmlns:w16cid="http://schemas.microsoft.com/office/word/2016/wordml/cid" xmlns:w16="http://schemas.microsoft.com/office/word/2018/wordml" xmlns:w16sdtdh="http://schemas.microsoft.com/office/word/2020/wordml/sdtdatahash" xmlns:w16sdtfl="http://schemas.microsoft.com/office/word/2024/wordml/sdtformatlock" xmlns:w16se="http://schemas.microsoft.com/office/word/2015/wordml/symex" xmlns:w16du="http://schemas.microsoft.com/office/word/2023/wordml/word16du" mc:Ignorable="w14 w15 w16se w16cid w16 w16cex w16sdtdh w16sdtfl w16du">
   <w:docDefaults>
     <w:rPrDefault>
       <w:rPr>

</xml_diff>